<commit_message>
chore: adjusted logic and implement all logic of Authen & Author
</commit_message>
<xml_diff>
--- a/backend/docs/DANASEA_Database_Design.docx
+++ b/backend/docs/DANASEA_Database_Design.docx
@@ -1882,6 +1882,640 @@
                 <w:szCs w:val="21"/>
               </w:rPr>
               <w:t>NULL cho tới khi xác thực</w:t>
+            </w:r>
+          </w:p>
+        </w:tc>
+      </w:tr>
+    </w:tbl>
+    <w:p>
+      <w:pPr>
+        <w:spacing w:before="200" w:after="80"/>
+      </w:pPr>
+      <w:r>
+        <w:rPr>
+          <w:rFonts w:ascii="Consolas" w:eastAsia="Consolas" w:hAnsi="Consolas" w:cs="Consolas"/>
+          <w:b/>
+          <w:bCs/>
+          <w:color w:val="1F4E79"/>
+          <w:sz w:val="24"/>
+          <w:szCs w:val="24"/>
+        </w:rPr>
+        <w:t>refresh_tokens</w:t>
+      </w:r>
+      <w:r>
+        <w:rPr>
+          <w:i/>
+          <w:iCs/>
+          <w:sz w:val="23"/>
+          <w:szCs w:val="23"/>
+        </w:rPr>
+        <w:t xml:space="preserve">  —  Refresh token cho phiên đăng nhập, hỗ trợ rotation và revoke khi logout.</w:t>
+      </w:r>
+    </w:p>
+    <w:tbl>
+      <w:tblPr>
+        <w:tblW w:w="9026" w:type="dxa"/>
+        <w:tblBorders>
+          <w:top w:val="single" w:sz="4" w:space="0" w:color="auto"/>
+          <w:left w:val="single" w:sz="4" w:space="0" w:color="auto"/>
+          <w:bottom w:val="single" w:sz="4" w:space="0" w:color="auto"/>
+          <w:right w:val="single" w:sz="4" w:space="0" w:color="auto"/>
+          <w:insideH w:val="single" w:sz="4" w:space="0" w:color="auto"/>
+          <w:insideV w:val="single" w:sz="4" w:space="0" w:color="auto"/>
+        </w:tblBorders>
+        <w:tblCellMar>
+          <w:left w:w="10" w:type="dxa"/>
+          <w:right w:w="10" w:type="dxa"/>
+        </w:tblCellMar>
+        <w:tblLook w:val="0000" w:firstRow="0" w:lastRow="0" w:firstColumn="0" w:lastColumn="0" w:noHBand="0" w:noVBand="0"/>
+      </w:tblPr>
+      <w:tblGrid>
+        <w:gridCol w:w="2000"/>
+        <w:gridCol w:w="1800"/>
+        <w:gridCol w:w="5226"/>
+      </w:tblGrid>
+      <w:tr>
+        <w:tblPrEx>
+          <w:tblCellMar>
+            <w:top w:w="0" w:type="dxa"/>
+            <w:bottom w:w="0" w:type="dxa"/>
+          </w:tblCellMar>
+        </w:tblPrEx>
+        <w:trPr>
+          <w:tblHeader/>
+        </w:trPr>
+        <w:tc>
+          <w:tcPr>
+            <w:tcW w:w="2000" w:type="dxa"/>
+            <w:shd w:val="clear" w:color="auto" w:fill="D9D9D9"/>
+          </w:tcPr>
+          <w:p>
+            <w:pPr>
+              <w:spacing w:after="40" w:line="260" w:lineRule="auto"/>
+              <w:jc w:val="center"/>
+            </w:pPr>
+            <w:r>
+              <w:rPr>
+                <w:b/>
+                <w:bCs/>
+                <w:sz w:val="21"/>
+                <w:szCs w:val="21"/>
+              </w:rPr>
+              <w:t xml:space="preserve">Trường</w:t>
+            </w:r>
+          </w:p>
+        </w:tc>
+        <w:tc>
+          <w:tcPr>
+            <w:tcW w:w="1800" w:type="dxa"/>
+            <w:shd w:val="clear" w:color="auto" w:fill="D9D9D9"/>
+          </w:tcPr>
+          <w:p>
+            <w:pPr>
+              <w:spacing w:after="40" w:line="260" w:lineRule="auto"/>
+              <w:jc w:val="center"/>
+            </w:pPr>
+            <w:r>
+              <w:rPr>
+                <w:b/>
+                <w:bCs/>
+                <w:sz w:val="21"/>
+                <w:szCs w:val="21"/>
+              </w:rPr>
+              <w:t xml:space="preserve">Kiểu dữ liệu</w:t>
+            </w:r>
+          </w:p>
+        </w:tc>
+        <w:tc>
+          <w:tcPr>
+            <w:tcW w:w="5226" w:type="dxa"/>
+            <w:shd w:val="clear" w:color="auto" w:fill="D9D9D9"/>
+          </w:tcPr>
+          <w:p>
+            <w:pPr>
+              <w:spacing w:after="40" w:line="260" w:lineRule="auto"/>
+              <w:jc w:val="center"/>
+            </w:pPr>
+            <w:r>
+              <w:rPr>
+                <w:b/>
+                <w:bCs/>
+                <w:sz w:val="21"/>
+                <w:szCs w:val="21"/>
+              </w:rPr>
+              <w:t xml:space="preserve">Ghi chú</w:t>
+            </w:r>
+          </w:p>
+        </w:tc>
+      </w:tr>
+      <w:tr>
+        <w:tblPrEx>
+          <w:tblCellMar>
+            <w:top w:w="0" w:type="dxa"/>
+            <w:bottom w:w="0" w:type="dxa"/>
+          </w:tblCellMar>
+        </w:tblPrEx>
+        <w:tc>
+          <w:tcPr>
+            <w:tcW w:w="2000" w:type="dxa"/>
+          </w:tcPr>
+          <w:p>
+            <w:pPr>
+              <w:spacing w:after="40" w:line="260" w:lineRule="auto"/>
+              <w:ind w:left="57" w:right="57"/>
+            </w:pPr>
+            <w:r>
+              <w:rPr>
+                <w:rFonts w:ascii="Consolas" w:eastAsia="Consolas" w:hAnsi="Consolas" w:cs="Consolas"/>
+                <w:sz w:val="21"/>
+                <w:szCs w:val="21"/>
+              </w:rPr>
+              <w:t xml:space="preserve">id</w:t>
+            </w:r>
+          </w:p>
+        </w:tc>
+        <w:tc>
+          <w:tcPr>
+            <w:tcW w:w="1800" w:type="dxa"/>
+          </w:tcPr>
+          <w:p>
+            <w:pPr>
+              <w:spacing w:after="40" w:line="260" w:lineRule="auto"/>
+              <w:ind w:left="57" w:right="57"/>
+            </w:pPr>
+            <w:r>
+              <w:rPr>
+                <w:rFonts w:ascii="Consolas" w:eastAsia="Consolas" w:hAnsi="Consolas" w:cs="Consolas"/>
+                <w:sz w:val="21"/>
+                <w:szCs w:val="21"/>
+              </w:rPr>
+              <w:t xml:space="preserve">UUID</w:t>
+            </w:r>
+          </w:p>
+        </w:tc>
+        <w:tc>
+          <w:tcPr>
+            <w:tcW w:w="5226" w:type="dxa"/>
+          </w:tcPr>
+          <w:p>
+            <w:pPr>
+              <w:spacing w:after="40" w:line="260" w:lineRule="auto"/>
+              <w:ind w:left="57" w:right="57"/>
+            </w:pPr>
+            <w:r>
+              <w:rPr>
+                <w:sz w:val="21"/>
+                <w:szCs w:val="21"/>
+              </w:rPr>
+              <w:t xml:space="preserve">PK</w:t>
+            </w:r>
+          </w:p>
+        </w:tc>
+      </w:tr>
+      <w:tr>
+        <w:tblPrEx>
+          <w:tblCellMar>
+            <w:top w:w="0" w:type="dxa"/>
+            <w:bottom w:w="0" w:type="dxa"/>
+          </w:tblCellMar>
+        </w:tblPrEx>
+        <w:tc>
+          <w:tcPr>
+            <w:tcW w:w="2000" w:type="dxa"/>
+          </w:tcPr>
+          <w:p>
+            <w:pPr>
+              <w:spacing w:after="40" w:line="260" w:lineRule="auto"/>
+              <w:ind w:left="57" w:right="57"/>
+            </w:pPr>
+            <w:r>
+              <w:rPr>
+                <w:rFonts w:ascii="Consolas" w:eastAsia="Consolas" w:hAnsi="Consolas" w:cs="Consolas"/>
+                <w:sz w:val="21"/>
+                <w:szCs w:val="21"/>
+              </w:rPr>
+              <w:t xml:space="preserve">user_id</w:t>
+            </w:r>
+          </w:p>
+        </w:tc>
+        <w:tc>
+          <w:tcPr>
+            <w:tcW w:w="1800" w:type="dxa"/>
+          </w:tcPr>
+          <w:p>
+            <w:pPr>
+              <w:spacing w:after="40" w:line="260" w:lineRule="auto"/>
+              <w:ind w:left="57" w:right="57"/>
+            </w:pPr>
+            <w:r>
+              <w:rPr>
+                <w:rFonts w:ascii="Consolas" w:eastAsia="Consolas" w:hAnsi="Consolas" w:cs="Consolas"/>
+                <w:sz w:val="21"/>
+                <w:szCs w:val="21"/>
+              </w:rPr>
+              <w:t xml:space="preserve">UUID</w:t>
+            </w:r>
+          </w:p>
+        </w:tc>
+        <w:tc>
+          <w:tcPr>
+            <w:tcW w:w="5226" w:type="dxa"/>
+          </w:tcPr>
+          <w:p>
+            <w:pPr>
+              <w:spacing w:after="40" w:line="260" w:lineRule="auto"/>
+              <w:ind w:left="57" w:right="57"/>
+            </w:pPr>
+            <w:r>
+              <w:rPr>
+                <w:sz w:val="21"/>
+                <w:szCs w:val="21"/>
+              </w:rPr>
+              <w:t xml:space="preserve">FK -&gt; users.id</w:t>
+            </w:r>
+          </w:p>
+        </w:tc>
+      </w:tr>
+      <w:tr>
+        <w:tblPrEx>
+          <w:tblCellMar>
+            <w:top w:w="0" w:type="dxa"/>
+            <w:bottom w:w="0" w:type="dxa"/>
+          </w:tblCellMar>
+        </w:tblPrEx>
+        <w:tc>
+          <w:tcPr>
+            <w:tcW w:w="2000" w:type="dxa"/>
+          </w:tcPr>
+          <w:p>
+            <w:pPr>
+              <w:spacing w:after="40" w:line="260" w:lineRule="auto"/>
+              <w:ind w:left="57" w:right="57"/>
+            </w:pPr>
+            <w:r>
+              <w:rPr>
+                <w:rFonts w:ascii="Consolas" w:eastAsia="Consolas" w:hAnsi="Consolas" w:cs="Consolas"/>
+                <w:sz w:val="21"/>
+                <w:szCs w:val="21"/>
+              </w:rPr>
+              <w:t xml:space="preserve">token_hash</w:t>
+            </w:r>
+          </w:p>
+        </w:tc>
+        <w:tc>
+          <w:tcPr>
+            <w:tcW w:w="1800" w:type="dxa"/>
+          </w:tcPr>
+          <w:p>
+            <w:pPr>
+              <w:spacing w:after="40" w:line="260" w:lineRule="auto"/>
+              <w:ind w:left="57" w:right="57"/>
+            </w:pPr>
+            <w:r>
+              <w:rPr>
+                <w:rFonts w:ascii="Consolas" w:eastAsia="Consolas" w:hAnsi="Consolas" w:cs="Consolas"/>
+                <w:sz w:val="21"/>
+                <w:szCs w:val="21"/>
+              </w:rPr>
+              <w:t xml:space="preserve">VARCHAR(255)</w:t>
+            </w:r>
+          </w:p>
+        </w:tc>
+        <w:tc>
+          <w:tcPr>
+            <w:tcW w:w="5226" w:type="dxa"/>
+          </w:tcPr>
+          <w:p>
+            <w:pPr>
+              <w:spacing w:after="40" w:line="260" w:lineRule="auto"/>
+              <w:ind w:left="57" w:right="57"/>
+            </w:pPr>
+            <w:r>
+              <w:rPr>
+                <w:sz w:val="21"/>
+                <w:szCs w:val="21"/>
+              </w:rPr>
+              <w:t xml:space="preserve">UNIQUE, NOT NULL</w:t>
+            </w:r>
+          </w:p>
+        </w:tc>
+      </w:tr>
+      <w:tr>
+        <w:tblPrEx>
+          <w:tblCellMar>
+            <w:top w:w="0" w:type="dxa"/>
+            <w:bottom w:w="0" w:type="dxa"/>
+          </w:tblCellMar>
+        </w:tblPrEx>
+        <w:tc>
+          <w:tcPr>
+            <w:tcW w:w="2000" w:type="dxa"/>
+          </w:tcPr>
+          <w:p>
+            <w:pPr>
+              <w:spacing w:after="40" w:line="260" w:lineRule="auto"/>
+              <w:ind w:left="57" w:right="57"/>
+            </w:pPr>
+            <w:r>
+              <w:rPr>
+                <w:rFonts w:ascii="Consolas" w:eastAsia="Consolas" w:hAnsi="Consolas" w:cs="Consolas"/>
+                <w:sz w:val="21"/>
+                <w:szCs w:val="21"/>
+              </w:rPr>
+              <w:t xml:space="preserve">family_id</w:t>
+            </w:r>
+          </w:p>
+        </w:tc>
+        <w:tc>
+          <w:tcPr>
+            <w:tcW w:w="1800" w:type="dxa"/>
+          </w:tcPr>
+          <w:p>
+            <w:pPr>
+              <w:spacing w:after="40" w:line="260" w:lineRule="auto"/>
+              <w:ind w:left="57" w:right="57"/>
+            </w:pPr>
+            <w:r>
+              <w:rPr>
+                <w:rFonts w:ascii="Consolas" w:eastAsia="Consolas" w:hAnsi="Consolas" w:cs="Consolas"/>
+                <w:sz w:val="21"/>
+                <w:szCs w:val="21"/>
+              </w:rPr>
+              <w:t xml:space="preserve">UUID</w:t>
+            </w:r>
+          </w:p>
+        </w:tc>
+        <w:tc>
+          <w:tcPr>
+            <w:tcW w:w="5226" w:type="dxa"/>
+          </w:tcPr>
+          <w:p>
+            <w:pPr>
+              <w:spacing w:after="40" w:line="260" w:lineRule="auto"/>
+              <w:ind w:left="57" w:right="57"/>
+            </w:pPr>
+            <w:r>
+              <w:rPr>
+                <w:sz w:val="21"/>
+                <w:szCs w:val="21"/>
+              </w:rPr>
+              <w:t xml:space="preserve">NOT NULL — nhóm các token cùng một chuỗi rotation, dùng để thu hồi toàn bộ chain khi phát hiện tái sử dụng</w:t>
+            </w:r>
+          </w:p>
+        </w:tc>
+      </w:tr>
+      <w:tr>
+        <w:tblPrEx>
+          <w:tblCellMar>
+            <w:top w:w="0" w:type="dxa"/>
+            <w:bottom w:w="0" w:type="dxa"/>
+          </w:tblCellMar>
+        </w:tblPrEx>
+        <w:tc>
+          <w:tcPr>
+            <w:tcW w:w="2000" w:type="dxa"/>
+          </w:tcPr>
+          <w:p>
+            <w:pPr>
+              <w:spacing w:after="40" w:line="260" w:lineRule="auto"/>
+              <w:ind w:left="57" w:right="57"/>
+            </w:pPr>
+            <w:r>
+              <w:rPr>
+                <w:rFonts w:ascii="Consolas" w:eastAsia="Consolas" w:hAnsi="Consolas" w:cs="Consolas"/>
+                <w:sz w:val="21"/>
+                <w:szCs w:val="21"/>
+              </w:rPr>
+              <w:t xml:space="preserve">replaced_by_id</w:t>
+            </w:r>
+          </w:p>
+        </w:tc>
+        <w:tc>
+          <w:tcPr>
+            <w:tcW w:w="1800" w:type="dxa"/>
+          </w:tcPr>
+          <w:p>
+            <w:pPr>
+              <w:spacing w:after="40" w:line="260" w:lineRule="auto"/>
+              <w:ind w:left="57" w:right="57"/>
+            </w:pPr>
+            <w:r>
+              <w:rPr>
+                <w:rFonts w:ascii="Consolas" w:eastAsia="Consolas" w:hAnsi="Consolas" w:cs="Consolas"/>
+                <w:sz w:val="21"/>
+                <w:szCs w:val="21"/>
+              </w:rPr>
+              <w:t xml:space="preserve">UUID</w:t>
+            </w:r>
+          </w:p>
+        </w:tc>
+        <w:tc>
+          <w:tcPr>
+            <w:tcW w:w="5226" w:type="dxa"/>
+          </w:tcPr>
+          <w:p>
+            <w:pPr>
+              <w:spacing w:after="40" w:line="260" w:lineRule="auto"/>
+              <w:ind w:left="57" w:right="57"/>
+            </w:pPr>
+            <w:r>
+              <w:rPr>
+                <w:sz w:val="21"/>
+                <w:szCs w:val="21"/>
+              </w:rPr>
+              <w:t xml:space="preserve">FK -&gt; refresh_tokens.id, NULL cho tới khi bị rotate</w:t>
+            </w:r>
+          </w:p>
+        </w:tc>
+      </w:tr>
+      <w:tr>
+        <w:tblPrEx>
+          <w:tblCellMar>
+            <w:top w:w="0" w:type="dxa"/>
+            <w:bottom w:w="0" w:type="dxa"/>
+          </w:tblCellMar>
+        </w:tblPrEx>
+        <w:tc>
+          <w:tcPr>
+            <w:tcW w:w="2000" w:type="dxa"/>
+          </w:tcPr>
+          <w:p>
+            <w:pPr>
+              <w:spacing w:after="40" w:line="260" w:lineRule="auto"/>
+              <w:ind w:left="57" w:right="57"/>
+            </w:pPr>
+            <w:r>
+              <w:rPr>
+                <w:rFonts w:ascii="Consolas" w:eastAsia="Consolas" w:hAnsi="Consolas" w:cs="Consolas"/>
+                <w:sz w:val="21"/>
+                <w:szCs w:val="21"/>
+              </w:rPr>
+              <w:t xml:space="preserve">expires_at</w:t>
+            </w:r>
+          </w:p>
+        </w:tc>
+        <w:tc>
+          <w:tcPr>
+            <w:tcW w:w="1800" w:type="dxa"/>
+          </w:tcPr>
+          <w:p>
+            <w:pPr>
+              <w:spacing w:after="40" w:line="260" w:lineRule="auto"/>
+              <w:ind w:left="57" w:right="57"/>
+            </w:pPr>
+            <w:r>
+              <w:rPr>
+                <w:rFonts w:ascii="Consolas" w:eastAsia="Consolas" w:hAnsi="Consolas" w:cs="Consolas"/>
+                <w:sz w:val="21"/>
+                <w:szCs w:val="21"/>
+              </w:rPr>
+              <w:t xml:space="preserve">TIMESTAMPTZ</w:t>
+            </w:r>
+          </w:p>
+        </w:tc>
+        <w:tc>
+          <w:tcPr>
+            <w:tcW w:w="5226" w:type="dxa"/>
+          </w:tcPr>
+          <w:p>
+            <w:pPr>
+              <w:spacing w:after="40" w:line="260" w:lineRule="auto"/>
+              <w:ind w:left="57" w:right="57"/>
+            </w:pPr>
+            <w:r>
+              <w:rPr>
+                <w:sz w:val="21"/>
+                <w:szCs w:val="21"/>
+              </w:rPr>
+              <w:t xml:space="preserve">NOT NULL</w:t>
+            </w:r>
+          </w:p>
+        </w:tc>
+      </w:tr>
+      <w:tr>
+        <w:tblPrEx>
+          <w:tblCellMar>
+            <w:top w:w="0" w:type="dxa"/>
+            <w:bottom w:w="0" w:type="dxa"/>
+          </w:tblCellMar>
+        </w:tblPrEx>
+        <w:tc>
+          <w:tcPr>
+            <w:tcW w:w="2000" w:type="dxa"/>
+          </w:tcPr>
+          <w:p>
+            <w:pPr>
+              <w:spacing w:after="40" w:line="260" w:lineRule="auto"/>
+              <w:ind w:left="57" w:right="57"/>
+            </w:pPr>
+            <w:r>
+              <w:rPr>
+                <w:rFonts w:ascii="Consolas" w:eastAsia="Consolas" w:hAnsi="Consolas" w:cs="Consolas"/>
+                <w:sz w:val="21"/>
+                <w:szCs w:val="21"/>
+              </w:rPr>
+              <w:t xml:space="preserve">revoked_at</w:t>
+            </w:r>
+          </w:p>
+        </w:tc>
+        <w:tc>
+          <w:tcPr>
+            <w:tcW w:w="1800" w:type="dxa"/>
+          </w:tcPr>
+          <w:p>
+            <w:pPr>
+              <w:spacing w:after="40" w:line="260" w:lineRule="auto"/>
+              <w:ind w:left="57" w:right="57"/>
+            </w:pPr>
+            <w:r>
+              <w:rPr>
+                <w:rFonts w:ascii="Consolas" w:eastAsia="Consolas" w:hAnsi="Consolas" w:cs="Consolas"/>
+                <w:sz w:val="21"/>
+                <w:szCs w:val="21"/>
+              </w:rPr>
+              <w:t xml:space="preserve">TIMESTAMPTZ</w:t>
+            </w:r>
+          </w:p>
+        </w:tc>
+        <w:tc>
+          <w:tcPr>
+            <w:tcW w:w="5226" w:type="dxa"/>
+          </w:tcPr>
+          <w:p>
+            <w:pPr>
+              <w:spacing w:after="40" w:line="260" w:lineRule="auto"/>
+              <w:ind w:left="57" w:right="57"/>
+            </w:pPr>
+            <w:r>
+              <w:rPr>
+                <w:sz w:val="21"/>
+                <w:szCs w:val="21"/>
+              </w:rPr>
+              <w:t xml:space="preserve">NULL cho tới khi bị thu hồi (logout hoặc phát hiện tái sử dụng)</w:t>
+            </w:r>
+          </w:p>
+        </w:tc>
+      </w:tr>
+      <w:tr>
+        <w:tblPrEx>
+          <w:tblCellMar>
+            <w:top w:w="0" w:type="dxa"/>
+            <w:bottom w:w="0" w:type="dxa"/>
+          </w:tblCellMar>
+        </w:tblPrEx>
+        <w:tc>
+          <w:tcPr>
+            <w:tcW w:w="2000" w:type="dxa"/>
+          </w:tcPr>
+          <w:p>
+            <w:pPr>
+              <w:spacing w:after="40" w:line="260" w:lineRule="auto"/>
+              <w:ind w:left="57" w:right="57"/>
+            </w:pPr>
+            <w:r>
+              <w:rPr>
+                <w:rFonts w:ascii="Consolas" w:eastAsia="Consolas" w:hAnsi="Consolas" w:cs="Consolas"/>
+                <w:sz w:val="21"/>
+                <w:szCs w:val="21"/>
+              </w:rPr>
+              <w:t xml:space="preserve">created_at</w:t>
+            </w:r>
+          </w:p>
+        </w:tc>
+        <w:tc>
+          <w:tcPr>
+            <w:tcW w:w="1800" w:type="dxa"/>
+          </w:tcPr>
+          <w:p>
+            <w:pPr>
+              <w:spacing w:after="40" w:line="260" w:lineRule="auto"/>
+              <w:ind w:left="57" w:right="57"/>
+            </w:pPr>
+            <w:r>
+              <w:rPr>
+                <w:rFonts w:ascii="Consolas" w:eastAsia="Consolas" w:hAnsi="Consolas" w:cs="Consolas"/>
+                <w:sz w:val="21"/>
+                <w:szCs w:val="21"/>
+              </w:rPr>
+              <w:t xml:space="preserve">TIMESTAMPTZ</w:t>
+            </w:r>
+          </w:p>
+        </w:tc>
+        <w:tc>
+          <w:tcPr>
+            <w:tcW w:w="5226" w:type="dxa"/>
+          </w:tcPr>
+          <w:p>
+            <w:pPr>
+              <w:spacing w:after="40" w:line="260" w:lineRule="auto"/>
+              <w:ind w:left="57" w:right="57"/>
+            </w:pPr>
+            <w:r>
+              <w:rPr>
+                <w:sz w:val="21"/>
+                <w:szCs w:val="21"/>
+              </w:rPr>
+              <w:t xml:space="preserve">DEFAULT now()</w:t>
             </w:r>
           </w:p>
         </w:tc>

</xml_diff>

<commit_message>
chore: adjusted logic and implement all logic of Authen & Author (#7)
* chore: adjusted logic and implement all logic of Authen & Author

* chore: fix bug
</commit_message>
<xml_diff>
--- a/backend/docs/DANASEA_Database_Design.docx
+++ b/backend/docs/DANASEA_Database_Design.docx
@@ -1882,6 +1882,640 @@
                 <w:szCs w:val="21"/>
               </w:rPr>
               <w:t>NULL cho tới khi xác thực</w:t>
+            </w:r>
+          </w:p>
+        </w:tc>
+      </w:tr>
+    </w:tbl>
+    <w:p>
+      <w:pPr>
+        <w:spacing w:before="200" w:after="80"/>
+      </w:pPr>
+      <w:r>
+        <w:rPr>
+          <w:rFonts w:ascii="Consolas" w:eastAsia="Consolas" w:hAnsi="Consolas" w:cs="Consolas"/>
+          <w:b/>
+          <w:bCs/>
+          <w:color w:val="1F4E79"/>
+          <w:sz w:val="24"/>
+          <w:szCs w:val="24"/>
+        </w:rPr>
+        <w:t>refresh_tokens</w:t>
+      </w:r>
+      <w:r>
+        <w:rPr>
+          <w:i/>
+          <w:iCs/>
+          <w:sz w:val="23"/>
+          <w:szCs w:val="23"/>
+        </w:rPr>
+        <w:t xml:space="preserve">  —  Refresh token cho phiên đăng nhập, hỗ trợ rotation và revoke khi logout.</w:t>
+      </w:r>
+    </w:p>
+    <w:tbl>
+      <w:tblPr>
+        <w:tblW w:w="9026" w:type="dxa"/>
+        <w:tblBorders>
+          <w:top w:val="single" w:sz="4" w:space="0" w:color="auto"/>
+          <w:left w:val="single" w:sz="4" w:space="0" w:color="auto"/>
+          <w:bottom w:val="single" w:sz="4" w:space="0" w:color="auto"/>
+          <w:right w:val="single" w:sz="4" w:space="0" w:color="auto"/>
+          <w:insideH w:val="single" w:sz="4" w:space="0" w:color="auto"/>
+          <w:insideV w:val="single" w:sz="4" w:space="0" w:color="auto"/>
+        </w:tblBorders>
+        <w:tblCellMar>
+          <w:left w:w="10" w:type="dxa"/>
+          <w:right w:w="10" w:type="dxa"/>
+        </w:tblCellMar>
+        <w:tblLook w:val="0000" w:firstRow="0" w:lastRow="0" w:firstColumn="0" w:lastColumn="0" w:noHBand="0" w:noVBand="0"/>
+      </w:tblPr>
+      <w:tblGrid>
+        <w:gridCol w:w="2000"/>
+        <w:gridCol w:w="1800"/>
+        <w:gridCol w:w="5226"/>
+      </w:tblGrid>
+      <w:tr>
+        <w:tblPrEx>
+          <w:tblCellMar>
+            <w:top w:w="0" w:type="dxa"/>
+            <w:bottom w:w="0" w:type="dxa"/>
+          </w:tblCellMar>
+        </w:tblPrEx>
+        <w:trPr>
+          <w:tblHeader/>
+        </w:trPr>
+        <w:tc>
+          <w:tcPr>
+            <w:tcW w:w="2000" w:type="dxa"/>
+            <w:shd w:val="clear" w:color="auto" w:fill="D9D9D9"/>
+          </w:tcPr>
+          <w:p>
+            <w:pPr>
+              <w:spacing w:after="40" w:line="260" w:lineRule="auto"/>
+              <w:jc w:val="center"/>
+            </w:pPr>
+            <w:r>
+              <w:rPr>
+                <w:b/>
+                <w:bCs/>
+                <w:sz w:val="21"/>
+                <w:szCs w:val="21"/>
+              </w:rPr>
+              <w:t xml:space="preserve">Trường</w:t>
+            </w:r>
+          </w:p>
+        </w:tc>
+        <w:tc>
+          <w:tcPr>
+            <w:tcW w:w="1800" w:type="dxa"/>
+            <w:shd w:val="clear" w:color="auto" w:fill="D9D9D9"/>
+          </w:tcPr>
+          <w:p>
+            <w:pPr>
+              <w:spacing w:after="40" w:line="260" w:lineRule="auto"/>
+              <w:jc w:val="center"/>
+            </w:pPr>
+            <w:r>
+              <w:rPr>
+                <w:b/>
+                <w:bCs/>
+                <w:sz w:val="21"/>
+                <w:szCs w:val="21"/>
+              </w:rPr>
+              <w:t xml:space="preserve">Kiểu dữ liệu</w:t>
+            </w:r>
+          </w:p>
+        </w:tc>
+        <w:tc>
+          <w:tcPr>
+            <w:tcW w:w="5226" w:type="dxa"/>
+            <w:shd w:val="clear" w:color="auto" w:fill="D9D9D9"/>
+          </w:tcPr>
+          <w:p>
+            <w:pPr>
+              <w:spacing w:after="40" w:line="260" w:lineRule="auto"/>
+              <w:jc w:val="center"/>
+            </w:pPr>
+            <w:r>
+              <w:rPr>
+                <w:b/>
+                <w:bCs/>
+                <w:sz w:val="21"/>
+                <w:szCs w:val="21"/>
+              </w:rPr>
+              <w:t xml:space="preserve">Ghi chú</w:t>
+            </w:r>
+          </w:p>
+        </w:tc>
+      </w:tr>
+      <w:tr>
+        <w:tblPrEx>
+          <w:tblCellMar>
+            <w:top w:w="0" w:type="dxa"/>
+            <w:bottom w:w="0" w:type="dxa"/>
+          </w:tblCellMar>
+        </w:tblPrEx>
+        <w:tc>
+          <w:tcPr>
+            <w:tcW w:w="2000" w:type="dxa"/>
+          </w:tcPr>
+          <w:p>
+            <w:pPr>
+              <w:spacing w:after="40" w:line="260" w:lineRule="auto"/>
+              <w:ind w:left="57" w:right="57"/>
+            </w:pPr>
+            <w:r>
+              <w:rPr>
+                <w:rFonts w:ascii="Consolas" w:eastAsia="Consolas" w:hAnsi="Consolas" w:cs="Consolas"/>
+                <w:sz w:val="21"/>
+                <w:szCs w:val="21"/>
+              </w:rPr>
+              <w:t xml:space="preserve">id</w:t>
+            </w:r>
+          </w:p>
+        </w:tc>
+        <w:tc>
+          <w:tcPr>
+            <w:tcW w:w="1800" w:type="dxa"/>
+          </w:tcPr>
+          <w:p>
+            <w:pPr>
+              <w:spacing w:after="40" w:line="260" w:lineRule="auto"/>
+              <w:ind w:left="57" w:right="57"/>
+            </w:pPr>
+            <w:r>
+              <w:rPr>
+                <w:rFonts w:ascii="Consolas" w:eastAsia="Consolas" w:hAnsi="Consolas" w:cs="Consolas"/>
+                <w:sz w:val="21"/>
+                <w:szCs w:val="21"/>
+              </w:rPr>
+              <w:t xml:space="preserve">UUID</w:t>
+            </w:r>
+          </w:p>
+        </w:tc>
+        <w:tc>
+          <w:tcPr>
+            <w:tcW w:w="5226" w:type="dxa"/>
+          </w:tcPr>
+          <w:p>
+            <w:pPr>
+              <w:spacing w:after="40" w:line="260" w:lineRule="auto"/>
+              <w:ind w:left="57" w:right="57"/>
+            </w:pPr>
+            <w:r>
+              <w:rPr>
+                <w:sz w:val="21"/>
+                <w:szCs w:val="21"/>
+              </w:rPr>
+              <w:t xml:space="preserve">PK</w:t>
+            </w:r>
+          </w:p>
+        </w:tc>
+      </w:tr>
+      <w:tr>
+        <w:tblPrEx>
+          <w:tblCellMar>
+            <w:top w:w="0" w:type="dxa"/>
+            <w:bottom w:w="0" w:type="dxa"/>
+          </w:tblCellMar>
+        </w:tblPrEx>
+        <w:tc>
+          <w:tcPr>
+            <w:tcW w:w="2000" w:type="dxa"/>
+          </w:tcPr>
+          <w:p>
+            <w:pPr>
+              <w:spacing w:after="40" w:line="260" w:lineRule="auto"/>
+              <w:ind w:left="57" w:right="57"/>
+            </w:pPr>
+            <w:r>
+              <w:rPr>
+                <w:rFonts w:ascii="Consolas" w:eastAsia="Consolas" w:hAnsi="Consolas" w:cs="Consolas"/>
+                <w:sz w:val="21"/>
+                <w:szCs w:val="21"/>
+              </w:rPr>
+              <w:t xml:space="preserve">user_id</w:t>
+            </w:r>
+          </w:p>
+        </w:tc>
+        <w:tc>
+          <w:tcPr>
+            <w:tcW w:w="1800" w:type="dxa"/>
+          </w:tcPr>
+          <w:p>
+            <w:pPr>
+              <w:spacing w:after="40" w:line="260" w:lineRule="auto"/>
+              <w:ind w:left="57" w:right="57"/>
+            </w:pPr>
+            <w:r>
+              <w:rPr>
+                <w:rFonts w:ascii="Consolas" w:eastAsia="Consolas" w:hAnsi="Consolas" w:cs="Consolas"/>
+                <w:sz w:val="21"/>
+                <w:szCs w:val="21"/>
+              </w:rPr>
+              <w:t xml:space="preserve">UUID</w:t>
+            </w:r>
+          </w:p>
+        </w:tc>
+        <w:tc>
+          <w:tcPr>
+            <w:tcW w:w="5226" w:type="dxa"/>
+          </w:tcPr>
+          <w:p>
+            <w:pPr>
+              <w:spacing w:after="40" w:line="260" w:lineRule="auto"/>
+              <w:ind w:left="57" w:right="57"/>
+            </w:pPr>
+            <w:r>
+              <w:rPr>
+                <w:sz w:val="21"/>
+                <w:szCs w:val="21"/>
+              </w:rPr>
+              <w:t xml:space="preserve">FK -&gt; users.id</w:t>
+            </w:r>
+          </w:p>
+        </w:tc>
+      </w:tr>
+      <w:tr>
+        <w:tblPrEx>
+          <w:tblCellMar>
+            <w:top w:w="0" w:type="dxa"/>
+            <w:bottom w:w="0" w:type="dxa"/>
+          </w:tblCellMar>
+        </w:tblPrEx>
+        <w:tc>
+          <w:tcPr>
+            <w:tcW w:w="2000" w:type="dxa"/>
+          </w:tcPr>
+          <w:p>
+            <w:pPr>
+              <w:spacing w:after="40" w:line="260" w:lineRule="auto"/>
+              <w:ind w:left="57" w:right="57"/>
+            </w:pPr>
+            <w:r>
+              <w:rPr>
+                <w:rFonts w:ascii="Consolas" w:eastAsia="Consolas" w:hAnsi="Consolas" w:cs="Consolas"/>
+                <w:sz w:val="21"/>
+                <w:szCs w:val="21"/>
+              </w:rPr>
+              <w:t xml:space="preserve">token_hash</w:t>
+            </w:r>
+          </w:p>
+        </w:tc>
+        <w:tc>
+          <w:tcPr>
+            <w:tcW w:w="1800" w:type="dxa"/>
+          </w:tcPr>
+          <w:p>
+            <w:pPr>
+              <w:spacing w:after="40" w:line="260" w:lineRule="auto"/>
+              <w:ind w:left="57" w:right="57"/>
+            </w:pPr>
+            <w:r>
+              <w:rPr>
+                <w:rFonts w:ascii="Consolas" w:eastAsia="Consolas" w:hAnsi="Consolas" w:cs="Consolas"/>
+                <w:sz w:val="21"/>
+                <w:szCs w:val="21"/>
+              </w:rPr>
+              <w:t xml:space="preserve">VARCHAR(255)</w:t>
+            </w:r>
+          </w:p>
+        </w:tc>
+        <w:tc>
+          <w:tcPr>
+            <w:tcW w:w="5226" w:type="dxa"/>
+          </w:tcPr>
+          <w:p>
+            <w:pPr>
+              <w:spacing w:after="40" w:line="260" w:lineRule="auto"/>
+              <w:ind w:left="57" w:right="57"/>
+            </w:pPr>
+            <w:r>
+              <w:rPr>
+                <w:sz w:val="21"/>
+                <w:szCs w:val="21"/>
+              </w:rPr>
+              <w:t xml:space="preserve">UNIQUE, NOT NULL</w:t>
+            </w:r>
+          </w:p>
+        </w:tc>
+      </w:tr>
+      <w:tr>
+        <w:tblPrEx>
+          <w:tblCellMar>
+            <w:top w:w="0" w:type="dxa"/>
+            <w:bottom w:w="0" w:type="dxa"/>
+          </w:tblCellMar>
+        </w:tblPrEx>
+        <w:tc>
+          <w:tcPr>
+            <w:tcW w:w="2000" w:type="dxa"/>
+          </w:tcPr>
+          <w:p>
+            <w:pPr>
+              <w:spacing w:after="40" w:line="260" w:lineRule="auto"/>
+              <w:ind w:left="57" w:right="57"/>
+            </w:pPr>
+            <w:r>
+              <w:rPr>
+                <w:rFonts w:ascii="Consolas" w:eastAsia="Consolas" w:hAnsi="Consolas" w:cs="Consolas"/>
+                <w:sz w:val="21"/>
+                <w:szCs w:val="21"/>
+              </w:rPr>
+              <w:t xml:space="preserve">family_id</w:t>
+            </w:r>
+          </w:p>
+        </w:tc>
+        <w:tc>
+          <w:tcPr>
+            <w:tcW w:w="1800" w:type="dxa"/>
+          </w:tcPr>
+          <w:p>
+            <w:pPr>
+              <w:spacing w:after="40" w:line="260" w:lineRule="auto"/>
+              <w:ind w:left="57" w:right="57"/>
+            </w:pPr>
+            <w:r>
+              <w:rPr>
+                <w:rFonts w:ascii="Consolas" w:eastAsia="Consolas" w:hAnsi="Consolas" w:cs="Consolas"/>
+                <w:sz w:val="21"/>
+                <w:szCs w:val="21"/>
+              </w:rPr>
+              <w:t xml:space="preserve">UUID</w:t>
+            </w:r>
+          </w:p>
+        </w:tc>
+        <w:tc>
+          <w:tcPr>
+            <w:tcW w:w="5226" w:type="dxa"/>
+          </w:tcPr>
+          <w:p>
+            <w:pPr>
+              <w:spacing w:after="40" w:line="260" w:lineRule="auto"/>
+              <w:ind w:left="57" w:right="57"/>
+            </w:pPr>
+            <w:r>
+              <w:rPr>
+                <w:sz w:val="21"/>
+                <w:szCs w:val="21"/>
+              </w:rPr>
+              <w:t xml:space="preserve">NOT NULL — nhóm các token cùng một chuỗi rotation, dùng để thu hồi toàn bộ chain khi phát hiện tái sử dụng</w:t>
+            </w:r>
+          </w:p>
+        </w:tc>
+      </w:tr>
+      <w:tr>
+        <w:tblPrEx>
+          <w:tblCellMar>
+            <w:top w:w="0" w:type="dxa"/>
+            <w:bottom w:w="0" w:type="dxa"/>
+          </w:tblCellMar>
+        </w:tblPrEx>
+        <w:tc>
+          <w:tcPr>
+            <w:tcW w:w="2000" w:type="dxa"/>
+          </w:tcPr>
+          <w:p>
+            <w:pPr>
+              <w:spacing w:after="40" w:line="260" w:lineRule="auto"/>
+              <w:ind w:left="57" w:right="57"/>
+            </w:pPr>
+            <w:r>
+              <w:rPr>
+                <w:rFonts w:ascii="Consolas" w:eastAsia="Consolas" w:hAnsi="Consolas" w:cs="Consolas"/>
+                <w:sz w:val="21"/>
+                <w:szCs w:val="21"/>
+              </w:rPr>
+              <w:t xml:space="preserve">replaced_by_id</w:t>
+            </w:r>
+          </w:p>
+        </w:tc>
+        <w:tc>
+          <w:tcPr>
+            <w:tcW w:w="1800" w:type="dxa"/>
+          </w:tcPr>
+          <w:p>
+            <w:pPr>
+              <w:spacing w:after="40" w:line="260" w:lineRule="auto"/>
+              <w:ind w:left="57" w:right="57"/>
+            </w:pPr>
+            <w:r>
+              <w:rPr>
+                <w:rFonts w:ascii="Consolas" w:eastAsia="Consolas" w:hAnsi="Consolas" w:cs="Consolas"/>
+                <w:sz w:val="21"/>
+                <w:szCs w:val="21"/>
+              </w:rPr>
+              <w:t xml:space="preserve">UUID</w:t>
+            </w:r>
+          </w:p>
+        </w:tc>
+        <w:tc>
+          <w:tcPr>
+            <w:tcW w:w="5226" w:type="dxa"/>
+          </w:tcPr>
+          <w:p>
+            <w:pPr>
+              <w:spacing w:after="40" w:line="260" w:lineRule="auto"/>
+              <w:ind w:left="57" w:right="57"/>
+            </w:pPr>
+            <w:r>
+              <w:rPr>
+                <w:sz w:val="21"/>
+                <w:szCs w:val="21"/>
+              </w:rPr>
+              <w:t xml:space="preserve">FK -&gt; refresh_tokens.id, NULL cho tới khi bị rotate</w:t>
+            </w:r>
+          </w:p>
+        </w:tc>
+      </w:tr>
+      <w:tr>
+        <w:tblPrEx>
+          <w:tblCellMar>
+            <w:top w:w="0" w:type="dxa"/>
+            <w:bottom w:w="0" w:type="dxa"/>
+          </w:tblCellMar>
+        </w:tblPrEx>
+        <w:tc>
+          <w:tcPr>
+            <w:tcW w:w="2000" w:type="dxa"/>
+          </w:tcPr>
+          <w:p>
+            <w:pPr>
+              <w:spacing w:after="40" w:line="260" w:lineRule="auto"/>
+              <w:ind w:left="57" w:right="57"/>
+            </w:pPr>
+            <w:r>
+              <w:rPr>
+                <w:rFonts w:ascii="Consolas" w:eastAsia="Consolas" w:hAnsi="Consolas" w:cs="Consolas"/>
+                <w:sz w:val="21"/>
+                <w:szCs w:val="21"/>
+              </w:rPr>
+              <w:t xml:space="preserve">expires_at</w:t>
+            </w:r>
+          </w:p>
+        </w:tc>
+        <w:tc>
+          <w:tcPr>
+            <w:tcW w:w="1800" w:type="dxa"/>
+          </w:tcPr>
+          <w:p>
+            <w:pPr>
+              <w:spacing w:after="40" w:line="260" w:lineRule="auto"/>
+              <w:ind w:left="57" w:right="57"/>
+            </w:pPr>
+            <w:r>
+              <w:rPr>
+                <w:rFonts w:ascii="Consolas" w:eastAsia="Consolas" w:hAnsi="Consolas" w:cs="Consolas"/>
+                <w:sz w:val="21"/>
+                <w:szCs w:val="21"/>
+              </w:rPr>
+              <w:t xml:space="preserve">TIMESTAMPTZ</w:t>
+            </w:r>
+          </w:p>
+        </w:tc>
+        <w:tc>
+          <w:tcPr>
+            <w:tcW w:w="5226" w:type="dxa"/>
+          </w:tcPr>
+          <w:p>
+            <w:pPr>
+              <w:spacing w:after="40" w:line="260" w:lineRule="auto"/>
+              <w:ind w:left="57" w:right="57"/>
+            </w:pPr>
+            <w:r>
+              <w:rPr>
+                <w:sz w:val="21"/>
+                <w:szCs w:val="21"/>
+              </w:rPr>
+              <w:t xml:space="preserve">NOT NULL</w:t>
+            </w:r>
+          </w:p>
+        </w:tc>
+      </w:tr>
+      <w:tr>
+        <w:tblPrEx>
+          <w:tblCellMar>
+            <w:top w:w="0" w:type="dxa"/>
+            <w:bottom w:w="0" w:type="dxa"/>
+          </w:tblCellMar>
+        </w:tblPrEx>
+        <w:tc>
+          <w:tcPr>
+            <w:tcW w:w="2000" w:type="dxa"/>
+          </w:tcPr>
+          <w:p>
+            <w:pPr>
+              <w:spacing w:after="40" w:line="260" w:lineRule="auto"/>
+              <w:ind w:left="57" w:right="57"/>
+            </w:pPr>
+            <w:r>
+              <w:rPr>
+                <w:rFonts w:ascii="Consolas" w:eastAsia="Consolas" w:hAnsi="Consolas" w:cs="Consolas"/>
+                <w:sz w:val="21"/>
+                <w:szCs w:val="21"/>
+              </w:rPr>
+              <w:t xml:space="preserve">revoked_at</w:t>
+            </w:r>
+          </w:p>
+        </w:tc>
+        <w:tc>
+          <w:tcPr>
+            <w:tcW w:w="1800" w:type="dxa"/>
+          </w:tcPr>
+          <w:p>
+            <w:pPr>
+              <w:spacing w:after="40" w:line="260" w:lineRule="auto"/>
+              <w:ind w:left="57" w:right="57"/>
+            </w:pPr>
+            <w:r>
+              <w:rPr>
+                <w:rFonts w:ascii="Consolas" w:eastAsia="Consolas" w:hAnsi="Consolas" w:cs="Consolas"/>
+                <w:sz w:val="21"/>
+                <w:szCs w:val="21"/>
+              </w:rPr>
+              <w:t xml:space="preserve">TIMESTAMPTZ</w:t>
+            </w:r>
+          </w:p>
+        </w:tc>
+        <w:tc>
+          <w:tcPr>
+            <w:tcW w:w="5226" w:type="dxa"/>
+          </w:tcPr>
+          <w:p>
+            <w:pPr>
+              <w:spacing w:after="40" w:line="260" w:lineRule="auto"/>
+              <w:ind w:left="57" w:right="57"/>
+            </w:pPr>
+            <w:r>
+              <w:rPr>
+                <w:sz w:val="21"/>
+                <w:szCs w:val="21"/>
+              </w:rPr>
+              <w:t xml:space="preserve">NULL cho tới khi bị thu hồi (logout hoặc phát hiện tái sử dụng)</w:t>
+            </w:r>
+          </w:p>
+        </w:tc>
+      </w:tr>
+      <w:tr>
+        <w:tblPrEx>
+          <w:tblCellMar>
+            <w:top w:w="0" w:type="dxa"/>
+            <w:bottom w:w="0" w:type="dxa"/>
+          </w:tblCellMar>
+        </w:tblPrEx>
+        <w:tc>
+          <w:tcPr>
+            <w:tcW w:w="2000" w:type="dxa"/>
+          </w:tcPr>
+          <w:p>
+            <w:pPr>
+              <w:spacing w:after="40" w:line="260" w:lineRule="auto"/>
+              <w:ind w:left="57" w:right="57"/>
+            </w:pPr>
+            <w:r>
+              <w:rPr>
+                <w:rFonts w:ascii="Consolas" w:eastAsia="Consolas" w:hAnsi="Consolas" w:cs="Consolas"/>
+                <w:sz w:val="21"/>
+                <w:szCs w:val="21"/>
+              </w:rPr>
+              <w:t xml:space="preserve">created_at</w:t>
+            </w:r>
+          </w:p>
+        </w:tc>
+        <w:tc>
+          <w:tcPr>
+            <w:tcW w:w="1800" w:type="dxa"/>
+          </w:tcPr>
+          <w:p>
+            <w:pPr>
+              <w:spacing w:after="40" w:line="260" w:lineRule="auto"/>
+              <w:ind w:left="57" w:right="57"/>
+            </w:pPr>
+            <w:r>
+              <w:rPr>
+                <w:rFonts w:ascii="Consolas" w:eastAsia="Consolas" w:hAnsi="Consolas" w:cs="Consolas"/>
+                <w:sz w:val="21"/>
+                <w:szCs w:val="21"/>
+              </w:rPr>
+              <w:t xml:space="preserve">TIMESTAMPTZ</w:t>
+            </w:r>
+          </w:p>
+        </w:tc>
+        <w:tc>
+          <w:tcPr>
+            <w:tcW w:w="5226" w:type="dxa"/>
+          </w:tcPr>
+          <w:p>
+            <w:pPr>
+              <w:spacing w:after="40" w:line="260" w:lineRule="auto"/>
+              <w:ind w:left="57" w:right="57"/>
+            </w:pPr>
+            <w:r>
+              <w:rPr>
+                <w:sz w:val="21"/>
+                <w:szCs w:val="21"/>
+              </w:rPr>
+              <w:t xml:space="preserve">DEFAULT now()</w:t>
             </w:r>
           </w:p>
         </w:tc>

</xml_diff>

<commit_message>
feat: feature send OTP by Email
</commit_message>
<xml_diff>
--- a/backend/docs/DANASEA_Database_Design.docx
+++ b/backend/docs/DANASEA_Database_Design.docx
@@ -231,12 +231,6 @@
         <w:gridCol w:w="3677"/>
       </w:tblGrid>
       <w:tr>
-        <w:tblPrEx>
-          <w:tblCellMar>
-            <w:top w:w="0" w:type="dxa"/>
-            <w:bottom w:w="0" w:type="dxa"/>
-          </w:tblCellMar>
-        </w:tblPrEx>
         <w:trPr>
           <w:tblHeader/>
         </w:trPr>
@@ -305,12 +299,6 @@
         </w:tc>
       </w:tr>
       <w:tr>
-        <w:tblPrEx>
-          <w:tblCellMar>
-            <w:top w:w="0" w:type="dxa"/>
-            <w:bottom w:w="0" w:type="dxa"/>
-          </w:tblCellMar>
-        </w:tblPrEx>
         <w:tc>
           <w:tcPr>
             <w:tcW w:w="2000" w:type="dxa"/>
@@ -369,12 +357,6 @@
         </w:tc>
       </w:tr>
       <w:tr>
-        <w:tblPrEx>
-          <w:tblCellMar>
-            <w:top w:w="0" w:type="dxa"/>
-            <w:bottom w:w="0" w:type="dxa"/>
-          </w:tblCellMar>
-        </w:tblPrEx>
         <w:tc>
           <w:tcPr>
             <w:tcW w:w="2000" w:type="dxa"/>
@@ -433,12 +415,6 @@
         </w:tc>
       </w:tr>
       <w:tr>
-        <w:tblPrEx>
-          <w:tblCellMar>
-            <w:top w:w="0" w:type="dxa"/>
-            <w:bottom w:w="0" w:type="dxa"/>
-          </w:tblCellMar>
-        </w:tblPrEx>
         <w:tc>
           <w:tcPr>
             <w:tcW w:w="2000" w:type="dxa"/>
@@ -497,12 +473,6 @@
         </w:tc>
       </w:tr>
       <w:tr>
-        <w:tblPrEx>
-          <w:tblCellMar>
-            <w:top w:w="0" w:type="dxa"/>
-            <w:bottom w:w="0" w:type="dxa"/>
-          </w:tblCellMar>
-        </w:tblPrEx>
         <w:tc>
           <w:tcPr>
             <w:tcW w:w="2000" w:type="dxa"/>
@@ -561,12 +531,6 @@
         </w:tc>
       </w:tr>
       <w:tr>
-        <w:tblPrEx>
-          <w:tblCellMar>
-            <w:top w:w="0" w:type="dxa"/>
-            <w:bottom w:w="0" w:type="dxa"/>
-          </w:tblCellMar>
-        </w:tblPrEx>
         <w:tc>
           <w:tcPr>
             <w:tcW w:w="2000" w:type="dxa"/>
@@ -625,12 +589,6 @@
         </w:tc>
       </w:tr>
       <w:tr>
-        <w:tblPrEx>
-          <w:tblCellMar>
-            <w:top w:w="0" w:type="dxa"/>
-            <w:bottom w:w="0" w:type="dxa"/>
-          </w:tblCellMar>
-        </w:tblPrEx>
         <w:tc>
           <w:tcPr>
             <w:tcW w:w="2000" w:type="dxa"/>
@@ -689,12 +647,6 @@
         </w:tc>
       </w:tr>
       <w:tr>
-        <w:tblPrEx>
-          <w:tblCellMar>
-            <w:top w:w="0" w:type="dxa"/>
-            <w:bottom w:w="0" w:type="dxa"/>
-          </w:tblCellMar>
-        </w:tblPrEx>
         <w:tc>
           <w:tcPr>
             <w:tcW w:w="2000" w:type="dxa"/>
@@ -746,12 +698,6 @@
         </w:tc>
       </w:tr>
       <w:tr>
-        <w:tblPrEx>
-          <w:tblCellMar>
-            <w:top w:w="0" w:type="dxa"/>
-            <w:bottom w:w="0" w:type="dxa"/>
-          </w:tblCellMar>
-        </w:tblPrEx>
         <w:tc>
           <w:tcPr>
             <w:tcW w:w="2000" w:type="dxa"/>
@@ -810,12 +756,6 @@
         </w:tc>
       </w:tr>
       <w:tr>
-        <w:tblPrEx>
-          <w:tblCellMar>
-            <w:top w:w="0" w:type="dxa"/>
-            <w:bottom w:w="0" w:type="dxa"/>
-          </w:tblCellMar>
-        </w:tblPrEx>
         <w:tc>
           <w:tcPr>
             <w:tcW w:w="2000" w:type="dxa"/>
@@ -874,12 +814,6 @@
         </w:tc>
       </w:tr>
       <w:tr>
-        <w:tblPrEx>
-          <w:tblCellMar>
-            <w:top w:w="0" w:type="dxa"/>
-            <w:bottom w:w="0" w:type="dxa"/>
-          </w:tblCellMar>
-        </w:tblPrEx>
         <w:tc>
           <w:tcPr>
             <w:tcW w:w="2000" w:type="dxa"/>
@@ -938,12 +872,6 @@
         </w:tc>
       </w:tr>
       <w:tr>
-        <w:tblPrEx>
-          <w:tblCellMar>
-            <w:top w:w="0" w:type="dxa"/>
-            <w:bottom w:w="0" w:type="dxa"/>
-          </w:tblCellMar>
-        </w:tblPrEx>
         <w:tc>
           <w:tcPr>
             <w:tcW w:w="2000" w:type="dxa"/>
@@ -1050,12 +978,6 @@
         <w:gridCol w:w="5226"/>
       </w:tblGrid>
       <w:tr>
-        <w:tblPrEx>
-          <w:tblCellMar>
-            <w:top w:w="0" w:type="dxa"/>
-            <w:bottom w:w="0" w:type="dxa"/>
-          </w:tblCellMar>
-        </w:tblPrEx>
         <w:trPr>
           <w:tblHeader/>
         </w:trPr>
@@ -1124,12 +1046,6 @@
         </w:tc>
       </w:tr>
       <w:tr>
-        <w:tblPrEx>
-          <w:tblCellMar>
-            <w:top w:w="0" w:type="dxa"/>
-            <w:bottom w:w="0" w:type="dxa"/>
-          </w:tblCellMar>
-        </w:tblPrEx>
         <w:tc>
           <w:tcPr>
             <w:tcW w:w="2000" w:type="dxa"/>
@@ -1188,12 +1104,6 @@
         </w:tc>
       </w:tr>
       <w:tr>
-        <w:tblPrEx>
-          <w:tblCellMar>
-            <w:top w:w="0" w:type="dxa"/>
-            <w:bottom w:w="0" w:type="dxa"/>
-          </w:tblCellMar>
-        </w:tblPrEx>
         <w:tc>
           <w:tcPr>
             <w:tcW w:w="2000" w:type="dxa"/>
@@ -1252,12 +1162,6 @@
         </w:tc>
       </w:tr>
       <w:tr>
-        <w:tblPrEx>
-          <w:tblCellMar>
-            <w:top w:w="0" w:type="dxa"/>
-            <w:bottom w:w="0" w:type="dxa"/>
-          </w:tblCellMar>
-        </w:tblPrEx>
         <w:tc>
           <w:tcPr>
             <w:tcW w:w="2000" w:type="dxa"/>
@@ -1316,12 +1220,6 @@
         </w:tc>
       </w:tr>
       <w:tr>
-        <w:tblPrEx>
-          <w:tblCellMar>
-            <w:top w:w="0" w:type="dxa"/>
-            <w:bottom w:w="0" w:type="dxa"/>
-          </w:tblCellMar>
-        </w:tblPrEx>
         <w:tc>
           <w:tcPr>
             <w:tcW w:w="2000" w:type="dxa"/>
@@ -1380,12 +1278,6 @@
         </w:tc>
       </w:tr>
       <w:tr>
-        <w:tblPrEx>
-          <w:tblCellMar>
-            <w:top w:w="0" w:type="dxa"/>
-            <w:bottom w:w="0" w:type="dxa"/>
-          </w:tblCellMar>
-        </w:tblPrEx>
         <w:tc>
           <w:tcPr>
             <w:tcW w:w="2000" w:type="dxa"/>
@@ -1439,449 +1331,6 @@
                 <w:szCs w:val="21"/>
               </w:rPr>
               <w:t>NULL cho tới khi dùng</w:t>
-            </w:r>
-          </w:p>
-        </w:tc>
-      </w:tr>
-    </w:tbl>
-    <w:p>
-      <w:pPr>
-        <w:spacing w:before="200" w:after="80"/>
-      </w:pPr>
-      <w:r>
-        <w:rPr>
-          <w:rFonts w:ascii="Consolas" w:eastAsia="Consolas" w:hAnsi="Consolas" w:cs="Consolas"/>
-          <w:b/>
-          <w:bCs/>
-          <w:color w:val="1F4E79"/>
-          <w:sz w:val="24"/>
-          <w:szCs w:val="24"/>
-        </w:rPr>
-        <w:t>email_verification_tokens</w:t>
-      </w:r>
-      <w:r>
-        <w:rPr>
-          <w:i/>
-          <w:iCs/>
-          <w:sz w:val="23"/>
-          <w:szCs w:val="23"/>
-        </w:rPr>
-        <w:t xml:space="preserve">  —  Token xác thực email khi đăng ký.</w:t>
-      </w:r>
-    </w:p>
-    <w:tbl>
-      <w:tblPr>
-        <w:tblW w:w="9026" w:type="dxa"/>
-        <w:tblBorders>
-          <w:top w:val="single" w:sz="4" w:space="0" w:color="auto"/>
-          <w:left w:val="single" w:sz="4" w:space="0" w:color="auto"/>
-          <w:bottom w:val="single" w:sz="4" w:space="0" w:color="auto"/>
-          <w:right w:val="single" w:sz="4" w:space="0" w:color="auto"/>
-          <w:insideH w:val="single" w:sz="4" w:space="0" w:color="auto"/>
-          <w:insideV w:val="single" w:sz="4" w:space="0" w:color="auto"/>
-        </w:tblBorders>
-        <w:tblCellMar>
-          <w:left w:w="10" w:type="dxa"/>
-          <w:right w:w="10" w:type="dxa"/>
-        </w:tblCellMar>
-        <w:tblLook w:val="0000" w:firstRow="0" w:lastRow="0" w:firstColumn="0" w:lastColumn="0" w:noHBand="0" w:noVBand="0"/>
-      </w:tblPr>
-      <w:tblGrid>
-        <w:gridCol w:w="2000"/>
-        <w:gridCol w:w="1800"/>
-        <w:gridCol w:w="5226"/>
-      </w:tblGrid>
-      <w:tr>
-        <w:tblPrEx>
-          <w:tblCellMar>
-            <w:top w:w="0" w:type="dxa"/>
-            <w:bottom w:w="0" w:type="dxa"/>
-          </w:tblCellMar>
-        </w:tblPrEx>
-        <w:trPr>
-          <w:tblHeader/>
-        </w:trPr>
-        <w:tc>
-          <w:tcPr>
-            <w:tcW w:w="2000" w:type="dxa"/>
-            <w:shd w:val="clear" w:color="auto" w:fill="D9D9D9"/>
-          </w:tcPr>
-          <w:p>
-            <w:pPr>
-              <w:spacing w:after="40" w:line="260" w:lineRule="auto"/>
-              <w:jc w:val="center"/>
-            </w:pPr>
-            <w:r>
-              <w:rPr>
-                <w:b/>
-                <w:bCs/>
-                <w:sz w:val="21"/>
-                <w:szCs w:val="21"/>
-              </w:rPr>
-              <w:lastRenderedPageBreak/>
-              <w:t>Trường</w:t>
-            </w:r>
-          </w:p>
-        </w:tc>
-        <w:tc>
-          <w:tcPr>
-            <w:tcW w:w="1800" w:type="dxa"/>
-            <w:shd w:val="clear" w:color="auto" w:fill="D9D9D9"/>
-          </w:tcPr>
-          <w:p>
-            <w:pPr>
-              <w:spacing w:after="40" w:line="260" w:lineRule="auto"/>
-              <w:jc w:val="center"/>
-            </w:pPr>
-            <w:r>
-              <w:rPr>
-                <w:b/>
-                <w:bCs/>
-                <w:sz w:val="21"/>
-                <w:szCs w:val="21"/>
-              </w:rPr>
-              <w:t>Kiểu dữ liệu</w:t>
-            </w:r>
-          </w:p>
-        </w:tc>
-        <w:tc>
-          <w:tcPr>
-            <w:tcW w:w="5226" w:type="dxa"/>
-            <w:shd w:val="clear" w:color="auto" w:fill="D9D9D9"/>
-          </w:tcPr>
-          <w:p>
-            <w:pPr>
-              <w:spacing w:after="40" w:line="260" w:lineRule="auto"/>
-              <w:jc w:val="center"/>
-            </w:pPr>
-            <w:r>
-              <w:rPr>
-                <w:b/>
-                <w:bCs/>
-                <w:sz w:val="21"/>
-                <w:szCs w:val="21"/>
-              </w:rPr>
-              <w:t>Ghi chú</w:t>
-            </w:r>
-          </w:p>
-        </w:tc>
-      </w:tr>
-      <w:tr>
-        <w:tblPrEx>
-          <w:tblCellMar>
-            <w:top w:w="0" w:type="dxa"/>
-            <w:bottom w:w="0" w:type="dxa"/>
-          </w:tblCellMar>
-        </w:tblPrEx>
-        <w:tc>
-          <w:tcPr>
-            <w:tcW w:w="2000" w:type="dxa"/>
-          </w:tcPr>
-          <w:p>
-            <w:pPr>
-              <w:spacing w:after="40" w:line="260" w:lineRule="auto"/>
-              <w:ind w:left="57" w:right="57"/>
-            </w:pPr>
-            <w:r>
-              <w:rPr>
-                <w:rFonts w:ascii="Consolas" w:eastAsia="Consolas" w:hAnsi="Consolas" w:cs="Consolas"/>
-                <w:sz w:val="21"/>
-                <w:szCs w:val="21"/>
-              </w:rPr>
-              <w:t>id</w:t>
-            </w:r>
-          </w:p>
-        </w:tc>
-        <w:tc>
-          <w:tcPr>
-            <w:tcW w:w="1800" w:type="dxa"/>
-          </w:tcPr>
-          <w:p>
-            <w:pPr>
-              <w:spacing w:after="40" w:line="260" w:lineRule="auto"/>
-              <w:ind w:left="57" w:right="57"/>
-            </w:pPr>
-            <w:r>
-              <w:rPr>
-                <w:rFonts w:ascii="Consolas" w:eastAsia="Consolas" w:hAnsi="Consolas" w:cs="Consolas"/>
-                <w:sz w:val="21"/>
-                <w:szCs w:val="21"/>
-              </w:rPr>
-              <w:t>UUID</w:t>
-            </w:r>
-          </w:p>
-        </w:tc>
-        <w:tc>
-          <w:tcPr>
-            <w:tcW w:w="5226" w:type="dxa"/>
-          </w:tcPr>
-          <w:p>
-            <w:pPr>
-              <w:spacing w:after="40" w:line="260" w:lineRule="auto"/>
-              <w:ind w:left="57" w:right="57"/>
-            </w:pPr>
-            <w:r>
-              <w:rPr>
-                <w:sz w:val="21"/>
-                <w:szCs w:val="21"/>
-              </w:rPr>
-              <w:t>PK</w:t>
-            </w:r>
-          </w:p>
-        </w:tc>
-      </w:tr>
-      <w:tr>
-        <w:tblPrEx>
-          <w:tblCellMar>
-            <w:top w:w="0" w:type="dxa"/>
-            <w:bottom w:w="0" w:type="dxa"/>
-          </w:tblCellMar>
-        </w:tblPrEx>
-        <w:tc>
-          <w:tcPr>
-            <w:tcW w:w="2000" w:type="dxa"/>
-          </w:tcPr>
-          <w:p>
-            <w:pPr>
-              <w:spacing w:after="40" w:line="260" w:lineRule="auto"/>
-              <w:ind w:left="57" w:right="57"/>
-            </w:pPr>
-            <w:r>
-              <w:rPr>
-                <w:rFonts w:ascii="Consolas" w:eastAsia="Consolas" w:hAnsi="Consolas" w:cs="Consolas"/>
-                <w:sz w:val="21"/>
-                <w:szCs w:val="21"/>
-              </w:rPr>
-              <w:t>user_id</w:t>
-            </w:r>
-          </w:p>
-        </w:tc>
-        <w:tc>
-          <w:tcPr>
-            <w:tcW w:w="1800" w:type="dxa"/>
-          </w:tcPr>
-          <w:p>
-            <w:pPr>
-              <w:spacing w:after="40" w:line="260" w:lineRule="auto"/>
-              <w:ind w:left="57" w:right="57"/>
-            </w:pPr>
-            <w:r>
-              <w:rPr>
-                <w:rFonts w:ascii="Consolas" w:eastAsia="Consolas" w:hAnsi="Consolas" w:cs="Consolas"/>
-                <w:sz w:val="21"/>
-                <w:szCs w:val="21"/>
-              </w:rPr>
-              <w:t>UUID</w:t>
-            </w:r>
-          </w:p>
-        </w:tc>
-        <w:tc>
-          <w:tcPr>
-            <w:tcW w:w="5226" w:type="dxa"/>
-          </w:tcPr>
-          <w:p>
-            <w:pPr>
-              <w:spacing w:after="40" w:line="260" w:lineRule="auto"/>
-              <w:ind w:left="57" w:right="57"/>
-            </w:pPr>
-            <w:r>
-              <w:rPr>
-                <w:sz w:val="21"/>
-                <w:szCs w:val="21"/>
-              </w:rPr>
-              <w:t>FK -&gt; users.id</w:t>
-            </w:r>
-          </w:p>
-        </w:tc>
-      </w:tr>
-      <w:tr>
-        <w:tblPrEx>
-          <w:tblCellMar>
-            <w:top w:w="0" w:type="dxa"/>
-            <w:bottom w:w="0" w:type="dxa"/>
-          </w:tblCellMar>
-        </w:tblPrEx>
-        <w:tc>
-          <w:tcPr>
-            <w:tcW w:w="2000" w:type="dxa"/>
-          </w:tcPr>
-          <w:p>
-            <w:pPr>
-              <w:spacing w:after="40" w:line="260" w:lineRule="auto"/>
-              <w:ind w:left="57" w:right="57"/>
-            </w:pPr>
-            <w:r>
-              <w:rPr>
-                <w:rFonts w:ascii="Consolas" w:eastAsia="Consolas" w:hAnsi="Consolas" w:cs="Consolas"/>
-                <w:sz w:val="21"/>
-                <w:szCs w:val="21"/>
-              </w:rPr>
-              <w:t>token_hash</w:t>
-            </w:r>
-          </w:p>
-        </w:tc>
-        <w:tc>
-          <w:tcPr>
-            <w:tcW w:w="1800" w:type="dxa"/>
-          </w:tcPr>
-          <w:p>
-            <w:pPr>
-              <w:spacing w:after="40" w:line="260" w:lineRule="auto"/>
-              <w:ind w:left="57" w:right="57"/>
-            </w:pPr>
-            <w:r>
-              <w:rPr>
-                <w:rFonts w:ascii="Consolas" w:eastAsia="Consolas" w:hAnsi="Consolas" w:cs="Consolas"/>
-                <w:sz w:val="21"/>
-                <w:szCs w:val="21"/>
-              </w:rPr>
-              <w:t>VARCHAR(255)</w:t>
-            </w:r>
-          </w:p>
-        </w:tc>
-        <w:tc>
-          <w:tcPr>
-            <w:tcW w:w="5226" w:type="dxa"/>
-          </w:tcPr>
-          <w:p>
-            <w:pPr>
-              <w:spacing w:after="40" w:line="260" w:lineRule="auto"/>
-              <w:ind w:left="57" w:right="57"/>
-            </w:pPr>
-            <w:r>
-              <w:rPr>
-                <w:sz w:val="21"/>
-                <w:szCs w:val="21"/>
-              </w:rPr>
-              <w:t>UNIQUE, NOT NULL</w:t>
-            </w:r>
-          </w:p>
-        </w:tc>
-      </w:tr>
-      <w:tr>
-        <w:tblPrEx>
-          <w:tblCellMar>
-            <w:top w:w="0" w:type="dxa"/>
-            <w:bottom w:w="0" w:type="dxa"/>
-          </w:tblCellMar>
-        </w:tblPrEx>
-        <w:tc>
-          <w:tcPr>
-            <w:tcW w:w="2000" w:type="dxa"/>
-          </w:tcPr>
-          <w:p>
-            <w:pPr>
-              <w:spacing w:after="40" w:line="260" w:lineRule="auto"/>
-              <w:ind w:left="57" w:right="57"/>
-            </w:pPr>
-            <w:r>
-              <w:rPr>
-                <w:rFonts w:ascii="Consolas" w:eastAsia="Consolas" w:hAnsi="Consolas" w:cs="Consolas"/>
-                <w:sz w:val="21"/>
-                <w:szCs w:val="21"/>
-              </w:rPr>
-              <w:t>expires_at</w:t>
-            </w:r>
-          </w:p>
-        </w:tc>
-        <w:tc>
-          <w:tcPr>
-            <w:tcW w:w="1800" w:type="dxa"/>
-          </w:tcPr>
-          <w:p>
-            <w:pPr>
-              <w:spacing w:after="40" w:line="260" w:lineRule="auto"/>
-              <w:ind w:left="57" w:right="57"/>
-            </w:pPr>
-            <w:r>
-              <w:rPr>
-                <w:rFonts w:ascii="Consolas" w:eastAsia="Consolas" w:hAnsi="Consolas" w:cs="Consolas"/>
-                <w:sz w:val="21"/>
-                <w:szCs w:val="21"/>
-              </w:rPr>
-              <w:t>TIMESTAMPTZ</w:t>
-            </w:r>
-          </w:p>
-        </w:tc>
-        <w:tc>
-          <w:tcPr>
-            <w:tcW w:w="5226" w:type="dxa"/>
-          </w:tcPr>
-          <w:p>
-            <w:pPr>
-              <w:spacing w:after="40" w:line="260" w:lineRule="auto"/>
-              <w:ind w:left="57" w:right="57"/>
-            </w:pPr>
-            <w:r>
-              <w:rPr>
-                <w:sz w:val="21"/>
-                <w:szCs w:val="21"/>
-              </w:rPr>
-              <w:t>NOT NULL</w:t>
-            </w:r>
-          </w:p>
-        </w:tc>
-      </w:tr>
-      <w:tr>
-        <w:tblPrEx>
-          <w:tblCellMar>
-            <w:top w:w="0" w:type="dxa"/>
-            <w:bottom w:w="0" w:type="dxa"/>
-          </w:tblCellMar>
-        </w:tblPrEx>
-        <w:tc>
-          <w:tcPr>
-            <w:tcW w:w="2000" w:type="dxa"/>
-          </w:tcPr>
-          <w:p>
-            <w:pPr>
-              <w:spacing w:after="40" w:line="260" w:lineRule="auto"/>
-              <w:ind w:left="57" w:right="57"/>
-            </w:pPr>
-            <w:r>
-              <w:rPr>
-                <w:rFonts w:ascii="Consolas" w:eastAsia="Consolas" w:hAnsi="Consolas" w:cs="Consolas"/>
-                <w:sz w:val="21"/>
-                <w:szCs w:val="21"/>
-              </w:rPr>
-              <w:t>verified_at</w:t>
-            </w:r>
-          </w:p>
-        </w:tc>
-        <w:tc>
-          <w:tcPr>
-            <w:tcW w:w="1800" w:type="dxa"/>
-          </w:tcPr>
-          <w:p>
-            <w:pPr>
-              <w:spacing w:after="40" w:line="260" w:lineRule="auto"/>
-              <w:ind w:left="57" w:right="57"/>
-            </w:pPr>
-            <w:r>
-              <w:rPr>
-                <w:rFonts w:ascii="Consolas" w:eastAsia="Consolas" w:hAnsi="Consolas" w:cs="Consolas"/>
-                <w:sz w:val="21"/>
-                <w:szCs w:val="21"/>
-              </w:rPr>
-              <w:t>TIMESTAMPTZ</w:t>
-            </w:r>
-          </w:p>
-        </w:tc>
-        <w:tc>
-          <w:tcPr>
-            <w:tcW w:w="5226" w:type="dxa"/>
-          </w:tcPr>
-          <w:p>
-            <w:pPr>
-              <w:spacing w:after="40" w:line="260" w:lineRule="auto"/>
-              <w:ind w:left="57" w:right="57"/>
-            </w:pPr>
-            <w:r>
-              <w:rPr>
-                <w:sz w:val="21"/>
-                <w:szCs w:val="21"/>
-              </w:rPr>
-              <w:t>NULL cho tới khi xác thực</w:t>
             </w:r>
           </w:p>
         </w:tc>
@@ -1935,12 +1384,6 @@
         <w:gridCol w:w="5226"/>
       </w:tblGrid>
       <w:tr>
-        <w:tblPrEx>
-          <w:tblCellMar>
-            <w:top w:w="0" w:type="dxa"/>
-            <w:bottom w:w="0" w:type="dxa"/>
-          </w:tblCellMar>
-        </w:tblPrEx>
         <w:trPr>
           <w:tblHeader/>
         </w:trPr>
@@ -1961,7 +1404,8 @@
                 <w:sz w:val="21"/>
                 <w:szCs w:val="21"/>
               </w:rPr>
-              <w:t xml:space="preserve">Trường</w:t>
+              <w:lastRenderedPageBreak/>
+              <w:t>Trường</w:t>
             </w:r>
           </w:p>
         </w:tc>
@@ -1982,7 +1426,7 @@
                 <w:sz w:val="21"/>
                 <w:szCs w:val="21"/>
               </w:rPr>
-              <w:t xml:space="preserve">Kiểu dữ liệu</w:t>
+              <w:t>Kiểu dữ liệu</w:t>
             </w:r>
           </w:p>
         </w:tc>
@@ -2003,519 +1447,471 @@
                 <w:sz w:val="21"/>
                 <w:szCs w:val="21"/>
               </w:rPr>
-              <w:t xml:space="preserve">Ghi chú</w:t>
-            </w:r>
-          </w:p>
-        </w:tc>
-      </w:tr>
-      <w:tr>
-        <w:tblPrEx>
-          <w:tblCellMar>
-            <w:top w:w="0" w:type="dxa"/>
-            <w:bottom w:w="0" w:type="dxa"/>
-          </w:tblCellMar>
-        </w:tblPrEx>
-        <w:tc>
-          <w:tcPr>
-            <w:tcW w:w="2000" w:type="dxa"/>
-          </w:tcPr>
-          <w:p>
-            <w:pPr>
-              <w:spacing w:after="40" w:line="260" w:lineRule="auto"/>
-              <w:ind w:left="57" w:right="57"/>
-            </w:pPr>
-            <w:r>
-              <w:rPr>
-                <w:rFonts w:ascii="Consolas" w:eastAsia="Consolas" w:hAnsi="Consolas" w:cs="Consolas"/>
-                <w:sz w:val="21"/>
-                <w:szCs w:val="21"/>
-              </w:rPr>
-              <w:t xml:space="preserve">id</w:t>
-            </w:r>
-          </w:p>
-        </w:tc>
-        <w:tc>
-          <w:tcPr>
-            <w:tcW w:w="1800" w:type="dxa"/>
-          </w:tcPr>
-          <w:p>
-            <w:pPr>
-              <w:spacing w:after="40" w:line="260" w:lineRule="auto"/>
-              <w:ind w:left="57" w:right="57"/>
-            </w:pPr>
-            <w:r>
-              <w:rPr>
-                <w:rFonts w:ascii="Consolas" w:eastAsia="Consolas" w:hAnsi="Consolas" w:cs="Consolas"/>
-                <w:sz w:val="21"/>
-                <w:szCs w:val="21"/>
-              </w:rPr>
-              <w:t xml:space="preserve">UUID</w:t>
-            </w:r>
-          </w:p>
-        </w:tc>
-        <w:tc>
-          <w:tcPr>
-            <w:tcW w:w="5226" w:type="dxa"/>
-          </w:tcPr>
-          <w:p>
-            <w:pPr>
-              <w:spacing w:after="40" w:line="260" w:lineRule="auto"/>
-              <w:ind w:left="57" w:right="57"/>
-            </w:pPr>
-            <w:r>
-              <w:rPr>
-                <w:sz w:val="21"/>
-                <w:szCs w:val="21"/>
-              </w:rPr>
-              <w:t xml:space="preserve">PK</w:t>
-            </w:r>
-          </w:p>
-        </w:tc>
-      </w:tr>
-      <w:tr>
-        <w:tblPrEx>
-          <w:tblCellMar>
-            <w:top w:w="0" w:type="dxa"/>
-            <w:bottom w:w="0" w:type="dxa"/>
-          </w:tblCellMar>
-        </w:tblPrEx>
-        <w:tc>
-          <w:tcPr>
-            <w:tcW w:w="2000" w:type="dxa"/>
-          </w:tcPr>
-          <w:p>
-            <w:pPr>
-              <w:spacing w:after="40" w:line="260" w:lineRule="auto"/>
-              <w:ind w:left="57" w:right="57"/>
-            </w:pPr>
-            <w:r>
-              <w:rPr>
-                <w:rFonts w:ascii="Consolas" w:eastAsia="Consolas" w:hAnsi="Consolas" w:cs="Consolas"/>
-                <w:sz w:val="21"/>
-                <w:szCs w:val="21"/>
-              </w:rPr>
-              <w:t xml:space="preserve">user_id</w:t>
-            </w:r>
-          </w:p>
-        </w:tc>
-        <w:tc>
-          <w:tcPr>
-            <w:tcW w:w="1800" w:type="dxa"/>
-          </w:tcPr>
-          <w:p>
-            <w:pPr>
-              <w:spacing w:after="40" w:line="260" w:lineRule="auto"/>
-              <w:ind w:left="57" w:right="57"/>
-            </w:pPr>
-            <w:r>
-              <w:rPr>
-                <w:rFonts w:ascii="Consolas" w:eastAsia="Consolas" w:hAnsi="Consolas" w:cs="Consolas"/>
-                <w:sz w:val="21"/>
-                <w:szCs w:val="21"/>
-              </w:rPr>
-              <w:t xml:space="preserve">UUID</w:t>
-            </w:r>
-          </w:p>
-        </w:tc>
-        <w:tc>
-          <w:tcPr>
-            <w:tcW w:w="5226" w:type="dxa"/>
-          </w:tcPr>
-          <w:p>
-            <w:pPr>
-              <w:spacing w:after="40" w:line="260" w:lineRule="auto"/>
-              <w:ind w:left="57" w:right="57"/>
-            </w:pPr>
-            <w:r>
-              <w:rPr>
-                <w:sz w:val="21"/>
-                <w:szCs w:val="21"/>
-              </w:rPr>
-              <w:t xml:space="preserve">FK -&gt; users.id</w:t>
-            </w:r>
-          </w:p>
-        </w:tc>
-      </w:tr>
-      <w:tr>
-        <w:tblPrEx>
-          <w:tblCellMar>
-            <w:top w:w="0" w:type="dxa"/>
-            <w:bottom w:w="0" w:type="dxa"/>
-          </w:tblCellMar>
-        </w:tblPrEx>
-        <w:tc>
-          <w:tcPr>
-            <w:tcW w:w="2000" w:type="dxa"/>
-          </w:tcPr>
-          <w:p>
-            <w:pPr>
-              <w:spacing w:after="40" w:line="260" w:lineRule="auto"/>
-              <w:ind w:left="57" w:right="57"/>
-            </w:pPr>
-            <w:r>
-              <w:rPr>
-                <w:rFonts w:ascii="Consolas" w:eastAsia="Consolas" w:hAnsi="Consolas" w:cs="Consolas"/>
-                <w:sz w:val="21"/>
-                <w:szCs w:val="21"/>
-              </w:rPr>
-              <w:t xml:space="preserve">token_hash</w:t>
-            </w:r>
-          </w:p>
-        </w:tc>
-        <w:tc>
-          <w:tcPr>
-            <w:tcW w:w="1800" w:type="dxa"/>
-          </w:tcPr>
-          <w:p>
-            <w:pPr>
-              <w:spacing w:after="40" w:line="260" w:lineRule="auto"/>
-              <w:ind w:left="57" w:right="57"/>
-            </w:pPr>
-            <w:r>
-              <w:rPr>
-                <w:rFonts w:ascii="Consolas" w:eastAsia="Consolas" w:hAnsi="Consolas" w:cs="Consolas"/>
-                <w:sz w:val="21"/>
-                <w:szCs w:val="21"/>
-              </w:rPr>
-              <w:t xml:space="preserve">VARCHAR(255)</w:t>
-            </w:r>
-          </w:p>
-        </w:tc>
-        <w:tc>
-          <w:tcPr>
-            <w:tcW w:w="5226" w:type="dxa"/>
-          </w:tcPr>
-          <w:p>
-            <w:pPr>
-              <w:spacing w:after="40" w:line="260" w:lineRule="auto"/>
-              <w:ind w:left="57" w:right="57"/>
-            </w:pPr>
-            <w:r>
-              <w:rPr>
-                <w:sz w:val="21"/>
-                <w:szCs w:val="21"/>
-              </w:rPr>
-              <w:t xml:space="preserve">UNIQUE, NOT NULL</w:t>
-            </w:r>
-          </w:p>
-        </w:tc>
-      </w:tr>
-      <w:tr>
-        <w:tblPrEx>
-          <w:tblCellMar>
-            <w:top w:w="0" w:type="dxa"/>
-            <w:bottom w:w="0" w:type="dxa"/>
-          </w:tblCellMar>
-        </w:tblPrEx>
-        <w:tc>
-          <w:tcPr>
-            <w:tcW w:w="2000" w:type="dxa"/>
-          </w:tcPr>
-          <w:p>
-            <w:pPr>
-              <w:spacing w:after="40" w:line="260" w:lineRule="auto"/>
-              <w:ind w:left="57" w:right="57"/>
-            </w:pPr>
-            <w:r>
-              <w:rPr>
-                <w:rFonts w:ascii="Consolas" w:eastAsia="Consolas" w:hAnsi="Consolas" w:cs="Consolas"/>
-                <w:sz w:val="21"/>
-                <w:szCs w:val="21"/>
-              </w:rPr>
-              <w:t xml:space="preserve">family_id</w:t>
-            </w:r>
-          </w:p>
-        </w:tc>
-        <w:tc>
-          <w:tcPr>
-            <w:tcW w:w="1800" w:type="dxa"/>
-          </w:tcPr>
-          <w:p>
-            <w:pPr>
-              <w:spacing w:after="40" w:line="260" w:lineRule="auto"/>
-              <w:ind w:left="57" w:right="57"/>
-            </w:pPr>
-            <w:r>
-              <w:rPr>
-                <w:rFonts w:ascii="Consolas" w:eastAsia="Consolas" w:hAnsi="Consolas" w:cs="Consolas"/>
-                <w:sz w:val="21"/>
-                <w:szCs w:val="21"/>
-              </w:rPr>
-              <w:t xml:space="preserve">UUID</w:t>
-            </w:r>
-          </w:p>
-        </w:tc>
-        <w:tc>
-          <w:tcPr>
-            <w:tcW w:w="5226" w:type="dxa"/>
-          </w:tcPr>
-          <w:p>
-            <w:pPr>
-              <w:spacing w:after="40" w:line="260" w:lineRule="auto"/>
-              <w:ind w:left="57" w:right="57"/>
-            </w:pPr>
-            <w:r>
-              <w:rPr>
-                <w:sz w:val="21"/>
-                <w:szCs w:val="21"/>
-              </w:rPr>
-              <w:t xml:space="preserve">NOT NULL — nhóm các token cùng một chuỗi rotation, dùng để thu hồi toàn bộ chain khi phát hiện tái sử dụng</w:t>
-            </w:r>
-          </w:p>
-        </w:tc>
-      </w:tr>
-      <w:tr>
-        <w:tblPrEx>
-          <w:tblCellMar>
-            <w:top w:w="0" w:type="dxa"/>
-            <w:bottom w:w="0" w:type="dxa"/>
-          </w:tblCellMar>
-        </w:tblPrEx>
-        <w:tc>
-          <w:tcPr>
-            <w:tcW w:w="2000" w:type="dxa"/>
-          </w:tcPr>
-          <w:p>
-            <w:pPr>
-              <w:spacing w:after="40" w:line="260" w:lineRule="auto"/>
-              <w:ind w:left="57" w:right="57"/>
-            </w:pPr>
-            <w:r>
-              <w:rPr>
-                <w:rFonts w:ascii="Consolas" w:eastAsia="Consolas" w:hAnsi="Consolas" w:cs="Consolas"/>
-                <w:sz w:val="21"/>
-                <w:szCs w:val="21"/>
-              </w:rPr>
-              <w:t xml:space="preserve">replaced_by_id</w:t>
-            </w:r>
-          </w:p>
-        </w:tc>
-        <w:tc>
-          <w:tcPr>
-            <w:tcW w:w="1800" w:type="dxa"/>
-          </w:tcPr>
-          <w:p>
-            <w:pPr>
-              <w:spacing w:after="40" w:line="260" w:lineRule="auto"/>
-              <w:ind w:left="57" w:right="57"/>
-            </w:pPr>
-            <w:r>
-              <w:rPr>
-                <w:rFonts w:ascii="Consolas" w:eastAsia="Consolas" w:hAnsi="Consolas" w:cs="Consolas"/>
-                <w:sz w:val="21"/>
-                <w:szCs w:val="21"/>
-              </w:rPr>
-              <w:t xml:space="preserve">UUID</w:t>
-            </w:r>
-          </w:p>
-        </w:tc>
-        <w:tc>
-          <w:tcPr>
-            <w:tcW w:w="5226" w:type="dxa"/>
-          </w:tcPr>
-          <w:p>
-            <w:pPr>
-              <w:spacing w:after="40" w:line="260" w:lineRule="auto"/>
-              <w:ind w:left="57" w:right="57"/>
-            </w:pPr>
-            <w:r>
-              <w:rPr>
-                <w:sz w:val="21"/>
-                <w:szCs w:val="21"/>
-              </w:rPr>
-              <w:t xml:space="preserve">FK -&gt; refresh_tokens.id, NULL cho tới khi bị rotate</w:t>
-            </w:r>
-          </w:p>
-        </w:tc>
-      </w:tr>
-      <w:tr>
-        <w:tblPrEx>
-          <w:tblCellMar>
-            <w:top w:w="0" w:type="dxa"/>
-            <w:bottom w:w="0" w:type="dxa"/>
-          </w:tblCellMar>
-        </w:tblPrEx>
-        <w:tc>
-          <w:tcPr>
-            <w:tcW w:w="2000" w:type="dxa"/>
-          </w:tcPr>
-          <w:p>
-            <w:pPr>
-              <w:spacing w:after="40" w:line="260" w:lineRule="auto"/>
-              <w:ind w:left="57" w:right="57"/>
-            </w:pPr>
-            <w:r>
-              <w:rPr>
-                <w:rFonts w:ascii="Consolas" w:eastAsia="Consolas" w:hAnsi="Consolas" w:cs="Consolas"/>
-                <w:sz w:val="21"/>
-                <w:szCs w:val="21"/>
-              </w:rPr>
-              <w:t xml:space="preserve">expires_at</w:t>
-            </w:r>
-          </w:p>
-        </w:tc>
-        <w:tc>
-          <w:tcPr>
-            <w:tcW w:w="1800" w:type="dxa"/>
-          </w:tcPr>
-          <w:p>
-            <w:pPr>
-              <w:spacing w:after="40" w:line="260" w:lineRule="auto"/>
-              <w:ind w:left="57" w:right="57"/>
-            </w:pPr>
-            <w:r>
-              <w:rPr>
-                <w:rFonts w:ascii="Consolas" w:eastAsia="Consolas" w:hAnsi="Consolas" w:cs="Consolas"/>
-                <w:sz w:val="21"/>
-                <w:szCs w:val="21"/>
-              </w:rPr>
-              <w:t xml:space="preserve">TIMESTAMPTZ</w:t>
-            </w:r>
-          </w:p>
-        </w:tc>
-        <w:tc>
-          <w:tcPr>
-            <w:tcW w:w="5226" w:type="dxa"/>
-          </w:tcPr>
-          <w:p>
-            <w:pPr>
-              <w:spacing w:after="40" w:line="260" w:lineRule="auto"/>
-              <w:ind w:left="57" w:right="57"/>
-            </w:pPr>
-            <w:r>
-              <w:rPr>
-                <w:sz w:val="21"/>
-                <w:szCs w:val="21"/>
-              </w:rPr>
-              <w:t xml:space="preserve">NOT NULL</w:t>
-            </w:r>
-          </w:p>
-        </w:tc>
-      </w:tr>
-      <w:tr>
-        <w:tblPrEx>
-          <w:tblCellMar>
-            <w:top w:w="0" w:type="dxa"/>
-            <w:bottom w:w="0" w:type="dxa"/>
-          </w:tblCellMar>
-        </w:tblPrEx>
-        <w:tc>
-          <w:tcPr>
-            <w:tcW w:w="2000" w:type="dxa"/>
-          </w:tcPr>
-          <w:p>
-            <w:pPr>
-              <w:spacing w:after="40" w:line="260" w:lineRule="auto"/>
-              <w:ind w:left="57" w:right="57"/>
-            </w:pPr>
-            <w:r>
-              <w:rPr>
-                <w:rFonts w:ascii="Consolas" w:eastAsia="Consolas" w:hAnsi="Consolas" w:cs="Consolas"/>
-                <w:sz w:val="21"/>
-                <w:szCs w:val="21"/>
-              </w:rPr>
-              <w:t xml:space="preserve">revoked_at</w:t>
-            </w:r>
-          </w:p>
-        </w:tc>
-        <w:tc>
-          <w:tcPr>
-            <w:tcW w:w="1800" w:type="dxa"/>
-          </w:tcPr>
-          <w:p>
-            <w:pPr>
-              <w:spacing w:after="40" w:line="260" w:lineRule="auto"/>
-              <w:ind w:left="57" w:right="57"/>
-            </w:pPr>
-            <w:r>
-              <w:rPr>
-                <w:rFonts w:ascii="Consolas" w:eastAsia="Consolas" w:hAnsi="Consolas" w:cs="Consolas"/>
-                <w:sz w:val="21"/>
-                <w:szCs w:val="21"/>
-              </w:rPr>
-              <w:t xml:space="preserve">TIMESTAMPTZ</w:t>
-            </w:r>
-          </w:p>
-        </w:tc>
-        <w:tc>
-          <w:tcPr>
-            <w:tcW w:w="5226" w:type="dxa"/>
-          </w:tcPr>
-          <w:p>
-            <w:pPr>
-              <w:spacing w:after="40" w:line="260" w:lineRule="auto"/>
-              <w:ind w:left="57" w:right="57"/>
-            </w:pPr>
-            <w:r>
-              <w:rPr>
-                <w:sz w:val="21"/>
-                <w:szCs w:val="21"/>
-              </w:rPr>
-              <w:t xml:space="preserve">NULL cho tới khi bị thu hồi (logout hoặc phát hiện tái sử dụng)</w:t>
-            </w:r>
-          </w:p>
-        </w:tc>
-      </w:tr>
-      <w:tr>
-        <w:tblPrEx>
-          <w:tblCellMar>
-            <w:top w:w="0" w:type="dxa"/>
-            <w:bottom w:w="0" w:type="dxa"/>
-          </w:tblCellMar>
-        </w:tblPrEx>
-        <w:tc>
-          <w:tcPr>
-            <w:tcW w:w="2000" w:type="dxa"/>
-          </w:tcPr>
-          <w:p>
-            <w:pPr>
-              <w:spacing w:after="40" w:line="260" w:lineRule="auto"/>
-              <w:ind w:left="57" w:right="57"/>
-            </w:pPr>
-            <w:r>
-              <w:rPr>
-                <w:rFonts w:ascii="Consolas" w:eastAsia="Consolas" w:hAnsi="Consolas" w:cs="Consolas"/>
-                <w:sz w:val="21"/>
-                <w:szCs w:val="21"/>
-              </w:rPr>
-              <w:t xml:space="preserve">created_at</w:t>
-            </w:r>
-          </w:p>
-        </w:tc>
-        <w:tc>
-          <w:tcPr>
-            <w:tcW w:w="1800" w:type="dxa"/>
-          </w:tcPr>
-          <w:p>
-            <w:pPr>
-              <w:spacing w:after="40" w:line="260" w:lineRule="auto"/>
-              <w:ind w:left="57" w:right="57"/>
-            </w:pPr>
-            <w:r>
-              <w:rPr>
-                <w:rFonts w:ascii="Consolas" w:eastAsia="Consolas" w:hAnsi="Consolas" w:cs="Consolas"/>
-                <w:sz w:val="21"/>
-                <w:szCs w:val="21"/>
-              </w:rPr>
-              <w:t xml:space="preserve">TIMESTAMPTZ</w:t>
-            </w:r>
-          </w:p>
-        </w:tc>
-        <w:tc>
-          <w:tcPr>
-            <w:tcW w:w="5226" w:type="dxa"/>
-          </w:tcPr>
-          <w:p>
-            <w:pPr>
-              <w:spacing w:after="40" w:line="260" w:lineRule="auto"/>
-              <w:ind w:left="57" w:right="57"/>
-            </w:pPr>
-            <w:r>
-              <w:rPr>
-                <w:sz w:val="21"/>
-                <w:szCs w:val="21"/>
-              </w:rPr>
-              <w:t xml:space="preserve">DEFAULT now()</w:t>
+              <w:t>Ghi chú</w:t>
+            </w:r>
+          </w:p>
+        </w:tc>
+      </w:tr>
+      <w:tr>
+        <w:tc>
+          <w:tcPr>
+            <w:tcW w:w="2000" w:type="dxa"/>
+          </w:tcPr>
+          <w:p>
+            <w:pPr>
+              <w:spacing w:after="40" w:line="260" w:lineRule="auto"/>
+              <w:ind w:left="57" w:right="57"/>
+            </w:pPr>
+            <w:r>
+              <w:rPr>
+                <w:rFonts w:ascii="Consolas" w:eastAsia="Consolas" w:hAnsi="Consolas" w:cs="Consolas"/>
+                <w:sz w:val="21"/>
+                <w:szCs w:val="21"/>
+              </w:rPr>
+              <w:t>id</w:t>
+            </w:r>
+          </w:p>
+        </w:tc>
+        <w:tc>
+          <w:tcPr>
+            <w:tcW w:w="1800" w:type="dxa"/>
+          </w:tcPr>
+          <w:p>
+            <w:pPr>
+              <w:spacing w:after="40" w:line="260" w:lineRule="auto"/>
+              <w:ind w:left="57" w:right="57"/>
+            </w:pPr>
+            <w:r>
+              <w:rPr>
+                <w:rFonts w:ascii="Consolas" w:eastAsia="Consolas" w:hAnsi="Consolas" w:cs="Consolas"/>
+                <w:sz w:val="21"/>
+                <w:szCs w:val="21"/>
+              </w:rPr>
+              <w:t>UUID</w:t>
+            </w:r>
+          </w:p>
+        </w:tc>
+        <w:tc>
+          <w:tcPr>
+            <w:tcW w:w="5226" w:type="dxa"/>
+          </w:tcPr>
+          <w:p>
+            <w:pPr>
+              <w:spacing w:after="40" w:line="260" w:lineRule="auto"/>
+              <w:ind w:left="57" w:right="57"/>
+            </w:pPr>
+            <w:r>
+              <w:rPr>
+                <w:sz w:val="21"/>
+                <w:szCs w:val="21"/>
+              </w:rPr>
+              <w:t>PK</w:t>
+            </w:r>
+          </w:p>
+        </w:tc>
+      </w:tr>
+      <w:tr>
+        <w:tc>
+          <w:tcPr>
+            <w:tcW w:w="2000" w:type="dxa"/>
+          </w:tcPr>
+          <w:p>
+            <w:pPr>
+              <w:spacing w:after="40" w:line="260" w:lineRule="auto"/>
+              <w:ind w:left="57" w:right="57"/>
+            </w:pPr>
+            <w:r>
+              <w:rPr>
+                <w:rFonts w:ascii="Consolas" w:eastAsia="Consolas" w:hAnsi="Consolas" w:cs="Consolas"/>
+                <w:sz w:val="21"/>
+                <w:szCs w:val="21"/>
+              </w:rPr>
+              <w:t>user_id</w:t>
+            </w:r>
+          </w:p>
+        </w:tc>
+        <w:tc>
+          <w:tcPr>
+            <w:tcW w:w="1800" w:type="dxa"/>
+          </w:tcPr>
+          <w:p>
+            <w:pPr>
+              <w:spacing w:after="40" w:line="260" w:lineRule="auto"/>
+              <w:ind w:left="57" w:right="57"/>
+            </w:pPr>
+            <w:r>
+              <w:rPr>
+                <w:rFonts w:ascii="Consolas" w:eastAsia="Consolas" w:hAnsi="Consolas" w:cs="Consolas"/>
+                <w:sz w:val="21"/>
+                <w:szCs w:val="21"/>
+              </w:rPr>
+              <w:t>UUID</w:t>
+            </w:r>
+          </w:p>
+        </w:tc>
+        <w:tc>
+          <w:tcPr>
+            <w:tcW w:w="5226" w:type="dxa"/>
+          </w:tcPr>
+          <w:p>
+            <w:pPr>
+              <w:spacing w:after="40" w:line="260" w:lineRule="auto"/>
+              <w:ind w:left="57" w:right="57"/>
+            </w:pPr>
+            <w:r>
+              <w:rPr>
+                <w:sz w:val="21"/>
+                <w:szCs w:val="21"/>
+              </w:rPr>
+              <w:t>FK -&gt; users.id</w:t>
+            </w:r>
+          </w:p>
+        </w:tc>
+      </w:tr>
+      <w:tr>
+        <w:tc>
+          <w:tcPr>
+            <w:tcW w:w="2000" w:type="dxa"/>
+          </w:tcPr>
+          <w:p>
+            <w:pPr>
+              <w:spacing w:after="40" w:line="260" w:lineRule="auto"/>
+              <w:ind w:left="57" w:right="57"/>
+            </w:pPr>
+            <w:r>
+              <w:rPr>
+                <w:rFonts w:ascii="Consolas" w:eastAsia="Consolas" w:hAnsi="Consolas" w:cs="Consolas"/>
+                <w:sz w:val="21"/>
+                <w:szCs w:val="21"/>
+              </w:rPr>
+              <w:t>token_hash</w:t>
+            </w:r>
+          </w:p>
+        </w:tc>
+        <w:tc>
+          <w:tcPr>
+            <w:tcW w:w="1800" w:type="dxa"/>
+          </w:tcPr>
+          <w:p>
+            <w:pPr>
+              <w:spacing w:after="40" w:line="260" w:lineRule="auto"/>
+              <w:ind w:left="57" w:right="57"/>
+            </w:pPr>
+            <w:r>
+              <w:rPr>
+                <w:rFonts w:ascii="Consolas" w:eastAsia="Consolas" w:hAnsi="Consolas" w:cs="Consolas"/>
+                <w:sz w:val="21"/>
+                <w:szCs w:val="21"/>
+              </w:rPr>
+              <w:t>VARCHAR(255)</w:t>
+            </w:r>
+          </w:p>
+        </w:tc>
+        <w:tc>
+          <w:tcPr>
+            <w:tcW w:w="5226" w:type="dxa"/>
+          </w:tcPr>
+          <w:p>
+            <w:pPr>
+              <w:spacing w:after="40" w:line="260" w:lineRule="auto"/>
+              <w:ind w:left="57" w:right="57"/>
+            </w:pPr>
+            <w:r>
+              <w:rPr>
+                <w:sz w:val="21"/>
+                <w:szCs w:val="21"/>
+              </w:rPr>
+              <w:t>UNIQUE, NOT NULL</w:t>
+            </w:r>
+          </w:p>
+        </w:tc>
+      </w:tr>
+      <w:tr>
+        <w:tc>
+          <w:tcPr>
+            <w:tcW w:w="2000" w:type="dxa"/>
+          </w:tcPr>
+          <w:p>
+            <w:pPr>
+              <w:spacing w:after="40" w:line="260" w:lineRule="auto"/>
+              <w:ind w:left="57" w:right="57"/>
+            </w:pPr>
+            <w:r>
+              <w:rPr>
+                <w:rFonts w:ascii="Consolas" w:eastAsia="Consolas" w:hAnsi="Consolas" w:cs="Consolas"/>
+                <w:sz w:val="21"/>
+                <w:szCs w:val="21"/>
+              </w:rPr>
+              <w:t>family_id</w:t>
+            </w:r>
+          </w:p>
+        </w:tc>
+        <w:tc>
+          <w:tcPr>
+            <w:tcW w:w="1800" w:type="dxa"/>
+          </w:tcPr>
+          <w:p>
+            <w:pPr>
+              <w:spacing w:after="40" w:line="260" w:lineRule="auto"/>
+              <w:ind w:left="57" w:right="57"/>
+            </w:pPr>
+            <w:r>
+              <w:rPr>
+                <w:rFonts w:ascii="Consolas" w:eastAsia="Consolas" w:hAnsi="Consolas" w:cs="Consolas"/>
+                <w:sz w:val="21"/>
+                <w:szCs w:val="21"/>
+              </w:rPr>
+              <w:t>UUID</w:t>
+            </w:r>
+          </w:p>
+        </w:tc>
+        <w:tc>
+          <w:tcPr>
+            <w:tcW w:w="5226" w:type="dxa"/>
+          </w:tcPr>
+          <w:p>
+            <w:pPr>
+              <w:spacing w:after="40" w:line="260" w:lineRule="auto"/>
+              <w:ind w:left="57" w:right="57"/>
+            </w:pPr>
+            <w:r>
+              <w:rPr>
+                <w:sz w:val="21"/>
+                <w:szCs w:val="21"/>
+              </w:rPr>
+              <w:t>NOT NULL — nhóm các token cùng một chuỗi rotation, dùng để thu hồi toàn bộ chain khi phát hiện tái sử dụng</w:t>
+            </w:r>
+          </w:p>
+        </w:tc>
+      </w:tr>
+      <w:tr>
+        <w:tc>
+          <w:tcPr>
+            <w:tcW w:w="2000" w:type="dxa"/>
+          </w:tcPr>
+          <w:p>
+            <w:pPr>
+              <w:spacing w:after="40" w:line="260" w:lineRule="auto"/>
+              <w:ind w:left="57" w:right="57"/>
+            </w:pPr>
+            <w:r>
+              <w:rPr>
+                <w:rFonts w:ascii="Consolas" w:eastAsia="Consolas" w:hAnsi="Consolas" w:cs="Consolas"/>
+                <w:sz w:val="21"/>
+                <w:szCs w:val="21"/>
+              </w:rPr>
+              <w:t>replaced_by_id</w:t>
+            </w:r>
+          </w:p>
+        </w:tc>
+        <w:tc>
+          <w:tcPr>
+            <w:tcW w:w="1800" w:type="dxa"/>
+          </w:tcPr>
+          <w:p>
+            <w:pPr>
+              <w:spacing w:after="40" w:line="260" w:lineRule="auto"/>
+              <w:ind w:left="57" w:right="57"/>
+            </w:pPr>
+            <w:r>
+              <w:rPr>
+                <w:rFonts w:ascii="Consolas" w:eastAsia="Consolas" w:hAnsi="Consolas" w:cs="Consolas"/>
+                <w:sz w:val="21"/>
+                <w:szCs w:val="21"/>
+              </w:rPr>
+              <w:t>UUID</w:t>
+            </w:r>
+          </w:p>
+        </w:tc>
+        <w:tc>
+          <w:tcPr>
+            <w:tcW w:w="5226" w:type="dxa"/>
+          </w:tcPr>
+          <w:p>
+            <w:pPr>
+              <w:spacing w:after="40" w:line="260" w:lineRule="auto"/>
+              <w:ind w:left="57" w:right="57"/>
+            </w:pPr>
+            <w:r>
+              <w:rPr>
+                <w:sz w:val="21"/>
+                <w:szCs w:val="21"/>
+              </w:rPr>
+              <w:t>FK -&gt; refresh_tokens.id, NULL cho tới khi bị rotate</w:t>
+            </w:r>
+          </w:p>
+        </w:tc>
+      </w:tr>
+      <w:tr>
+        <w:tc>
+          <w:tcPr>
+            <w:tcW w:w="2000" w:type="dxa"/>
+          </w:tcPr>
+          <w:p>
+            <w:pPr>
+              <w:spacing w:after="40" w:line="260" w:lineRule="auto"/>
+              <w:ind w:left="57" w:right="57"/>
+            </w:pPr>
+            <w:r>
+              <w:rPr>
+                <w:rFonts w:ascii="Consolas" w:eastAsia="Consolas" w:hAnsi="Consolas" w:cs="Consolas"/>
+                <w:sz w:val="21"/>
+                <w:szCs w:val="21"/>
+              </w:rPr>
+              <w:t>expires_at</w:t>
+            </w:r>
+          </w:p>
+        </w:tc>
+        <w:tc>
+          <w:tcPr>
+            <w:tcW w:w="1800" w:type="dxa"/>
+          </w:tcPr>
+          <w:p>
+            <w:pPr>
+              <w:spacing w:after="40" w:line="260" w:lineRule="auto"/>
+              <w:ind w:left="57" w:right="57"/>
+            </w:pPr>
+            <w:r>
+              <w:rPr>
+                <w:rFonts w:ascii="Consolas" w:eastAsia="Consolas" w:hAnsi="Consolas" w:cs="Consolas"/>
+                <w:sz w:val="21"/>
+                <w:szCs w:val="21"/>
+              </w:rPr>
+              <w:t>TIMESTAMPTZ</w:t>
+            </w:r>
+          </w:p>
+        </w:tc>
+        <w:tc>
+          <w:tcPr>
+            <w:tcW w:w="5226" w:type="dxa"/>
+          </w:tcPr>
+          <w:p>
+            <w:pPr>
+              <w:spacing w:after="40" w:line="260" w:lineRule="auto"/>
+              <w:ind w:left="57" w:right="57"/>
+            </w:pPr>
+            <w:r>
+              <w:rPr>
+                <w:sz w:val="21"/>
+                <w:szCs w:val="21"/>
+              </w:rPr>
+              <w:t>NOT NULL</w:t>
+            </w:r>
+          </w:p>
+        </w:tc>
+      </w:tr>
+      <w:tr>
+        <w:tc>
+          <w:tcPr>
+            <w:tcW w:w="2000" w:type="dxa"/>
+          </w:tcPr>
+          <w:p>
+            <w:pPr>
+              <w:spacing w:after="40" w:line="260" w:lineRule="auto"/>
+              <w:ind w:left="57" w:right="57"/>
+            </w:pPr>
+            <w:r>
+              <w:rPr>
+                <w:rFonts w:ascii="Consolas" w:eastAsia="Consolas" w:hAnsi="Consolas" w:cs="Consolas"/>
+                <w:sz w:val="21"/>
+                <w:szCs w:val="21"/>
+              </w:rPr>
+              <w:t>revoked_at</w:t>
+            </w:r>
+          </w:p>
+        </w:tc>
+        <w:tc>
+          <w:tcPr>
+            <w:tcW w:w="1800" w:type="dxa"/>
+          </w:tcPr>
+          <w:p>
+            <w:pPr>
+              <w:spacing w:after="40" w:line="260" w:lineRule="auto"/>
+              <w:ind w:left="57" w:right="57"/>
+            </w:pPr>
+            <w:r>
+              <w:rPr>
+                <w:rFonts w:ascii="Consolas" w:eastAsia="Consolas" w:hAnsi="Consolas" w:cs="Consolas"/>
+                <w:sz w:val="21"/>
+                <w:szCs w:val="21"/>
+              </w:rPr>
+              <w:t>TIMESTAMPTZ</w:t>
+            </w:r>
+          </w:p>
+        </w:tc>
+        <w:tc>
+          <w:tcPr>
+            <w:tcW w:w="5226" w:type="dxa"/>
+          </w:tcPr>
+          <w:p>
+            <w:pPr>
+              <w:spacing w:after="40" w:line="260" w:lineRule="auto"/>
+              <w:ind w:left="57" w:right="57"/>
+            </w:pPr>
+            <w:r>
+              <w:rPr>
+                <w:sz w:val="21"/>
+                <w:szCs w:val="21"/>
+              </w:rPr>
+              <w:t>NULL cho tới khi bị thu hồi (logout hoặc phát hiện tái sử dụng)</w:t>
+            </w:r>
+          </w:p>
+        </w:tc>
+      </w:tr>
+      <w:tr>
+        <w:tc>
+          <w:tcPr>
+            <w:tcW w:w="2000" w:type="dxa"/>
+          </w:tcPr>
+          <w:p>
+            <w:pPr>
+              <w:spacing w:after="40" w:line="260" w:lineRule="auto"/>
+              <w:ind w:left="57" w:right="57"/>
+            </w:pPr>
+            <w:r>
+              <w:rPr>
+                <w:rFonts w:ascii="Consolas" w:eastAsia="Consolas" w:hAnsi="Consolas" w:cs="Consolas"/>
+                <w:sz w:val="21"/>
+                <w:szCs w:val="21"/>
+              </w:rPr>
+              <w:t>created_at</w:t>
+            </w:r>
+          </w:p>
+        </w:tc>
+        <w:tc>
+          <w:tcPr>
+            <w:tcW w:w="1800" w:type="dxa"/>
+          </w:tcPr>
+          <w:p>
+            <w:pPr>
+              <w:spacing w:after="40" w:line="260" w:lineRule="auto"/>
+              <w:ind w:left="57" w:right="57"/>
+            </w:pPr>
+            <w:r>
+              <w:rPr>
+                <w:rFonts w:ascii="Consolas" w:eastAsia="Consolas" w:hAnsi="Consolas" w:cs="Consolas"/>
+                <w:sz w:val="21"/>
+                <w:szCs w:val="21"/>
+              </w:rPr>
+              <w:t>TIMESTAMPTZ</w:t>
+            </w:r>
+          </w:p>
+        </w:tc>
+        <w:tc>
+          <w:tcPr>
+            <w:tcW w:w="5226" w:type="dxa"/>
+          </w:tcPr>
+          <w:p>
+            <w:pPr>
+              <w:spacing w:after="40" w:line="260" w:lineRule="auto"/>
+              <w:ind w:left="57" w:right="57"/>
+            </w:pPr>
+            <w:r>
+              <w:rPr>
+                <w:sz w:val="21"/>
+                <w:szCs w:val="21"/>
+              </w:rPr>
+              <w:t>DEFAULT now()</w:t>
             </w:r>
           </w:p>
         </w:tc>
@@ -2595,12 +1991,6 @@
         <w:gridCol w:w="5226"/>
       </w:tblGrid>
       <w:tr>
-        <w:tblPrEx>
-          <w:tblCellMar>
-            <w:top w:w="0" w:type="dxa"/>
-            <w:bottom w:w="0" w:type="dxa"/>
-          </w:tblCellMar>
-        </w:tblPrEx>
         <w:trPr>
           <w:tblHeader/>
         </w:trPr>
@@ -2669,12 +2059,6 @@
         </w:tc>
       </w:tr>
       <w:tr>
-        <w:tblPrEx>
-          <w:tblCellMar>
-            <w:top w:w="0" w:type="dxa"/>
-            <w:bottom w:w="0" w:type="dxa"/>
-          </w:tblCellMar>
-        </w:tblPrEx>
         <w:tc>
           <w:tcPr>
             <w:tcW w:w="2000" w:type="dxa"/>
@@ -2733,12 +2117,6 @@
         </w:tc>
       </w:tr>
       <w:tr>
-        <w:tblPrEx>
-          <w:tblCellMar>
-            <w:top w:w="0" w:type="dxa"/>
-            <w:bottom w:w="0" w:type="dxa"/>
-          </w:tblCellMar>
-        </w:tblPrEx>
         <w:tc>
           <w:tcPr>
             <w:tcW w:w="2000" w:type="dxa"/>
@@ -2797,12 +2175,6 @@
         </w:tc>
       </w:tr>
       <w:tr>
-        <w:tblPrEx>
-          <w:tblCellMar>
-            <w:top w:w="0" w:type="dxa"/>
-            <w:bottom w:w="0" w:type="dxa"/>
-          </w:tblCellMar>
-        </w:tblPrEx>
         <w:tc>
           <w:tcPr>
             <w:tcW w:w="2000" w:type="dxa"/>
@@ -2861,12 +2233,6 @@
         </w:tc>
       </w:tr>
       <w:tr>
-        <w:tblPrEx>
-          <w:tblCellMar>
-            <w:top w:w="0" w:type="dxa"/>
-            <w:bottom w:w="0" w:type="dxa"/>
-          </w:tblCellMar>
-        </w:tblPrEx>
         <w:tc>
           <w:tcPr>
             <w:tcW w:w="2000" w:type="dxa"/>
@@ -2925,12 +2291,6 @@
         </w:tc>
       </w:tr>
       <w:tr>
-        <w:tblPrEx>
-          <w:tblCellMar>
-            <w:top w:w="0" w:type="dxa"/>
-            <w:bottom w:w="0" w:type="dxa"/>
-          </w:tblCellMar>
-        </w:tblPrEx>
         <w:tc>
           <w:tcPr>
             <w:tcW w:w="2000" w:type="dxa"/>
@@ -2989,12 +2349,6 @@
         </w:tc>
       </w:tr>
       <w:tr>
-        <w:tblPrEx>
-          <w:tblCellMar>
-            <w:top w:w="0" w:type="dxa"/>
-            <w:bottom w:w="0" w:type="dxa"/>
-          </w:tblCellMar>
-        </w:tblPrEx>
         <w:tc>
           <w:tcPr>
             <w:tcW w:w="2000" w:type="dxa"/>
@@ -3053,12 +2407,6 @@
         </w:tc>
       </w:tr>
       <w:tr>
-        <w:tblPrEx>
-          <w:tblCellMar>
-            <w:top w:w="0" w:type="dxa"/>
-            <w:bottom w:w="0" w:type="dxa"/>
-          </w:tblCellMar>
-        </w:tblPrEx>
         <w:tc>
           <w:tcPr>
             <w:tcW w:w="2000" w:type="dxa"/>
@@ -3181,12 +2529,6 @@
         <w:gridCol w:w="2984"/>
       </w:tblGrid>
       <w:tr>
-        <w:tblPrEx>
-          <w:tblCellMar>
-            <w:top w:w="0" w:type="dxa"/>
-            <w:bottom w:w="0" w:type="dxa"/>
-          </w:tblCellMar>
-        </w:tblPrEx>
         <w:trPr>
           <w:tblHeader/>
         </w:trPr>
@@ -3255,12 +2597,6 @@
         </w:tc>
       </w:tr>
       <w:tr>
-        <w:tblPrEx>
-          <w:tblCellMar>
-            <w:top w:w="0" w:type="dxa"/>
-            <w:bottom w:w="0" w:type="dxa"/>
-          </w:tblCellMar>
-        </w:tblPrEx>
         <w:tc>
           <w:tcPr>
             <w:tcW w:w="2000" w:type="dxa"/>
@@ -3319,12 +2655,6 @@
         </w:tc>
       </w:tr>
       <w:tr>
-        <w:tblPrEx>
-          <w:tblCellMar>
-            <w:top w:w="0" w:type="dxa"/>
-            <w:bottom w:w="0" w:type="dxa"/>
-          </w:tblCellMar>
-        </w:tblPrEx>
         <w:tc>
           <w:tcPr>
             <w:tcW w:w="2000" w:type="dxa"/>
@@ -3383,12 +2713,6 @@
         </w:tc>
       </w:tr>
       <w:tr>
-        <w:tblPrEx>
-          <w:tblCellMar>
-            <w:top w:w="0" w:type="dxa"/>
-            <w:bottom w:w="0" w:type="dxa"/>
-          </w:tblCellMar>
-        </w:tblPrEx>
         <w:tc>
           <w:tcPr>
             <w:tcW w:w="2000" w:type="dxa"/>
@@ -3447,12 +2771,6 @@
         </w:tc>
       </w:tr>
       <w:tr>
-        <w:tblPrEx>
-          <w:tblCellMar>
-            <w:top w:w="0" w:type="dxa"/>
-            <w:bottom w:w="0" w:type="dxa"/>
-          </w:tblCellMar>
-        </w:tblPrEx>
         <w:tc>
           <w:tcPr>
             <w:tcW w:w="2000" w:type="dxa"/>
@@ -3511,12 +2829,6 @@
         </w:tc>
       </w:tr>
       <w:tr>
-        <w:tblPrEx>
-          <w:tblCellMar>
-            <w:top w:w="0" w:type="dxa"/>
-            <w:bottom w:w="0" w:type="dxa"/>
-          </w:tblCellMar>
-        </w:tblPrEx>
         <w:tc>
           <w:tcPr>
             <w:tcW w:w="2000" w:type="dxa"/>
@@ -3568,12 +2880,6 @@
         </w:tc>
       </w:tr>
       <w:tr>
-        <w:tblPrEx>
-          <w:tblCellMar>
-            <w:top w:w="0" w:type="dxa"/>
-            <w:bottom w:w="0" w:type="dxa"/>
-          </w:tblCellMar>
-        </w:tblPrEx>
         <w:tc>
           <w:tcPr>
             <w:tcW w:w="2000" w:type="dxa"/>
@@ -3632,12 +2938,6 @@
         </w:tc>
       </w:tr>
       <w:tr>
-        <w:tblPrEx>
-          <w:tblCellMar>
-            <w:top w:w="0" w:type="dxa"/>
-            <w:bottom w:w="0" w:type="dxa"/>
-          </w:tblCellMar>
-        </w:tblPrEx>
         <w:tc>
           <w:tcPr>
             <w:tcW w:w="2000" w:type="dxa"/>
@@ -3689,12 +2989,6 @@
         </w:tc>
       </w:tr>
       <w:tr>
-        <w:tblPrEx>
-          <w:tblCellMar>
-            <w:top w:w="0" w:type="dxa"/>
-            <w:bottom w:w="0" w:type="dxa"/>
-          </w:tblCellMar>
-        </w:tblPrEx>
         <w:tc>
           <w:tcPr>
             <w:tcW w:w="2000" w:type="dxa"/>
@@ -3746,12 +3040,6 @@
         </w:tc>
       </w:tr>
       <w:tr>
-        <w:tblPrEx>
-          <w:tblCellMar>
-            <w:top w:w="0" w:type="dxa"/>
-            <w:bottom w:w="0" w:type="dxa"/>
-          </w:tblCellMar>
-        </w:tblPrEx>
         <w:tc>
           <w:tcPr>
             <w:tcW w:w="2000" w:type="dxa"/>
@@ -3810,12 +3098,6 @@
         </w:tc>
       </w:tr>
       <w:tr>
-        <w:tblPrEx>
-          <w:tblCellMar>
-            <w:top w:w="0" w:type="dxa"/>
-            <w:bottom w:w="0" w:type="dxa"/>
-          </w:tblCellMar>
-        </w:tblPrEx>
         <w:tc>
           <w:tcPr>
             <w:tcW w:w="2000" w:type="dxa"/>
@@ -3874,12 +3156,6 @@
         </w:tc>
       </w:tr>
       <w:tr>
-        <w:tblPrEx>
-          <w:tblCellMar>
-            <w:top w:w="0" w:type="dxa"/>
-            <w:bottom w:w="0" w:type="dxa"/>
-          </w:tblCellMar>
-        </w:tblPrEx>
         <w:tc>
           <w:tcPr>
             <w:tcW w:w="2000" w:type="dxa"/>
@@ -3938,12 +3214,6 @@
         </w:tc>
       </w:tr>
       <w:tr>
-        <w:tblPrEx>
-          <w:tblCellMar>
-            <w:top w:w="0" w:type="dxa"/>
-            <w:bottom w:w="0" w:type="dxa"/>
-          </w:tblCellMar>
-        </w:tblPrEx>
         <w:tc>
           <w:tcPr>
             <w:tcW w:w="2000" w:type="dxa"/>
@@ -4002,12 +3272,6 @@
         </w:tc>
       </w:tr>
       <w:tr>
-        <w:tblPrEx>
-          <w:tblCellMar>
-            <w:top w:w="0" w:type="dxa"/>
-            <w:bottom w:w="0" w:type="dxa"/>
-          </w:tblCellMar>
-        </w:tblPrEx>
         <w:tc>
           <w:tcPr>
             <w:tcW w:w="2000" w:type="dxa"/>
@@ -4066,12 +3330,6 @@
         </w:tc>
       </w:tr>
       <w:tr>
-        <w:tblPrEx>
-          <w:tblCellMar>
-            <w:top w:w="0" w:type="dxa"/>
-            <w:bottom w:w="0" w:type="dxa"/>
-          </w:tblCellMar>
-        </w:tblPrEx>
         <w:tc>
           <w:tcPr>
             <w:tcW w:w="2000" w:type="dxa"/>
@@ -4178,12 +3436,6 @@
         <w:gridCol w:w="3250"/>
       </w:tblGrid>
       <w:tr>
-        <w:tblPrEx>
-          <w:tblCellMar>
-            <w:top w:w="0" w:type="dxa"/>
-            <w:bottom w:w="0" w:type="dxa"/>
-          </w:tblCellMar>
-        </w:tblPrEx>
         <w:trPr>
           <w:tblHeader/>
         </w:trPr>
@@ -4204,6 +3456,7 @@
                 <w:sz w:val="21"/>
                 <w:szCs w:val="21"/>
               </w:rPr>
+              <w:lastRenderedPageBreak/>
               <w:t>Trường</w:t>
             </w:r>
           </w:p>
@@ -4252,12 +3505,6 @@
         </w:tc>
       </w:tr>
       <w:tr>
-        <w:tblPrEx>
-          <w:tblCellMar>
-            <w:top w:w="0" w:type="dxa"/>
-            <w:bottom w:w="0" w:type="dxa"/>
-          </w:tblCellMar>
-        </w:tblPrEx>
         <w:tc>
           <w:tcPr>
             <w:tcW w:w="2000" w:type="dxa"/>
@@ -4316,12 +3563,6 @@
         </w:tc>
       </w:tr>
       <w:tr>
-        <w:tblPrEx>
-          <w:tblCellMar>
-            <w:top w:w="0" w:type="dxa"/>
-            <w:bottom w:w="0" w:type="dxa"/>
-          </w:tblCellMar>
-        </w:tblPrEx>
         <w:tc>
           <w:tcPr>
             <w:tcW w:w="2000" w:type="dxa"/>
@@ -4380,12 +3621,6 @@
         </w:tc>
       </w:tr>
       <w:tr>
-        <w:tblPrEx>
-          <w:tblCellMar>
-            <w:top w:w="0" w:type="dxa"/>
-            <w:bottom w:w="0" w:type="dxa"/>
-          </w:tblCellMar>
-        </w:tblPrEx>
         <w:tc>
           <w:tcPr>
             <w:tcW w:w="2000" w:type="dxa"/>
@@ -4437,28 +3672,21 @@
         </w:tc>
       </w:tr>
       <w:tr>
-        <w:tblPrEx>
-          <w:tblCellMar>
-            <w:top w:w="0" w:type="dxa"/>
-            <w:bottom w:w="0" w:type="dxa"/>
-          </w:tblCellMar>
-        </w:tblPrEx>
-        <w:tc>
-          <w:tcPr>
-            <w:tcW w:w="2000" w:type="dxa"/>
-          </w:tcPr>
-          <w:p>
-            <w:pPr>
-              <w:spacing w:after="40" w:line="260" w:lineRule="auto"/>
-              <w:ind w:left="57" w:right="57"/>
-            </w:pPr>
-            <w:r>
-              <w:rPr>
-                <w:rFonts w:ascii="Consolas" w:eastAsia="Consolas" w:hAnsi="Consolas" w:cs="Consolas"/>
-                <w:sz w:val="21"/>
-                <w:szCs w:val="21"/>
-              </w:rPr>
-              <w:lastRenderedPageBreak/>
+        <w:tc>
+          <w:tcPr>
+            <w:tcW w:w="2000" w:type="dxa"/>
+          </w:tcPr>
+          <w:p>
+            <w:pPr>
+              <w:spacing w:after="40" w:line="260" w:lineRule="auto"/>
+              <w:ind w:left="57" w:right="57"/>
+            </w:pPr>
+            <w:r>
+              <w:rPr>
+                <w:rFonts w:ascii="Consolas" w:eastAsia="Consolas" w:hAnsi="Consolas" w:cs="Consolas"/>
+                <w:sz w:val="21"/>
+                <w:szCs w:val="21"/>
+              </w:rPr>
               <w:t>file_url</w:t>
             </w:r>
           </w:p>
@@ -4502,12 +3730,6 @@
         </w:tc>
       </w:tr>
       <w:tr>
-        <w:tblPrEx>
-          <w:tblCellMar>
-            <w:top w:w="0" w:type="dxa"/>
-            <w:bottom w:w="0" w:type="dxa"/>
-          </w:tblCellMar>
-        </w:tblPrEx>
         <w:tc>
           <w:tcPr>
             <w:tcW w:w="2000" w:type="dxa"/>
@@ -4566,12 +3788,6 @@
         </w:tc>
       </w:tr>
       <w:tr>
-        <w:tblPrEx>
-          <w:tblCellMar>
-            <w:top w:w="0" w:type="dxa"/>
-            <w:bottom w:w="0" w:type="dxa"/>
-          </w:tblCellMar>
-        </w:tblPrEx>
         <w:tc>
           <w:tcPr>
             <w:tcW w:w="2000" w:type="dxa"/>
@@ -4678,12 +3894,6 @@
         <w:gridCol w:w="5226"/>
       </w:tblGrid>
       <w:tr>
-        <w:tblPrEx>
-          <w:tblCellMar>
-            <w:top w:w="0" w:type="dxa"/>
-            <w:bottom w:w="0" w:type="dxa"/>
-          </w:tblCellMar>
-        </w:tblPrEx>
         <w:trPr>
           <w:tblHeader/>
         </w:trPr>
@@ -4752,12 +3962,6 @@
         </w:tc>
       </w:tr>
       <w:tr>
-        <w:tblPrEx>
-          <w:tblCellMar>
-            <w:top w:w="0" w:type="dxa"/>
-            <w:bottom w:w="0" w:type="dxa"/>
-          </w:tblCellMar>
-        </w:tblPrEx>
         <w:tc>
           <w:tcPr>
             <w:tcW w:w="2000" w:type="dxa"/>
@@ -4816,12 +4020,6 @@
         </w:tc>
       </w:tr>
       <w:tr>
-        <w:tblPrEx>
-          <w:tblCellMar>
-            <w:top w:w="0" w:type="dxa"/>
-            <w:bottom w:w="0" w:type="dxa"/>
-          </w:tblCellMar>
-        </w:tblPrEx>
         <w:tc>
           <w:tcPr>
             <w:tcW w:w="2000" w:type="dxa"/>
@@ -4880,12 +4078,6 @@
         </w:tc>
       </w:tr>
       <w:tr>
-        <w:tblPrEx>
-          <w:tblCellMar>
-            <w:top w:w="0" w:type="dxa"/>
-            <w:bottom w:w="0" w:type="dxa"/>
-          </w:tblCellMar>
-        </w:tblPrEx>
         <w:tc>
           <w:tcPr>
             <w:tcW w:w="2000" w:type="dxa"/>
@@ -4944,12 +4136,6 @@
         </w:tc>
       </w:tr>
       <w:tr>
-        <w:tblPrEx>
-          <w:tblCellMar>
-            <w:top w:w="0" w:type="dxa"/>
-            <w:bottom w:w="0" w:type="dxa"/>
-          </w:tblCellMar>
-        </w:tblPrEx>
         <w:tc>
           <w:tcPr>
             <w:tcW w:w="2000" w:type="dxa"/>
@@ -5008,12 +4194,6 @@
         </w:tc>
       </w:tr>
       <w:tr>
-        <w:tblPrEx>
-          <w:tblCellMar>
-            <w:top w:w="0" w:type="dxa"/>
-            <w:bottom w:w="0" w:type="dxa"/>
-          </w:tblCellMar>
-        </w:tblPrEx>
         <w:tc>
           <w:tcPr>
             <w:tcW w:w="2000" w:type="dxa"/>
@@ -5072,12 +4252,6 @@
         </w:tc>
       </w:tr>
       <w:tr>
-        <w:tblPrEx>
-          <w:tblCellMar>
-            <w:top w:w="0" w:type="dxa"/>
-            <w:bottom w:w="0" w:type="dxa"/>
-          </w:tblCellMar>
-        </w:tblPrEx>
         <w:tc>
           <w:tcPr>
             <w:tcW w:w="2000" w:type="dxa"/>
@@ -5129,12 +4303,6 @@
         </w:tc>
       </w:tr>
       <w:tr>
-        <w:tblPrEx>
-          <w:tblCellMar>
-            <w:top w:w="0" w:type="dxa"/>
-            <w:bottom w:w="0" w:type="dxa"/>
-          </w:tblCellMar>
-        </w:tblPrEx>
         <w:tc>
           <w:tcPr>
             <w:tcW w:w="2000" w:type="dxa"/>
@@ -5241,12 +4409,6 @@
         <w:gridCol w:w="3610"/>
       </w:tblGrid>
       <w:tr>
-        <w:tblPrEx>
-          <w:tblCellMar>
-            <w:top w:w="0" w:type="dxa"/>
-            <w:bottom w:w="0" w:type="dxa"/>
-          </w:tblCellMar>
-        </w:tblPrEx>
         <w:trPr>
           <w:tblHeader/>
         </w:trPr>
@@ -5315,12 +4477,6 @@
         </w:tc>
       </w:tr>
       <w:tr>
-        <w:tblPrEx>
-          <w:tblCellMar>
-            <w:top w:w="0" w:type="dxa"/>
-            <w:bottom w:w="0" w:type="dxa"/>
-          </w:tblCellMar>
-        </w:tblPrEx>
         <w:tc>
           <w:tcPr>
             <w:tcW w:w="1983" w:type="dxa"/>
@@ -5379,12 +4535,6 @@
         </w:tc>
       </w:tr>
       <w:tr>
-        <w:tblPrEx>
-          <w:tblCellMar>
-            <w:top w:w="0" w:type="dxa"/>
-            <w:bottom w:w="0" w:type="dxa"/>
-          </w:tblCellMar>
-        </w:tblPrEx>
         <w:tc>
           <w:tcPr>
             <w:tcW w:w="1983" w:type="dxa"/>
@@ -5443,12 +4593,6 @@
         </w:tc>
       </w:tr>
       <w:tr>
-        <w:tblPrEx>
-          <w:tblCellMar>
-            <w:top w:w="0" w:type="dxa"/>
-            <w:bottom w:w="0" w:type="dxa"/>
-          </w:tblCellMar>
-        </w:tblPrEx>
         <w:tc>
           <w:tcPr>
             <w:tcW w:w="1983" w:type="dxa"/>
@@ -5507,12 +4651,6 @@
         </w:tc>
       </w:tr>
       <w:tr>
-        <w:tblPrEx>
-          <w:tblCellMar>
-            <w:top w:w="0" w:type="dxa"/>
-            <w:bottom w:w="0" w:type="dxa"/>
-          </w:tblCellMar>
-        </w:tblPrEx>
         <w:tc>
           <w:tcPr>
             <w:tcW w:w="1983" w:type="dxa"/>
@@ -5571,12 +4709,6 @@
         </w:tc>
       </w:tr>
       <w:tr>
-        <w:tblPrEx>
-          <w:tblCellMar>
-            <w:top w:w="0" w:type="dxa"/>
-            <w:bottom w:w="0" w:type="dxa"/>
-          </w:tblCellMar>
-        </w:tblPrEx>
         <w:tc>
           <w:tcPr>
             <w:tcW w:w="1983" w:type="dxa"/>
@@ -5635,12 +4767,6 @@
         </w:tc>
       </w:tr>
       <w:tr>
-        <w:tblPrEx>
-          <w:tblCellMar>
-            <w:top w:w="0" w:type="dxa"/>
-            <w:bottom w:w="0" w:type="dxa"/>
-          </w:tblCellMar>
-        </w:tblPrEx>
         <w:tc>
           <w:tcPr>
             <w:tcW w:w="1983" w:type="dxa"/>
@@ -5692,12 +4818,6 @@
         </w:tc>
       </w:tr>
       <w:tr>
-        <w:tblPrEx>
-          <w:tblCellMar>
-            <w:top w:w="0" w:type="dxa"/>
-            <w:bottom w:w="0" w:type="dxa"/>
-          </w:tblCellMar>
-        </w:tblPrEx>
         <w:tc>
           <w:tcPr>
             <w:tcW w:w="1983" w:type="dxa"/>
@@ -5756,12 +4876,6 @@
         </w:tc>
       </w:tr>
       <w:tr>
-        <w:tblPrEx>
-          <w:tblCellMar>
-            <w:top w:w="0" w:type="dxa"/>
-            <w:bottom w:w="0" w:type="dxa"/>
-          </w:tblCellMar>
-        </w:tblPrEx>
         <w:tc>
           <w:tcPr>
             <w:tcW w:w="1983" w:type="dxa"/>
@@ -5813,12 +4927,6 @@
         </w:tc>
       </w:tr>
       <w:tr>
-        <w:tblPrEx>
-          <w:tblCellMar>
-            <w:top w:w="0" w:type="dxa"/>
-            <w:bottom w:w="0" w:type="dxa"/>
-          </w:tblCellMar>
-        </w:tblPrEx>
         <w:tc>
           <w:tcPr>
             <w:tcW w:w="1983" w:type="dxa"/>
@@ -5877,12 +4985,6 @@
         </w:tc>
       </w:tr>
       <w:tr>
-        <w:tblPrEx>
-          <w:tblCellMar>
-            <w:top w:w="0" w:type="dxa"/>
-            <w:bottom w:w="0" w:type="dxa"/>
-          </w:tblCellMar>
-        </w:tblPrEx>
         <w:tc>
           <w:tcPr>
             <w:tcW w:w="1983" w:type="dxa"/>
@@ -5934,12 +5036,6 @@
         </w:tc>
       </w:tr>
       <w:tr>
-        <w:tblPrEx>
-          <w:tblCellMar>
-            <w:top w:w="0" w:type="dxa"/>
-            <w:bottom w:w="0" w:type="dxa"/>
-          </w:tblCellMar>
-        </w:tblPrEx>
         <w:tc>
           <w:tcPr>
             <w:tcW w:w="1983" w:type="dxa"/>
@@ -5998,12 +5094,6 @@
         </w:tc>
       </w:tr>
       <w:tr>
-        <w:tblPrEx>
-          <w:tblCellMar>
-            <w:top w:w="0" w:type="dxa"/>
-            <w:bottom w:w="0" w:type="dxa"/>
-          </w:tblCellMar>
-        </w:tblPrEx>
         <w:tc>
           <w:tcPr>
             <w:tcW w:w="1983" w:type="dxa"/>
@@ -6088,12 +5178,6 @@
         </w:tc>
       </w:tr>
       <w:tr>
-        <w:tblPrEx>
-          <w:tblCellMar>
-            <w:top w:w="0" w:type="dxa"/>
-            <w:bottom w:w="0" w:type="dxa"/>
-          </w:tblCellMar>
-        </w:tblPrEx>
         <w:tc>
           <w:tcPr>
             <w:tcW w:w="1983" w:type="dxa"/>
@@ -6152,12 +5236,6 @@
         </w:tc>
       </w:tr>
       <w:tr>
-        <w:tblPrEx>
-          <w:tblCellMar>
-            <w:top w:w="0" w:type="dxa"/>
-            <w:bottom w:w="0" w:type="dxa"/>
-          </w:tblCellMar>
-        </w:tblPrEx>
         <w:tc>
           <w:tcPr>
             <w:tcW w:w="1983" w:type="dxa"/>
@@ -6216,12 +5294,6 @@
         </w:tc>
       </w:tr>
       <w:tr>
-        <w:tblPrEx>
-          <w:tblCellMar>
-            <w:top w:w="0" w:type="dxa"/>
-            <w:bottom w:w="0" w:type="dxa"/>
-          </w:tblCellMar>
-        </w:tblPrEx>
         <w:tc>
           <w:tcPr>
             <w:tcW w:w="1983" w:type="dxa"/>
@@ -6280,12 +5352,6 @@
         </w:tc>
       </w:tr>
       <w:tr>
-        <w:tblPrEx>
-          <w:tblCellMar>
-            <w:top w:w="0" w:type="dxa"/>
-            <w:bottom w:w="0" w:type="dxa"/>
-          </w:tblCellMar>
-        </w:tblPrEx>
         <w:tc>
           <w:tcPr>
             <w:tcW w:w="1983" w:type="dxa"/>
@@ -6344,12 +5410,6 @@
         </w:tc>
       </w:tr>
       <w:tr>
-        <w:tblPrEx>
-          <w:tblCellMar>
-            <w:top w:w="0" w:type="dxa"/>
-            <w:bottom w:w="0" w:type="dxa"/>
-          </w:tblCellMar>
-        </w:tblPrEx>
         <w:tc>
           <w:tcPr>
             <w:tcW w:w="1983" w:type="dxa"/>
@@ -6408,12 +5468,6 @@
         </w:tc>
       </w:tr>
       <w:tr>
-        <w:tblPrEx>
-          <w:tblCellMar>
-            <w:top w:w="0" w:type="dxa"/>
-            <w:bottom w:w="0" w:type="dxa"/>
-          </w:tblCellMar>
-        </w:tblPrEx>
         <w:tc>
           <w:tcPr>
             <w:tcW w:w="1983" w:type="dxa"/>
@@ -6429,6 +5483,7 @@
                 <w:sz w:val="21"/>
                 <w:szCs w:val="21"/>
               </w:rPr>
+              <w:lastRenderedPageBreak/>
               <w:t>created_at / updated_at</w:t>
             </w:r>
           </w:p>
@@ -6513,12 +5568,6 @@
         <w:gridCol w:w="5226"/>
       </w:tblGrid>
       <w:tr>
-        <w:tblPrEx>
-          <w:tblCellMar>
-            <w:top w:w="0" w:type="dxa"/>
-            <w:bottom w:w="0" w:type="dxa"/>
-          </w:tblCellMar>
-        </w:tblPrEx>
         <w:trPr>
           <w:tblHeader/>
         </w:trPr>
@@ -6539,7 +5588,6 @@
                 <w:sz w:val="21"/>
                 <w:szCs w:val="21"/>
               </w:rPr>
-              <w:lastRenderedPageBreak/>
               <w:t>Trường</w:t>
             </w:r>
           </w:p>
@@ -6588,12 +5636,6 @@
         </w:tc>
       </w:tr>
       <w:tr>
-        <w:tblPrEx>
-          <w:tblCellMar>
-            <w:top w:w="0" w:type="dxa"/>
-            <w:bottom w:w="0" w:type="dxa"/>
-          </w:tblCellMar>
-        </w:tblPrEx>
         <w:tc>
           <w:tcPr>
             <w:tcW w:w="2000" w:type="dxa"/>
@@ -6652,12 +5694,6 @@
         </w:tc>
       </w:tr>
       <w:tr>
-        <w:tblPrEx>
-          <w:tblCellMar>
-            <w:top w:w="0" w:type="dxa"/>
-            <w:bottom w:w="0" w:type="dxa"/>
-          </w:tblCellMar>
-        </w:tblPrEx>
         <w:tc>
           <w:tcPr>
             <w:tcW w:w="2000" w:type="dxa"/>
@@ -6716,12 +5752,6 @@
         </w:tc>
       </w:tr>
       <w:tr>
-        <w:tblPrEx>
-          <w:tblCellMar>
-            <w:top w:w="0" w:type="dxa"/>
-            <w:bottom w:w="0" w:type="dxa"/>
-          </w:tblCellMar>
-        </w:tblPrEx>
         <w:tc>
           <w:tcPr>
             <w:tcW w:w="2000" w:type="dxa"/>
@@ -6780,12 +5810,6 @@
         </w:tc>
       </w:tr>
       <w:tr>
-        <w:tblPrEx>
-          <w:tblCellMar>
-            <w:top w:w="0" w:type="dxa"/>
-            <w:bottom w:w="0" w:type="dxa"/>
-          </w:tblCellMar>
-        </w:tblPrEx>
         <w:tc>
           <w:tcPr>
             <w:tcW w:w="2000" w:type="dxa"/>
@@ -6892,12 +5916,6 @@
         <w:gridCol w:w="3553"/>
       </w:tblGrid>
       <w:tr>
-        <w:tblPrEx>
-          <w:tblCellMar>
-            <w:top w:w="0" w:type="dxa"/>
-            <w:bottom w:w="0" w:type="dxa"/>
-          </w:tblCellMar>
-        </w:tblPrEx>
         <w:trPr>
           <w:tblHeader/>
         </w:trPr>
@@ -6966,12 +5984,6 @@
         </w:tc>
       </w:tr>
       <w:tr>
-        <w:tblPrEx>
-          <w:tblCellMar>
-            <w:top w:w="0" w:type="dxa"/>
-            <w:bottom w:w="0" w:type="dxa"/>
-          </w:tblCellMar>
-        </w:tblPrEx>
         <w:tc>
           <w:tcPr>
             <w:tcW w:w="2000" w:type="dxa"/>
@@ -7030,12 +6042,6 @@
         </w:tc>
       </w:tr>
       <w:tr>
-        <w:tblPrEx>
-          <w:tblCellMar>
-            <w:top w:w="0" w:type="dxa"/>
-            <w:bottom w:w="0" w:type="dxa"/>
-          </w:tblCellMar>
-        </w:tblPrEx>
         <w:tc>
           <w:tcPr>
             <w:tcW w:w="2000" w:type="dxa"/>
@@ -7094,12 +6100,6 @@
         </w:tc>
       </w:tr>
       <w:tr>
-        <w:tblPrEx>
-          <w:tblCellMar>
-            <w:top w:w="0" w:type="dxa"/>
-            <w:bottom w:w="0" w:type="dxa"/>
-          </w:tblCellMar>
-        </w:tblPrEx>
         <w:tc>
           <w:tcPr>
             <w:tcW w:w="2000" w:type="dxa"/>
@@ -7158,12 +6158,6 @@
         </w:tc>
       </w:tr>
       <w:tr>
-        <w:tblPrEx>
-          <w:tblCellMar>
-            <w:top w:w="0" w:type="dxa"/>
-            <w:bottom w:w="0" w:type="dxa"/>
-          </w:tblCellMar>
-        </w:tblPrEx>
         <w:tc>
           <w:tcPr>
             <w:tcW w:w="2000" w:type="dxa"/>
@@ -7222,12 +6216,6 @@
         </w:tc>
       </w:tr>
       <w:tr>
-        <w:tblPrEx>
-          <w:tblCellMar>
-            <w:top w:w="0" w:type="dxa"/>
-            <w:bottom w:w="0" w:type="dxa"/>
-          </w:tblCellMar>
-        </w:tblPrEx>
         <w:tc>
           <w:tcPr>
             <w:tcW w:w="2000" w:type="dxa"/>
@@ -7327,12 +6315,6 @@
         <w:gridCol w:w="5226"/>
       </w:tblGrid>
       <w:tr>
-        <w:tblPrEx>
-          <w:tblCellMar>
-            <w:top w:w="0" w:type="dxa"/>
-            <w:bottom w:w="0" w:type="dxa"/>
-          </w:tblCellMar>
-        </w:tblPrEx>
         <w:trPr>
           <w:tblHeader/>
         </w:trPr>
@@ -7401,12 +6383,6 @@
         </w:tc>
       </w:tr>
       <w:tr>
-        <w:tblPrEx>
-          <w:tblCellMar>
-            <w:top w:w="0" w:type="dxa"/>
-            <w:bottom w:w="0" w:type="dxa"/>
-          </w:tblCellMar>
-        </w:tblPrEx>
         <w:tc>
           <w:tcPr>
             <w:tcW w:w="2000" w:type="dxa"/>
@@ -7465,12 +6441,6 @@
         </w:tc>
       </w:tr>
       <w:tr>
-        <w:tblPrEx>
-          <w:tblCellMar>
-            <w:top w:w="0" w:type="dxa"/>
-            <w:bottom w:w="0" w:type="dxa"/>
-          </w:tblCellMar>
-        </w:tblPrEx>
         <w:tc>
           <w:tcPr>
             <w:tcW w:w="2000" w:type="dxa"/>
@@ -7529,12 +6499,6 @@
         </w:tc>
       </w:tr>
       <w:tr>
-        <w:tblPrEx>
-          <w:tblCellMar>
-            <w:top w:w="0" w:type="dxa"/>
-            <w:bottom w:w="0" w:type="dxa"/>
-          </w:tblCellMar>
-        </w:tblPrEx>
         <w:tc>
           <w:tcPr>
             <w:tcW w:w="2000" w:type="dxa"/>
@@ -7593,12 +6557,6 @@
         </w:tc>
       </w:tr>
       <w:tr>
-        <w:tblPrEx>
-          <w:tblCellMar>
-            <w:top w:w="0" w:type="dxa"/>
-            <w:bottom w:w="0" w:type="dxa"/>
-          </w:tblCellMar>
-        </w:tblPrEx>
         <w:tc>
           <w:tcPr>
             <w:tcW w:w="2000" w:type="dxa"/>
@@ -7705,12 +6663,6 @@
         <w:gridCol w:w="5226"/>
       </w:tblGrid>
       <w:tr>
-        <w:tblPrEx>
-          <w:tblCellMar>
-            <w:top w:w="0" w:type="dxa"/>
-            <w:bottom w:w="0" w:type="dxa"/>
-          </w:tblCellMar>
-        </w:tblPrEx>
         <w:trPr>
           <w:tblHeader/>
         </w:trPr>
@@ -7779,12 +6731,6 @@
         </w:tc>
       </w:tr>
       <w:tr>
-        <w:tblPrEx>
-          <w:tblCellMar>
-            <w:top w:w="0" w:type="dxa"/>
-            <w:bottom w:w="0" w:type="dxa"/>
-          </w:tblCellMar>
-        </w:tblPrEx>
         <w:tc>
           <w:tcPr>
             <w:tcW w:w="2000" w:type="dxa"/>
@@ -7843,12 +6789,6 @@
         </w:tc>
       </w:tr>
       <w:tr>
-        <w:tblPrEx>
-          <w:tblCellMar>
-            <w:top w:w="0" w:type="dxa"/>
-            <w:bottom w:w="0" w:type="dxa"/>
-          </w:tblCellMar>
-        </w:tblPrEx>
         <w:tc>
           <w:tcPr>
             <w:tcW w:w="2000" w:type="dxa"/>
@@ -7907,12 +6847,6 @@
         </w:tc>
       </w:tr>
       <w:tr>
-        <w:tblPrEx>
-          <w:tblCellMar>
-            <w:top w:w="0" w:type="dxa"/>
-            <w:bottom w:w="0" w:type="dxa"/>
-          </w:tblCellMar>
-        </w:tblPrEx>
         <w:tc>
           <w:tcPr>
             <w:tcW w:w="2000" w:type="dxa"/>
@@ -7971,12 +6905,6 @@
         </w:tc>
       </w:tr>
       <w:tr>
-        <w:tblPrEx>
-          <w:tblCellMar>
-            <w:top w:w="0" w:type="dxa"/>
-            <w:bottom w:w="0" w:type="dxa"/>
-          </w:tblCellMar>
-        </w:tblPrEx>
         <w:tc>
           <w:tcPr>
             <w:tcW w:w="2000" w:type="dxa"/>
@@ -8035,12 +6963,6 @@
         </w:tc>
       </w:tr>
       <w:tr>
-        <w:tblPrEx>
-          <w:tblCellMar>
-            <w:top w:w="0" w:type="dxa"/>
-            <w:bottom w:w="0" w:type="dxa"/>
-          </w:tblCellMar>
-        </w:tblPrEx>
         <w:tc>
           <w:tcPr>
             <w:tcW w:w="2000" w:type="dxa"/>
@@ -8163,12 +7085,6 @@
         <w:gridCol w:w="4133"/>
       </w:tblGrid>
       <w:tr>
-        <w:tblPrEx>
-          <w:tblCellMar>
-            <w:top w:w="0" w:type="dxa"/>
-            <w:bottom w:w="0" w:type="dxa"/>
-          </w:tblCellMar>
-        </w:tblPrEx>
         <w:trPr>
           <w:tblHeader/>
         </w:trPr>
@@ -8237,12 +7153,6 @@
         </w:tc>
       </w:tr>
       <w:tr>
-        <w:tblPrEx>
-          <w:tblCellMar>
-            <w:top w:w="0" w:type="dxa"/>
-            <w:bottom w:w="0" w:type="dxa"/>
-          </w:tblCellMar>
-        </w:tblPrEx>
         <w:tc>
           <w:tcPr>
             <w:tcW w:w="2000" w:type="dxa"/>
@@ -8301,12 +7211,6 @@
         </w:tc>
       </w:tr>
       <w:tr>
-        <w:tblPrEx>
-          <w:tblCellMar>
-            <w:top w:w="0" w:type="dxa"/>
-            <w:bottom w:w="0" w:type="dxa"/>
-          </w:tblCellMar>
-        </w:tblPrEx>
         <w:tc>
           <w:tcPr>
             <w:tcW w:w="2000" w:type="dxa"/>
@@ -8365,12 +7269,6 @@
         </w:tc>
       </w:tr>
       <w:tr>
-        <w:tblPrEx>
-          <w:tblCellMar>
-            <w:top w:w="0" w:type="dxa"/>
-            <w:bottom w:w="0" w:type="dxa"/>
-          </w:tblCellMar>
-        </w:tblPrEx>
         <w:tc>
           <w:tcPr>
             <w:tcW w:w="2000" w:type="dxa"/>
@@ -8429,12 +7327,6 @@
         </w:tc>
       </w:tr>
       <w:tr>
-        <w:tblPrEx>
-          <w:tblCellMar>
-            <w:top w:w="0" w:type="dxa"/>
-            <w:bottom w:w="0" w:type="dxa"/>
-          </w:tblCellMar>
-        </w:tblPrEx>
         <w:tc>
           <w:tcPr>
             <w:tcW w:w="2000" w:type="dxa"/>
@@ -8493,27 +7385,22 @@
         </w:tc>
       </w:tr>
       <w:tr>
-        <w:tblPrEx>
-          <w:tblCellMar>
-            <w:top w:w="0" w:type="dxa"/>
-            <w:bottom w:w="0" w:type="dxa"/>
-          </w:tblCellMar>
-        </w:tblPrEx>
-        <w:tc>
-          <w:tcPr>
-            <w:tcW w:w="2000" w:type="dxa"/>
-          </w:tcPr>
-          <w:p>
-            <w:pPr>
-              <w:spacing w:after="40" w:line="260" w:lineRule="auto"/>
-              <w:ind w:left="57" w:right="57"/>
-            </w:pPr>
-            <w:r>
-              <w:rPr>
-                <w:rFonts w:ascii="Consolas" w:eastAsia="Consolas" w:hAnsi="Consolas" w:cs="Consolas"/>
-                <w:sz w:val="21"/>
-                <w:szCs w:val="21"/>
-              </w:rPr>
+        <w:tc>
+          <w:tcPr>
+            <w:tcW w:w="2000" w:type="dxa"/>
+          </w:tcPr>
+          <w:p>
+            <w:pPr>
+              <w:spacing w:after="40" w:line="260" w:lineRule="auto"/>
+              <w:ind w:left="57" w:right="57"/>
+            </w:pPr>
+            <w:r>
+              <w:rPr>
+                <w:rFonts w:ascii="Consolas" w:eastAsia="Consolas" w:hAnsi="Consolas" w:cs="Consolas"/>
+                <w:sz w:val="21"/>
+                <w:szCs w:val="21"/>
+              </w:rPr>
+              <w:lastRenderedPageBreak/>
               <w:t>capacity</w:t>
             </w:r>
           </w:p>
@@ -8557,12 +7444,6 @@
         </w:tc>
       </w:tr>
       <w:tr>
-        <w:tblPrEx>
-          <w:tblCellMar>
-            <w:top w:w="0" w:type="dxa"/>
-            <w:bottom w:w="0" w:type="dxa"/>
-          </w:tblCellMar>
-        </w:tblPrEx>
         <w:tc>
           <w:tcPr>
             <w:tcW w:w="2000" w:type="dxa"/>
@@ -8621,12 +7502,6 @@
         </w:tc>
       </w:tr>
       <w:tr>
-        <w:tblPrEx>
-          <w:tblCellMar>
-            <w:top w:w="0" w:type="dxa"/>
-            <w:bottom w:w="0" w:type="dxa"/>
-          </w:tblCellMar>
-        </w:tblPrEx>
         <w:tc>
           <w:tcPr>
             <w:tcW w:w="2000" w:type="dxa"/>
@@ -8703,7 +7578,6 @@
           <w:sz w:val="24"/>
           <w:szCs w:val="24"/>
         </w:rPr>
-        <w:lastRenderedPageBreak/>
         <w:t>Ghi chú kỹ thuật: khóa giữ chỗ (Inventory Locking)</w:t>
       </w:r>
     </w:p>
@@ -8790,12 +7664,6 @@
         <w:gridCol w:w="2288"/>
       </w:tblGrid>
       <w:tr>
-        <w:tblPrEx>
-          <w:tblCellMar>
-            <w:top w:w="0" w:type="dxa"/>
-            <w:bottom w:w="0" w:type="dxa"/>
-          </w:tblCellMar>
-        </w:tblPrEx>
         <w:trPr>
           <w:tblHeader/>
         </w:trPr>
@@ -8864,12 +7732,6 @@
         </w:tc>
       </w:tr>
       <w:tr>
-        <w:tblPrEx>
-          <w:tblCellMar>
-            <w:top w:w="0" w:type="dxa"/>
-            <w:bottom w:w="0" w:type="dxa"/>
-          </w:tblCellMar>
-        </w:tblPrEx>
         <w:tc>
           <w:tcPr>
             <w:tcW w:w="2000" w:type="dxa"/>
@@ -8928,12 +7790,6 @@
         </w:tc>
       </w:tr>
       <w:tr>
-        <w:tblPrEx>
-          <w:tblCellMar>
-            <w:top w:w="0" w:type="dxa"/>
-            <w:bottom w:w="0" w:type="dxa"/>
-          </w:tblCellMar>
-        </w:tblPrEx>
         <w:tc>
           <w:tcPr>
             <w:tcW w:w="2000" w:type="dxa"/>
@@ -8992,12 +7848,6 @@
         </w:tc>
       </w:tr>
       <w:tr>
-        <w:tblPrEx>
-          <w:tblCellMar>
-            <w:top w:w="0" w:type="dxa"/>
-            <w:bottom w:w="0" w:type="dxa"/>
-          </w:tblCellMar>
-        </w:tblPrEx>
         <w:tc>
           <w:tcPr>
             <w:tcW w:w="2000" w:type="dxa"/>
@@ -9069,12 +7919,6 @@
         </w:tc>
       </w:tr>
       <w:tr>
-        <w:tblPrEx>
-          <w:tblCellMar>
-            <w:top w:w="0" w:type="dxa"/>
-            <w:bottom w:w="0" w:type="dxa"/>
-          </w:tblCellMar>
-        </w:tblPrEx>
         <w:tc>
           <w:tcPr>
             <w:tcW w:w="2000" w:type="dxa"/>
@@ -9126,12 +7970,6 @@
         </w:tc>
       </w:tr>
       <w:tr>
-        <w:tblPrEx>
-          <w:tblCellMar>
-            <w:top w:w="0" w:type="dxa"/>
-            <w:bottom w:w="0" w:type="dxa"/>
-          </w:tblCellMar>
-        </w:tblPrEx>
         <w:tc>
           <w:tcPr>
             <w:tcW w:w="2000" w:type="dxa"/>
@@ -9190,12 +8028,6 @@
         </w:tc>
       </w:tr>
       <w:tr>
-        <w:tblPrEx>
-          <w:tblCellMar>
-            <w:top w:w="0" w:type="dxa"/>
-            <w:bottom w:w="0" w:type="dxa"/>
-          </w:tblCellMar>
-        </w:tblPrEx>
         <w:tc>
           <w:tcPr>
             <w:tcW w:w="2000" w:type="dxa"/>
@@ -9295,12 +8127,6 @@
         <w:gridCol w:w="2753"/>
       </w:tblGrid>
       <w:tr>
-        <w:tblPrEx>
-          <w:tblCellMar>
-            <w:top w:w="0" w:type="dxa"/>
-            <w:bottom w:w="0" w:type="dxa"/>
-          </w:tblCellMar>
-        </w:tblPrEx>
         <w:trPr>
           <w:tblHeader/>
         </w:trPr>
@@ -9369,12 +8195,6 @@
         </w:tc>
       </w:tr>
       <w:tr>
-        <w:tblPrEx>
-          <w:tblCellMar>
-            <w:top w:w="0" w:type="dxa"/>
-            <w:bottom w:w="0" w:type="dxa"/>
-          </w:tblCellMar>
-        </w:tblPrEx>
         <w:tc>
           <w:tcPr>
             <w:tcW w:w="2000" w:type="dxa"/>
@@ -9433,12 +8253,6 @@
         </w:tc>
       </w:tr>
       <w:tr>
-        <w:tblPrEx>
-          <w:tblCellMar>
-            <w:top w:w="0" w:type="dxa"/>
-            <w:bottom w:w="0" w:type="dxa"/>
-          </w:tblCellMar>
-        </w:tblPrEx>
         <w:tc>
           <w:tcPr>
             <w:tcW w:w="2000" w:type="dxa"/>
@@ -9497,12 +8311,6 @@
         </w:tc>
       </w:tr>
       <w:tr>
-        <w:tblPrEx>
-          <w:tblCellMar>
-            <w:top w:w="0" w:type="dxa"/>
-            <w:bottom w:w="0" w:type="dxa"/>
-          </w:tblCellMar>
-        </w:tblPrEx>
         <w:tc>
           <w:tcPr>
             <w:tcW w:w="2000" w:type="dxa"/>
@@ -9561,12 +8369,6 @@
         </w:tc>
       </w:tr>
       <w:tr>
-        <w:tblPrEx>
-          <w:tblCellMar>
-            <w:top w:w="0" w:type="dxa"/>
-            <w:bottom w:w="0" w:type="dxa"/>
-          </w:tblCellMar>
-        </w:tblPrEx>
         <w:tc>
           <w:tcPr>
             <w:tcW w:w="2000" w:type="dxa"/>
@@ -9625,12 +8427,6 @@
         </w:tc>
       </w:tr>
       <w:tr>
-        <w:tblPrEx>
-          <w:tblCellMar>
-            <w:top w:w="0" w:type="dxa"/>
-            <w:bottom w:w="0" w:type="dxa"/>
-          </w:tblCellMar>
-        </w:tblPrEx>
         <w:tc>
           <w:tcPr>
             <w:tcW w:w="2000" w:type="dxa"/>
@@ -9682,12 +8478,6 @@
         </w:tc>
       </w:tr>
       <w:tr>
-        <w:tblPrEx>
-          <w:tblCellMar>
-            <w:top w:w="0" w:type="dxa"/>
-            <w:bottom w:w="0" w:type="dxa"/>
-          </w:tblCellMar>
-        </w:tblPrEx>
         <w:tc>
           <w:tcPr>
             <w:tcW w:w="2000" w:type="dxa"/>
@@ -9746,12 +8536,6 @@
         </w:tc>
       </w:tr>
       <w:tr>
-        <w:tblPrEx>
-          <w:tblCellMar>
-            <w:top w:w="0" w:type="dxa"/>
-            <w:bottom w:w="0" w:type="dxa"/>
-          </w:tblCellMar>
-        </w:tblPrEx>
         <w:tc>
           <w:tcPr>
             <w:tcW w:w="2000" w:type="dxa"/>
@@ -9810,12 +8594,6 @@
         </w:tc>
       </w:tr>
       <w:tr>
-        <w:tblPrEx>
-          <w:tblCellMar>
-            <w:top w:w="0" w:type="dxa"/>
-            <w:bottom w:w="0" w:type="dxa"/>
-          </w:tblCellMar>
-        </w:tblPrEx>
         <w:tc>
           <w:tcPr>
             <w:tcW w:w="2000" w:type="dxa"/>
@@ -9887,12 +8665,6 @@
         </w:tc>
       </w:tr>
       <w:tr>
-        <w:tblPrEx>
-          <w:tblCellMar>
-            <w:top w:w="0" w:type="dxa"/>
-            <w:bottom w:w="0" w:type="dxa"/>
-          </w:tblCellMar>
-        </w:tblPrEx>
         <w:tc>
           <w:tcPr>
             <w:tcW w:w="2000" w:type="dxa"/>
@@ -9951,12 +8723,6 @@
         </w:tc>
       </w:tr>
       <w:tr>
-        <w:tblPrEx>
-          <w:tblCellMar>
-            <w:top w:w="0" w:type="dxa"/>
-            <w:bottom w:w="0" w:type="dxa"/>
-          </w:tblCellMar>
-        </w:tblPrEx>
         <w:tc>
           <w:tcPr>
             <w:tcW w:w="2000" w:type="dxa"/>
@@ -10015,27 +8781,22 @@
         </w:tc>
       </w:tr>
       <w:tr>
-        <w:tblPrEx>
-          <w:tblCellMar>
-            <w:top w:w="0" w:type="dxa"/>
-            <w:bottom w:w="0" w:type="dxa"/>
-          </w:tblCellMar>
-        </w:tblPrEx>
-        <w:tc>
-          <w:tcPr>
-            <w:tcW w:w="2000" w:type="dxa"/>
-          </w:tcPr>
-          <w:p>
-            <w:pPr>
-              <w:spacing w:after="40" w:line="260" w:lineRule="auto"/>
-              <w:ind w:left="57" w:right="57"/>
-            </w:pPr>
-            <w:r>
-              <w:rPr>
-                <w:rFonts w:ascii="Consolas" w:eastAsia="Consolas" w:hAnsi="Consolas" w:cs="Consolas"/>
-                <w:sz w:val="21"/>
-                <w:szCs w:val="21"/>
-              </w:rPr>
+        <w:tc>
+          <w:tcPr>
+            <w:tcW w:w="2000" w:type="dxa"/>
+          </w:tcPr>
+          <w:p>
+            <w:pPr>
+              <w:spacing w:after="40" w:line="260" w:lineRule="auto"/>
+              <w:ind w:left="57" w:right="57"/>
+            </w:pPr>
+            <w:r>
+              <w:rPr>
+                <w:rFonts w:ascii="Consolas" w:eastAsia="Consolas" w:hAnsi="Consolas" w:cs="Consolas"/>
+                <w:sz w:val="21"/>
+                <w:szCs w:val="21"/>
+              </w:rPr>
+              <w:lastRenderedPageBreak/>
               <w:t>checked_in_at</w:t>
             </w:r>
           </w:p>
@@ -10128,12 +8889,6 @@
         <w:gridCol w:w="2794"/>
       </w:tblGrid>
       <w:tr>
-        <w:tblPrEx>
-          <w:tblCellMar>
-            <w:top w:w="0" w:type="dxa"/>
-            <w:bottom w:w="0" w:type="dxa"/>
-          </w:tblCellMar>
-        </w:tblPrEx>
         <w:trPr>
           <w:tblHeader/>
         </w:trPr>
@@ -10202,12 +8957,6 @@
         </w:tc>
       </w:tr>
       <w:tr>
-        <w:tblPrEx>
-          <w:tblCellMar>
-            <w:top w:w="0" w:type="dxa"/>
-            <w:bottom w:w="0" w:type="dxa"/>
-          </w:tblCellMar>
-        </w:tblPrEx>
         <w:tc>
           <w:tcPr>
             <w:tcW w:w="2830" w:type="dxa"/>
@@ -10266,12 +9015,6 @@
         </w:tc>
       </w:tr>
       <w:tr>
-        <w:tblPrEx>
-          <w:tblCellMar>
-            <w:top w:w="0" w:type="dxa"/>
-            <w:bottom w:w="0" w:type="dxa"/>
-          </w:tblCellMar>
-        </w:tblPrEx>
         <w:tc>
           <w:tcPr>
             <w:tcW w:w="2830" w:type="dxa"/>
@@ -10287,7 +9030,6 @@
                 <w:sz w:val="21"/>
                 <w:szCs w:val="21"/>
               </w:rPr>
-              <w:lastRenderedPageBreak/>
               <w:t>master_order_id</w:t>
             </w:r>
           </w:p>
@@ -10331,12 +9073,6 @@
         </w:tc>
       </w:tr>
       <w:tr>
-        <w:tblPrEx>
-          <w:tblCellMar>
-            <w:top w:w="0" w:type="dxa"/>
-            <w:bottom w:w="0" w:type="dxa"/>
-          </w:tblCellMar>
-        </w:tblPrEx>
         <w:tc>
           <w:tcPr>
             <w:tcW w:w="2830" w:type="dxa"/>
@@ -10388,12 +9124,6 @@
         </w:tc>
       </w:tr>
       <w:tr>
-        <w:tblPrEx>
-          <w:tblCellMar>
-            <w:top w:w="0" w:type="dxa"/>
-            <w:bottom w:w="0" w:type="dxa"/>
-          </w:tblCellMar>
-        </w:tblPrEx>
         <w:tc>
           <w:tcPr>
             <w:tcW w:w="2830" w:type="dxa"/>
@@ -10452,12 +9182,6 @@
         </w:tc>
       </w:tr>
       <w:tr>
-        <w:tblPrEx>
-          <w:tblCellMar>
-            <w:top w:w="0" w:type="dxa"/>
-            <w:bottom w:w="0" w:type="dxa"/>
-          </w:tblCellMar>
-        </w:tblPrEx>
         <w:tc>
           <w:tcPr>
             <w:tcW w:w="2830" w:type="dxa"/>
@@ -10509,12 +9233,6 @@
         </w:tc>
       </w:tr>
       <w:tr>
-        <w:tblPrEx>
-          <w:tblCellMar>
-            <w:top w:w="0" w:type="dxa"/>
-            <w:bottom w:w="0" w:type="dxa"/>
-          </w:tblCellMar>
-        </w:tblPrEx>
         <w:tc>
           <w:tcPr>
             <w:tcW w:w="2830" w:type="dxa"/>
@@ -10586,12 +9304,6 @@
         </w:tc>
       </w:tr>
       <w:tr>
-        <w:tblPrEx>
-          <w:tblCellMar>
-            <w:top w:w="0" w:type="dxa"/>
-            <w:bottom w:w="0" w:type="dxa"/>
-          </w:tblCellMar>
-        </w:tblPrEx>
         <w:tc>
           <w:tcPr>
             <w:tcW w:w="2830" w:type="dxa"/>
@@ -10653,12 +9365,6 @@
         </w:tc>
       </w:tr>
       <w:tr>
-        <w:tblPrEx>
-          <w:tblCellMar>
-            <w:top w:w="0" w:type="dxa"/>
-            <w:bottom w:w="0" w:type="dxa"/>
-          </w:tblCellMar>
-        </w:tblPrEx>
         <w:tc>
           <w:tcPr>
             <w:tcW w:w="2830" w:type="dxa"/>
@@ -10758,12 +9464,6 @@
         <w:gridCol w:w="3331"/>
       </w:tblGrid>
       <w:tr>
-        <w:tblPrEx>
-          <w:tblCellMar>
-            <w:top w:w="0" w:type="dxa"/>
-            <w:bottom w:w="0" w:type="dxa"/>
-          </w:tblCellMar>
-        </w:tblPrEx>
         <w:trPr>
           <w:tblHeader/>
         </w:trPr>
@@ -10832,12 +9532,6 @@
         </w:tc>
       </w:tr>
       <w:tr>
-        <w:tblPrEx>
-          <w:tblCellMar>
-            <w:top w:w="0" w:type="dxa"/>
-            <w:bottom w:w="0" w:type="dxa"/>
-          </w:tblCellMar>
-        </w:tblPrEx>
         <w:tc>
           <w:tcPr>
             <w:tcW w:w="2000" w:type="dxa"/>
@@ -10896,12 +9590,6 @@
         </w:tc>
       </w:tr>
       <w:tr>
-        <w:tblPrEx>
-          <w:tblCellMar>
-            <w:top w:w="0" w:type="dxa"/>
-            <w:bottom w:w="0" w:type="dxa"/>
-          </w:tblCellMar>
-        </w:tblPrEx>
         <w:tc>
           <w:tcPr>
             <w:tcW w:w="2000" w:type="dxa"/>
@@ -10960,12 +9648,6 @@
         </w:tc>
       </w:tr>
       <w:tr>
-        <w:tblPrEx>
-          <w:tblCellMar>
-            <w:top w:w="0" w:type="dxa"/>
-            <w:bottom w:w="0" w:type="dxa"/>
-          </w:tblCellMar>
-        </w:tblPrEx>
         <w:tc>
           <w:tcPr>
             <w:tcW w:w="2000" w:type="dxa"/>
@@ -11017,12 +9699,6 @@
         </w:tc>
       </w:tr>
       <w:tr>
-        <w:tblPrEx>
-          <w:tblCellMar>
-            <w:top w:w="0" w:type="dxa"/>
-            <w:bottom w:w="0" w:type="dxa"/>
-          </w:tblCellMar>
-        </w:tblPrEx>
         <w:tc>
           <w:tcPr>
             <w:tcW w:w="2000" w:type="dxa"/>
@@ -11101,12 +9777,6 @@
         </w:tc>
       </w:tr>
       <w:tr>
-        <w:tblPrEx>
-          <w:tblCellMar>
-            <w:top w:w="0" w:type="dxa"/>
-            <w:bottom w:w="0" w:type="dxa"/>
-          </w:tblCellMar>
-        </w:tblPrEx>
         <w:tc>
           <w:tcPr>
             <w:tcW w:w="2000" w:type="dxa"/>
@@ -11158,12 +9828,6 @@
         </w:tc>
       </w:tr>
       <w:tr>
-        <w:tblPrEx>
-          <w:tblCellMar>
-            <w:top w:w="0" w:type="dxa"/>
-            <w:bottom w:w="0" w:type="dxa"/>
-          </w:tblCellMar>
-        </w:tblPrEx>
         <w:tc>
           <w:tcPr>
             <w:tcW w:w="2000" w:type="dxa"/>
@@ -11263,12 +9927,6 @@
         <w:gridCol w:w="5226"/>
       </w:tblGrid>
       <w:tr>
-        <w:tblPrEx>
-          <w:tblCellMar>
-            <w:top w:w="0" w:type="dxa"/>
-            <w:bottom w:w="0" w:type="dxa"/>
-          </w:tblCellMar>
-        </w:tblPrEx>
         <w:trPr>
           <w:tblHeader/>
         </w:trPr>
@@ -11337,12 +9995,6 @@
         </w:tc>
       </w:tr>
       <w:tr>
-        <w:tblPrEx>
-          <w:tblCellMar>
-            <w:top w:w="0" w:type="dxa"/>
-            <w:bottom w:w="0" w:type="dxa"/>
-          </w:tblCellMar>
-        </w:tblPrEx>
         <w:tc>
           <w:tcPr>
             <w:tcW w:w="2000" w:type="dxa"/>
@@ -11401,12 +10053,6 @@
         </w:tc>
       </w:tr>
       <w:tr>
-        <w:tblPrEx>
-          <w:tblCellMar>
-            <w:top w:w="0" w:type="dxa"/>
-            <w:bottom w:w="0" w:type="dxa"/>
-          </w:tblCellMar>
-        </w:tblPrEx>
         <w:tc>
           <w:tcPr>
             <w:tcW w:w="2000" w:type="dxa"/>
@@ -11465,12 +10111,6 @@
         </w:tc>
       </w:tr>
       <w:tr>
-        <w:tblPrEx>
-          <w:tblCellMar>
-            <w:top w:w="0" w:type="dxa"/>
-            <w:bottom w:w="0" w:type="dxa"/>
-          </w:tblCellMar>
-        </w:tblPrEx>
         <w:tc>
           <w:tcPr>
             <w:tcW w:w="2000" w:type="dxa"/>
@@ -11529,12 +10169,6 @@
         </w:tc>
       </w:tr>
       <w:tr>
-        <w:tblPrEx>
-          <w:tblCellMar>
-            <w:top w:w="0" w:type="dxa"/>
-            <w:bottom w:w="0" w:type="dxa"/>
-          </w:tblCellMar>
-        </w:tblPrEx>
         <w:tc>
           <w:tcPr>
             <w:tcW w:w="2000" w:type="dxa"/>
@@ -11586,12 +10220,6 @@
         </w:tc>
       </w:tr>
       <w:tr>
-        <w:tblPrEx>
-          <w:tblCellMar>
-            <w:top w:w="0" w:type="dxa"/>
-            <w:bottom w:w="0" w:type="dxa"/>
-          </w:tblCellMar>
-        </w:tblPrEx>
         <w:tc>
           <w:tcPr>
             <w:tcW w:w="2000" w:type="dxa"/>
@@ -11698,12 +10326,6 @@
         <w:gridCol w:w="4411"/>
       </w:tblGrid>
       <w:tr>
-        <w:tblPrEx>
-          <w:tblCellMar>
-            <w:top w:w="0" w:type="dxa"/>
-            <w:bottom w:w="0" w:type="dxa"/>
-          </w:tblCellMar>
-        </w:tblPrEx>
         <w:trPr>
           <w:tblHeader/>
         </w:trPr>
@@ -11772,12 +10394,6 @@
         </w:tc>
       </w:tr>
       <w:tr>
-        <w:tblPrEx>
-          <w:tblCellMar>
-            <w:top w:w="0" w:type="dxa"/>
-            <w:bottom w:w="0" w:type="dxa"/>
-          </w:tblCellMar>
-        </w:tblPrEx>
         <w:tc>
           <w:tcPr>
             <w:tcW w:w="2000" w:type="dxa"/>
@@ -11836,12 +10452,6 @@
         </w:tc>
       </w:tr>
       <w:tr>
-        <w:tblPrEx>
-          <w:tblCellMar>
-            <w:top w:w="0" w:type="dxa"/>
-            <w:bottom w:w="0" w:type="dxa"/>
-          </w:tblCellMar>
-        </w:tblPrEx>
         <w:tc>
           <w:tcPr>
             <w:tcW w:w="2000" w:type="dxa"/>
@@ -11900,12 +10510,6 @@
         </w:tc>
       </w:tr>
       <w:tr>
-        <w:tblPrEx>
-          <w:tblCellMar>
-            <w:top w:w="0" w:type="dxa"/>
-            <w:bottom w:w="0" w:type="dxa"/>
-          </w:tblCellMar>
-        </w:tblPrEx>
         <w:tc>
           <w:tcPr>
             <w:tcW w:w="2000" w:type="dxa"/>
@@ -11957,12 +10561,6 @@
         </w:tc>
       </w:tr>
       <w:tr>
-        <w:tblPrEx>
-          <w:tblCellMar>
-            <w:top w:w="0" w:type="dxa"/>
-            <w:bottom w:w="0" w:type="dxa"/>
-          </w:tblCellMar>
-        </w:tblPrEx>
         <w:tc>
           <w:tcPr>
             <w:tcW w:w="2000" w:type="dxa"/>
@@ -12021,12 +10619,6 @@
         </w:tc>
       </w:tr>
       <w:tr>
-        <w:tblPrEx>
-          <w:tblCellMar>
-            <w:top w:w="0" w:type="dxa"/>
-            <w:bottom w:w="0" w:type="dxa"/>
-          </w:tblCellMar>
-        </w:tblPrEx>
         <w:tc>
           <w:tcPr>
             <w:tcW w:w="2000" w:type="dxa"/>
@@ -12078,27 +10670,22 @@
         </w:tc>
       </w:tr>
       <w:tr>
-        <w:tblPrEx>
-          <w:tblCellMar>
-            <w:top w:w="0" w:type="dxa"/>
-            <w:bottom w:w="0" w:type="dxa"/>
-          </w:tblCellMar>
-        </w:tblPrEx>
-        <w:tc>
-          <w:tcPr>
-            <w:tcW w:w="2000" w:type="dxa"/>
-          </w:tcPr>
-          <w:p>
-            <w:pPr>
-              <w:spacing w:after="40" w:line="260" w:lineRule="auto"/>
-              <w:ind w:left="57" w:right="57"/>
-            </w:pPr>
-            <w:r>
-              <w:rPr>
-                <w:rFonts w:ascii="Consolas" w:eastAsia="Consolas" w:hAnsi="Consolas" w:cs="Consolas"/>
-                <w:sz w:val="21"/>
-                <w:szCs w:val="21"/>
-              </w:rPr>
+        <w:tc>
+          <w:tcPr>
+            <w:tcW w:w="2000" w:type="dxa"/>
+          </w:tcPr>
+          <w:p>
+            <w:pPr>
+              <w:spacing w:after="40" w:line="260" w:lineRule="auto"/>
+              <w:ind w:left="57" w:right="57"/>
+            </w:pPr>
+            <w:r>
+              <w:rPr>
+                <w:rFonts w:ascii="Consolas" w:eastAsia="Consolas" w:hAnsi="Consolas" w:cs="Consolas"/>
+                <w:sz w:val="21"/>
+                <w:szCs w:val="21"/>
+              </w:rPr>
+              <w:lastRenderedPageBreak/>
               <w:t>max_uses / used_count</w:t>
             </w:r>
           </w:p>
@@ -12135,12 +10722,6 @@
         </w:tc>
       </w:tr>
       <w:tr>
-        <w:tblPrEx>
-          <w:tblCellMar>
-            <w:top w:w="0" w:type="dxa"/>
-            <w:bottom w:w="0" w:type="dxa"/>
-          </w:tblCellMar>
-        </w:tblPrEx>
         <w:tc>
           <w:tcPr>
             <w:tcW w:w="2000" w:type="dxa"/>
@@ -12192,12 +10773,6 @@
         </w:tc>
       </w:tr>
       <w:tr>
-        <w:tblPrEx>
-          <w:tblCellMar>
-            <w:top w:w="0" w:type="dxa"/>
-            <w:bottom w:w="0" w:type="dxa"/>
-          </w:tblCellMar>
-        </w:tblPrEx>
         <w:tc>
           <w:tcPr>
             <w:tcW w:w="2000" w:type="dxa"/>
@@ -12304,12 +10879,6 @@
         <w:gridCol w:w="5226"/>
       </w:tblGrid>
       <w:tr>
-        <w:tblPrEx>
-          <w:tblCellMar>
-            <w:top w:w="0" w:type="dxa"/>
-            <w:bottom w:w="0" w:type="dxa"/>
-          </w:tblCellMar>
-        </w:tblPrEx>
         <w:trPr>
           <w:tblHeader/>
         </w:trPr>
@@ -12330,7 +10899,6 @@
                 <w:sz w:val="21"/>
                 <w:szCs w:val="21"/>
               </w:rPr>
-              <w:lastRenderedPageBreak/>
               <w:t>Trường</w:t>
             </w:r>
           </w:p>
@@ -12379,12 +10947,6 @@
         </w:tc>
       </w:tr>
       <w:tr>
-        <w:tblPrEx>
-          <w:tblCellMar>
-            <w:top w:w="0" w:type="dxa"/>
-            <w:bottom w:w="0" w:type="dxa"/>
-          </w:tblCellMar>
-        </w:tblPrEx>
         <w:tc>
           <w:tcPr>
             <w:tcW w:w="2000" w:type="dxa"/>
@@ -12443,12 +11005,6 @@
         </w:tc>
       </w:tr>
       <w:tr>
-        <w:tblPrEx>
-          <w:tblCellMar>
-            <w:top w:w="0" w:type="dxa"/>
-            <w:bottom w:w="0" w:type="dxa"/>
-          </w:tblCellMar>
-        </w:tblPrEx>
         <w:tc>
           <w:tcPr>
             <w:tcW w:w="2000" w:type="dxa"/>
@@ -12507,12 +11063,6 @@
         </w:tc>
       </w:tr>
       <w:tr>
-        <w:tblPrEx>
-          <w:tblCellMar>
-            <w:top w:w="0" w:type="dxa"/>
-            <w:bottom w:w="0" w:type="dxa"/>
-          </w:tblCellMar>
-        </w:tblPrEx>
         <w:tc>
           <w:tcPr>
             <w:tcW w:w="2000" w:type="dxa"/>
@@ -12571,12 +11121,6 @@
         </w:tc>
       </w:tr>
       <w:tr>
-        <w:tblPrEx>
-          <w:tblCellMar>
-            <w:top w:w="0" w:type="dxa"/>
-            <w:bottom w:w="0" w:type="dxa"/>
-          </w:tblCellMar>
-        </w:tblPrEx>
         <w:tc>
           <w:tcPr>
             <w:tcW w:w="2000" w:type="dxa"/>
@@ -12705,12 +11249,6 @@
         <w:gridCol w:w="4495"/>
       </w:tblGrid>
       <w:tr>
-        <w:tblPrEx>
-          <w:tblCellMar>
-            <w:top w:w="0" w:type="dxa"/>
-            <w:bottom w:w="0" w:type="dxa"/>
-          </w:tblCellMar>
-        </w:tblPrEx>
         <w:trPr>
           <w:tblHeader/>
         </w:trPr>
@@ -12779,12 +11317,6 @@
         </w:tc>
       </w:tr>
       <w:tr>
-        <w:tblPrEx>
-          <w:tblCellMar>
-            <w:top w:w="0" w:type="dxa"/>
-            <w:bottom w:w="0" w:type="dxa"/>
-          </w:tblCellMar>
-        </w:tblPrEx>
         <w:tc>
           <w:tcPr>
             <w:tcW w:w="2000" w:type="dxa"/>
@@ -12843,12 +11375,6 @@
         </w:tc>
       </w:tr>
       <w:tr>
-        <w:tblPrEx>
-          <w:tblCellMar>
-            <w:top w:w="0" w:type="dxa"/>
-            <w:bottom w:w="0" w:type="dxa"/>
-          </w:tblCellMar>
-        </w:tblPrEx>
         <w:tc>
           <w:tcPr>
             <w:tcW w:w="2000" w:type="dxa"/>
@@ -12907,12 +11433,6 @@
         </w:tc>
       </w:tr>
       <w:tr>
-        <w:tblPrEx>
-          <w:tblCellMar>
-            <w:top w:w="0" w:type="dxa"/>
-            <w:bottom w:w="0" w:type="dxa"/>
-          </w:tblCellMar>
-        </w:tblPrEx>
         <w:tc>
           <w:tcPr>
             <w:tcW w:w="2000" w:type="dxa"/>
@@ -12964,12 +11484,6 @@
         </w:tc>
       </w:tr>
       <w:tr>
-        <w:tblPrEx>
-          <w:tblCellMar>
-            <w:top w:w="0" w:type="dxa"/>
-            <w:bottom w:w="0" w:type="dxa"/>
-          </w:tblCellMar>
-        </w:tblPrEx>
         <w:tc>
           <w:tcPr>
             <w:tcW w:w="2000" w:type="dxa"/>
@@ -13021,12 +11535,6 @@
         </w:tc>
       </w:tr>
       <w:tr>
-        <w:tblPrEx>
-          <w:tblCellMar>
-            <w:top w:w="0" w:type="dxa"/>
-            <w:bottom w:w="0" w:type="dxa"/>
-          </w:tblCellMar>
-        </w:tblPrEx>
         <w:tc>
           <w:tcPr>
             <w:tcW w:w="2000" w:type="dxa"/>
@@ -13078,12 +11586,6 @@
         </w:tc>
       </w:tr>
       <w:tr>
-        <w:tblPrEx>
-          <w:tblCellMar>
-            <w:top w:w="0" w:type="dxa"/>
-            <w:bottom w:w="0" w:type="dxa"/>
-          </w:tblCellMar>
-        </w:tblPrEx>
         <w:tc>
           <w:tcPr>
             <w:tcW w:w="2000" w:type="dxa"/>
@@ -13183,12 +11685,6 @@
         <w:gridCol w:w="5226"/>
       </w:tblGrid>
       <w:tr>
-        <w:tblPrEx>
-          <w:tblCellMar>
-            <w:top w:w="0" w:type="dxa"/>
-            <w:bottom w:w="0" w:type="dxa"/>
-          </w:tblCellMar>
-        </w:tblPrEx>
         <w:trPr>
           <w:tblHeader/>
         </w:trPr>
@@ -13257,12 +11753,6 @@
         </w:tc>
       </w:tr>
       <w:tr>
-        <w:tblPrEx>
-          <w:tblCellMar>
-            <w:top w:w="0" w:type="dxa"/>
-            <w:bottom w:w="0" w:type="dxa"/>
-          </w:tblCellMar>
-        </w:tblPrEx>
         <w:tc>
           <w:tcPr>
             <w:tcW w:w="2000" w:type="dxa"/>
@@ -13321,12 +11811,6 @@
         </w:tc>
       </w:tr>
       <w:tr>
-        <w:tblPrEx>
-          <w:tblCellMar>
-            <w:top w:w="0" w:type="dxa"/>
-            <w:bottom w:w="0" w:type="dxa"/>
-          </w:tblCellMar>
-        </w:tblPrEx>
         <w:tc>
           <w:tcPr>
             <w:tcW w:w="2000" w:type="dxa"/>
@@ -13385,12 +11869,6 @@
         </w:tc>
       </w:tr>
       <w:tr>
-        <w:tblPrEx>
-          <w:tblCellMar>
-            <w:top w:w="0" w:type="dxa"/>
-            <w:bottom w:w="0" w:type="dxa"/>
-          </w:tblCellMar>
-        </w:tblPrEx>
         <w:tc>
           <w:tcPr>
             <w:tcW w:w="2000" w:type="dxa"/>
@@ -13442,12 +11920,6 @@
         </w:tc>
       </w:tr>
       <w:tr>
-        <w:tblPrEx>
-          <w:tblCellMar>
-            <w:top w:w="0" w:type="dxa"/>
-            <w:bottom w:w="0" w:type="dxa"/>
-          </w:tblCellMar>
-        </w:tblPrEx>
         <w:tc>
           <w:tcPr>
             <w:tcW w:w="2000" w:type="dxa"/>
@@ -13499,12 +11971,6 @@
         </w:tc>
       </w:tr>
       <w:tr>
-        <w:tblPrEx>
-          <w:tblCellMar>
-            <w:top w:w="0" w:type="dxa"/>
-            <w:bottom w:w="0" w:type="dxa"/>
-          </w:tblCellMar>
-        </w:tblPrEx>
         <w:tc>
           <w:tcPr>
             <w:tcW w:w="2000" w:type="dxa"/>
@@ -13620,12 +12086,6 @@
         <w:gridCol w:w="5226"/>
       </w:tblGrid>
       <w:tr>
-        <w:tblPrEx>
-          <w:tblCellMar>
-            <w:top w:w="0" w:type="dxa"/>
-            <w:bottom w:w="0" w:type="dxa"/>
-          </w:tblCellMar>
-        </w:tblPrEx>
         <w:trPr>
           <w:tblHeader/>
         </w:trPr>
@@ -13694,12 +12154,6 @@
         </w:tc>
       </w:tr>
       <w:tr>
-        <w:tblPrEx>
-          <w:tblCellMar>
-            <w:top w:w="0" w:type="dxa"/>
-            <w:bottom w:w="0" w:type="dxa"/>
-          </w:tblCellMar>
-        </w:tblPrEx>
         <w:tc>
           <w:tcPr>
             <w:tcW w:w="2000" w:type="dxa"/>
@@ -13758,12 +12212,6 @@
         </w:tc>
       </w:tr>
       <w:tr>
-        <w:tblPrEx>
-          <w:tblCellMar>
-            <w:top w:w="0" w:type="dxa"/>
-            <w:bottom w:w="0" w:type="dxa"/>
-          </w:tblCellMar>
-        </w:tblPrEx>
         <w:tc>
           <w:tcPr>
             <w:tcW w:w="2000" w:type="dxa"/>
@@ -13822,12 +12270,6 @@
         </w:tc>
       </w:tr>
       <w:tr>
-        <w:tblPrEx>
-          <w:tblCellMar>
-            <w:top w:w="0" w:type="dxa"/>
-            <w:bottom w:w="0" w:type="dxa"/>
-          </w:tblCellMar>
-        </w:tblPrEx>
         <w:tc>
           <w:tcPr>
             <w:tcW w:w="2000" w:type="dxa"/>
@@ -13892,6 +12334,7 @@
           <w:sz w:val="24"/>
           <w:szCs w:val="24"/>
         </w:rPr>
+        <w:lastRenderedPageBreak/>
         <w:t>ai_messages</w:t>
       </w:r>
       <w:r>
@@ -13927,12 +12370,6 @@
         <w:gridCol w:w="4050"/>
       </w:tblGrid>
       <w:tr>
-        <w:tblPrEx>
-          <w:tblCellMar>
-            <w:top w:w="0" w:type="dxa"/>
-            <w:bottom w:w="0" w:type="dxa"/>
-          </w:tblCellMar>
-        </w:tblPrEx>
         <w:trPr>
           <w:tblHeader/>
         </w:trPr>
@@ -14001,12 +12438,6 @@
         </w:tc>
       </w:tr>
       <w:tr>
-        <w:tblPrEx>
-          <w:tblCellMar>
-            <w:top w:w="0" w:type="dxa"/>
-            <w:bottom w:w="0" w:type="dxa"/>
-          </w:tblCellMar>
-        </w:tblPrEx>
         <w:tc>
           <w:tcPr>
             <w:tcW w:w="2000" w:type="dxa"/>
@@ -14065,12 +12496,6 @@
         </w:tc>
       </w:tr>
       <w:tr>
-        <w:tblPrEx>
-          <w:tblCellMar>
-            <w:top w:w="0" w:type="dxa"/>
-            <w:bottom w:w="0" w:type="dxa"/>
-          </w:tblCellMar>
-        </w:tblPrEx>
         <w:tc>
           <w:tcPr>
             <w:tcW w:w="2000" w:type="dxa"/>
@@ -14129,12 +12554,6 @@
         </w:tc>
       </w:tr>
       <w:tr>
-        <w:tblPrEx>
-          <w:tblCellMar>
-            <w:top w:w="0" w:type="dxa"/>
-            <w:bottom w:w="0" w:type="dxa"/>
-          </w:tblCellMar>
-        </w:tblPrEx>
         <w:tc>
           <w:tcPr>
             <w:tcW w:w="2000" w:type="dxa"/>
@@ -14186,12 +12605,6 @@
         </w:tc>
       </w:tr>
       <w:tr>
-        <w:tblPrEx>
-          <w:tblCellMar>
-            <w:top w:w="0" w:type="dxa"/>
-            <w:bottom w:w="0" w:type="dxa"/>
-          </w:tblCellMar>
-        </w:tblPrEx>
         <w:tc>
           <w:tcPr>
             <w:tcW w:w="2000" w:type="dxa"/>
@@ -14243,12 +12656,6 @@
         </w:tc>
       </w:tr>
       <w:tr>
-        <w:tblPrEx>
-          <w:tblCellMar>
-            <w:top w:w="0" w:type="dxa"/>
-            <w:bottom w:w="0" w:type="dxa"/>
-          </w:tblCellMar>
-        </w:tblPrEx>
         <w:tc>
           <w:tcPr>
             <w:tcW w:w="2000" w:type="dxa"/>
@@ -14307,12 +12714,6 @@
         </w:tc>
       </w:tr>
       <w:tr>
-        <w:tblPrEx>
-          <w:tblCellMar>
-            <w:top w:w="0" w:type="dxa"/>
-            <w:bottom w:w="0" w:type="dxa"/>
-          </w:tblCellMar>
-        </w:tblPrEx>
         <w:tc>
           <w:tcPr>
             <w:tcW w:w="2000" w:type="dxa"/>
@@ -14377,7 +12778,6 @@
           <w:sz w:val="28"/>
           <w:szCs w:val="28"/>
         </w:rPr>
-        <w:lastRenderedPageBreak/>
         <w:t>7. Vận hành, Đối soát &amp; Đánh giá (EPIC-07)</w:t>
       </w:r>
     </w:p>
@@ -14429,12 +12829,6 @@
         <w:gridCol w:w="5345"/>
       </w:tblGrid>
       <w:tr>
-        <w:tblPrEx>
-          <w:tblCellMar>
-            <w:top w:w="0" w:type="dxa"/>
-            <w:bottom w:w="0" w:type="dxa"/>
-          </w:tblCellMar>
-        </w:tblPrEx>
         <w:trPr>
           <w:tblHeader/>
         </w:trPr>
@@ -14503,12 +12897,6 @@
         </w:tc>
       </w:tr>
       <w:tr>
-        <w:tblPrEx>
-          <w:tblCellMar>
-            <w:top w:w="0" w:type="dxa"/>
-            <w:bottom w:w="0" w:type="dxa"/>
-          </w:tblCellMar>
-        </w:tblPrEx>
         <w:tc>
           <w:tcPr>
             <w:tcW w:w="2097" w:type="dxa"/>
@@ -14567,12 +12955,6 @@
         </w:tc>
       </w:tr>
       <w:tr>
-        <w:tblPrEx>
-          <w:tblCellMar>
-            <w:top w:w="0" w:type="dxa"/>
-            <w:bottom w:w="0" w:type="dxa"/>
-          </w:tblCellMar>
-        </w:tblPrEx>
         <w:tc>
           <w:tcPr>
             <w:tcW w:w="2097" w:type="dxa"/>
@@ -14631,12 +13013,6 @@
         </w:tc>
       </w:tr>
       <w:tr>
-        <w:tblPrEx>
-          <w:tblCellMar>
-            <w:top w:w="0" w:type="dxa"/>
-            <w:bottom w:w="0" w:type="dxa"/>
-          </w:tblCellMar>
-        </w:tblPrEx>
         <w:tc>
           <w:tcPr>
             <w:tcW w:w="2097" w:type="dxa"/>
@@ -14695,12 +13071,6 @@
         </w:tc>
       </w:tr>
       <w:tr>
-        <w:tblPrEx>
-          <w:tblCellMar>
-            <w:top w:w="0" w:type="dxa"/>
-            <w:bottom w:w="0" w:type="dxa"/>
-          </w:tblCellMar>
-        </w:tblPrEx>
         <w:tc>
           <w:tcPr>
             <w:tcW w:w="2097" w:type="dxa"/>
@@ -14759,12 +13129,6 @@
         </w:tc>
       </w:tr>
       <w:tr>
-        <w:tblPrEx>
-          <w:tblCellMar>
-            <w:top w:w="0" w:type="dxa"/>
-            <w:bottom w:w="0" w:type="dxa"/>
-          </w:tblCellMar>
-        </w:tblPrEx>
         <w:tc>
           <w:tcPr>
             <w:tcW w:w="2097" w:type="dxa"/>
@@ -14816,12 +13180,6 @@
         </w:tc>
       </w:tr>
       <w:tr>
-        <w:tblPrEx>
-          <w:tblCellMar>
-            <w:top w:w="0" w:type="dxa"/>
-            <w:bottom w:w="0" w:type="dxa"/>
-          </w:tblCellMar>
-        </w:tblPrEx>
         <w:tc>
           <w:tcPr>
             <w:tcW w:w="2097" w:type="dxa"/>
@@ -14880,12 +13238,6 @@
         </w:tc>
       </w:tr>
       <w:tr>
-        <w:tblPrEx>
-          <w:tblCellMar>
-            <w:top w:w="0" w:type="dxa"/>
-            <w:bottom w:w="0" w:type="dxa"/>
-          </w:tblCellMar>
-        </w:tblPrEx>
         <w:tc>
           <w:tcPr>
             <w:tcW w:w="2097" w:type="dxa"/>
@@ -14937,12 +13289,6 @@
         </w:tc>
       </w:tr>
       <w:tr>
-        <w:tblPrEx>
-          <w:tblCellMar>
-            <w:top w:w="0" w:type="dxa"/>
-            <w:bottom w:w="0" w:type="dxa"/>
-          </w:tblCellMar>
-        </w:tblPrEx>
         <w:tc>
           <w:tcPr>
             <w:tcW w:w="2097" w:type="dxa"/>
@@ -15049,12 +13395,6 @@
         <w:gridCol w:w="4524"/>
       </w:tblGrid>
       <w:tr>
-        <w:tblPrEx>
-          <w:tblCellMar>
-            <w:top w:w="0" w:type="dxa"/>
-            <w:bottom w:w="0" w:type="dxa"/>
-          </w:tblCellMar>
-        </w:tblPrEx>
         <w:trPr>
           <w:tblHeader/>
         </w:trPr>
@@ -15123,12 +13463,6 @@
         </w:tc>
       </w:tr>
       <w:tr>
-        <w:tblPrEx>
-          <w:tblCellMar>
-            <w:top w:w="0" w:type="dxa"/>
-            <w:bottom w:w="0" w:type="dxa"/>
-          </w:tblCellMar>
-        </w:tblPrEx>
         <w:tc>
           <w:tcPr>
             <w:tcW w:w="2099" w:type="dxa"/>
@@ -15187,12 +13521,6 @@
         </w:tc>
       </w:tr>
       <w:tr>
-        <w:tblPrEx>
-          <w:tblCellMar>
-            <w:top w:w="0" w:type="dxa"/>
-            <w:bottom w:w="0" w:type="dxa"/>
-          </w:tblCellMar>
-        </w:tblPrEx>
         <w:tc>
           <w:tcPr>
             <w:tcW w:w="2099" w:type="dxa"/>
@@ -15251,12 +13579,6 @@
         </w:tc>
       </w:tr>
       <w:tr>
-        <w:tblPrEx>
-          <w:tblCellMar>
-            <w:top w:w="0" w:type="dxa"/>
-            <w:bottom w:w="0" w:type="dxa"/>
-          </w:tblCellMar>
-        </w:tblPrEx>
         <w:tc>
           <w:tcPr>
             <w:tcW w:w="2099" w:type="dxa"/>
@@ -15308,12 +13630,6 @@
         </w:tc>
       </w:tr>
       <w:tr>
-        <w:tblPrEx>
-          <w:tblCellMar>
-            <w:top w:w="0" w:type="dxa"/>
-            <w:bottom w:w="0" w:type="dxa"/>
-          </w:tblCellMar>
-        </w:tblPrEx>
         <w:tc>
           <w:tcPr>
             <w:tcW w:w="2099" w:type="dxa"/>
@@ -15365,12 +13681,6 @@
         </w:tc>
       </w:tr>
       <w:tr>
-        <w:tblPrEx>
-          <w:tblCellMar>
-            <w:top w:w="0" w:type="dxa"/>
-            <w:bottom w:w="0" w:type="dxa"/>
-          </w:tblCellMar>
-        </w:tblPrEx>
         <w:tc>
           <w:tcPr>
             <w:tcW w:w="2099" w:type="dxa"/>
@@ -15422,12 +13732,6 @@
         </w:tc>
       </w:tr>
       <w:tr>
-        <w:tblPrEx>
-          <w:tblCellMar>
-            <w:top w:w="0" w:type="dxa"/>
-            <w:bottom w:w="0" w:type="dxa"/>
-          </w:tblCellMar>
-        </w:tblPrEx>
         <w:tc>
           <w:tcPr>
             <w:tcW w:w="2099" w:type="dxa"/>
@@ -15527,12 +13831,6 @@
         <w:gridCol w:w="5226"/>
       </w:tblGrid>
       <w:tr>
-        <w:tblPrEx>
-          <w:tblCellMar>
-            <w:top w:w="0" w:type="dxa"/>
-            <w:bottom w:w="0" w:type="dxa"/>
-          </w:tblCellMar>
-        </w:tblPrEx>
         <w:trPr>
           <w:tblHeader/>
         </w:trPr>
@@ -15601,12 +13899,6 @@
         </w:tc>
       </w:tr>
       <w:tr>
-        <w:tblPrEx>
-          <w:tblCellMar>
-            <w:top w:w="0" w:type="dxa"/>
-            <w:bottom w:w="0" w:type="dxa"/>
-          </w:tblCellMar>
-        </w:tblPrEx>
         <w:tc>
           <w:tcPr>
             <w:tcW w:w="2000" w:type="dxa"/>
@@ -15665,12 +13957,6 @@
         </w:tc>
       </w:tr>
       <w:tr>
-        <w:tblPrEx>
-          <w:tblCellMar>
-            <w:top w:w="0" w:type="dxa"/>
-            <w:bottom w:w="0" w:type="dxa"/>
-          </w:tblCellMar>
-        </w:tblPrEx>
         <w:tc>
           <w:tcPr>
             <w:tcW w:w="2000" w:type="dxa"/>
@@ -15729,12 +14015,6 @@
         </w:tc>
       </w:tr>
       <w:tr>
-        <w:tblPrEx>
-          <w:tblCellMar>
-            <w:top w:w="0" w:type="dxa"/>
-            <w:bottom w:w="0" w:type="dxa"/>
-          </w:tblCellMar>
-        </w:tblPrEx>
         <w:tc>
           <w:tcPr>
             <w:tcW w:w="2000" w:type="dxa"/>
@@ -15793,12 +14073,6 @@
         </w:tc>
       </w:tr>
       <w:tr>
-        <w:tblPrEx>
-          <w:tblCellMar>
-            <w:top w:w="0" w:type="dxa"/>
-            <w:bottom w:w="0" w:type="dxa"/>
-          </w:tblCellMar>
-        </w:tblPrEx>
         <w:tc>
           <w:tcPr>
             <w:tcW w:w="2000" w:type="dxa"/>
@@ -15898,12 +14172,6 @@
         <w:gridCol w:w="2738"/>
       </w:tblGrid>
       <w:tr>
-        <w:tblPrEx>
-          <w:tblCellMar>
-            <w:top w:w="0" w:type="dxa"/>
-            <w:bottom w:w="0" w:type="dxa"/>
-          </w:tblCellMar>
-        </w:tblPrEx>
         <w:trPr>
           <w:tblHeader/>
         </w:trPr>
@@ -15924,6 +14192,7 @@
                 <w:sz w:val="21"/>
                 <w:szCs w:val="21"/>
               </w:rPr>
+              <w:lastRenderedPageBreak/>
               <w:t>Trường</w:t>
             </w:r>
           </w:p>
@@ -15972,12 +14241,6 @@
         </w:tc>
       </w:tr>
       <w:tr>
-        <w:tblPrEx>
-          <w:tblCellMar>
-            <w:top w:w="0" w:type="dxa"/>
-            <w:bottom w:w="0" w:type="dxa"/>
-          </w:tblCellMar>
-        </w:tblPrEx>
         <w:tc>
           <w:tcPr>
             <w:tcW w:w="2000" w:type="dxa"/>
@@ -16036,12 +14299,6 @@
         </w:tc>
       </w:tr>
       <w:tr>
-        <w:tblPrEx>
-          <w:tblCellMar>
-            <w:top w:w="0" w:type="dxa"/>
-            <w:bottom w:w="0" w:type="dxa"/>
-          </w:tblCellMar>
-        </w:tblPrEx>
         <w:tc>
           <w:tcPr>
             <w:tcW w:w="2000" w:type="dxa"/>
@@ -16100,12 +14357,6 @@
         </w:tc>
       </w:tr>
       <w:tr>
-        <w:tblPrEx>
-          <w:tblCellMar>
-            <w:top w:w="0" w:type="dxa"/>
-            <w:bottom w:w="0" w:type="dxa"/>
-          </w:tblCellMar>
-        </w:tblPrEx>
         <w:tc>
           <w:tcPr>
             <w:tcW w:w="2000" w:type="dxa"/>
@@ -16164,12 +14415,6 @@
         </w:tc>
       </w:tr>
       <w:tr>
-        <w:tblPrEx>
-          <w:tblCellMar>
-            <w:top w:w="0" w:type="dxa"/>
-            <w:bottom w:w="0" w:type="dxa"/>
-          </w:tblCellMar>
-        </w:tblPrEx>
         <w:tc>
           <w:tcPr>
             <w:tcW w:w="2000" w:type="dxa"/>
@@ -16221,12 +14466,6 @@
         </w:tc>
       </w:tr>
       <w:tr>
-        <w:tblPrEx>
-          <w:tblCellMar>
-            <w:top w:w="0" w:type="dxa"/>
-            <w:bottom w:w="0" w:type="dxa"/>
-          </w:tblCellMar>
-        </w:tblPrEx>
         <w:tc>
           <w:tcPr>
             <w:tcW w:w="2000" w:type="dxa"/>
@@ -16278,12 +14517,6 @@
         </w:tc>
       </w:tr>
       <w:tr>
-        <w:tblPrEx>
-          <w:tblCellMar>
-            <w:top w:w="0" w:type="dxa"/>
-            <w:bottom w:w="0" w:type="dxa"/>
-          </w:tblCellMar>
-        </w:tblPrEx>
         <w:tc>
           <w:tcPr>
             <w:tcW w:w="2000" w:type="dxa"/>
@@ -16355,7 +14588,6 @@
           <w:sz w:val="28"/>
           <w:szCs w:val="28"/>
         </w:rPr>
-        <w:lastRenderedPageBreak/>
         <w:t>8. Cấu hình hệ thống (EPIC-08)</w:t>
       </w:r>
     </w:p>
@@ -16407,12 +14639,6 @@
         <w:gridCol w:w="5226"/>
       </w:tblGrid>
       <w:tr>
-        <w:tblPrEx>
-          <w:tblCellMar>
-            <w:top w:w="0" w:type="dxa"/>
-            <w:bottom w:w="0" w:type="dxa"/>
-          </w:tblCellMar>
-        </w:tblPrEx>
         <w:trPr>
           <w:tblHeader/>
         </w:trPr>
@@ -16481,12 +14707,6 @@
         </w:tc>
       </w:tr>
       <w:tr>
-        <w:tblPrEx>
-          <w:tblCellMar>
-            <w:top w:w="0" w:type="dxa"/>
-            <w:bottom w:w="0" w:type="dxa"/>
-          </w:tblCellMar>
-        </w:tblPrEx>
         <w:tc>
           <w:tcPr>
             <w:tcW w:w="2000" w:type="dxa"/>
@@ -16545,12 +14765,6 @@
         </w:tc>
       </w:tr>
       <w:tr>
-        <w:tblPrEx>
-          <w:tblCellMar>
-            <w:top w:w="0" w:type="dxa"/>
-            <w:bottom w:w="0" w:type="dxa"/>
-          </w:tblCellMar>
-        </w:tblPrEx>
         <w:tc>
           <w:tcPr>
             <w:tcW w:w="2000" w:type="dxa"/>
@@ -16609,12 +14823,6 @@
         </w:tc>
       </w:tr>
       <w:tr>
-        <w:tblPrEx>
-          <w:tblCellMar>
-            <w:top w:w="0" w:type="dxa"/>
-            <w:bottom w:w="0" w:type="dxa"/>
-          </w:tblCellMar>
-        </w:tblPrEx>
         <w:tc>
           <w:tcPr>
             <w:tcW w:w="2000" w:type="dxa"/>
@@ -16666,12 +14874,6 @@
         </w:tc>
       </w:tr>
       <w:tr>
-        <w:tblPrEx>
-          <w:tblCellMar>
-            <w:top w:w="0" w:type="dxa"/>
-            <w:bottom w:w="0" w:type="dxa"/>
-          </w:tblCellMar>
-        </w:tblPrEx>
         <w:tc>
           <w:tcPr>
             <w:tcW w:w="2000" w:type="dxa"/>
@@ -16723,12 +14925,6 @@
         </w:tc>
       </w:tr>
       <w:tr>
-        <w:tblPrEx>
-          <w:tblCellMar>
-            <w:top w:w="0" w:type="dxa"/>
-            <w:bottom w:w="0" w:type="dxa"/>
-          </w:tblCellMar>
-        </w:tblPrEx>
         <w:tc>
           <w:tcPr>
             <w:tcW w:w="2000" w:type="dxa"/>
@@ -16844,12 +15040,6 @@
         <w:gridCol w:w="2984"/>
       </w:tblGrid>
       <w:tr>
-        <w:tblPrEx>
-          <w:tblCellMar>
-            <w:top w:w="0" w:type="dxa"/>
-            <w:bottom w:w="0" w:type="dxa"/>
-          </w:tblCellMar>
-        </w:tblPrEx>
         <w:trPr>
           <w:tblHeader/>
         </w:trPr>
@@ -16918,12 +15108,6 @@
         </w:tc>
       </w:tr>
       <w:tr>
-        <w:tblPrEx>
-          <w:tblCellMar>
-            <w:top w:w="0" w:type="dxa"/>
-            <w:bottom w:w="0" w:type="dxa"/>
-          </w:tblCellMar>
-        </w:tblPrEx>
         <w:tc>
           <w:tcPr>
             <w:tcW w:w="2000" w:type="dxa"/>
@@ -16982,12 +15166,6 @@
         </w:tc>
       </w:tr>
       <w:tr>
-        <w:tblPrEx>
-          <w:tblCellMar>
-            <w:top w:w="0" w:type="dxa"/>
-            <w:bottom w:w="0" w:type="dxa"/>
-          </w:tblCellMar>
-        </w:tblPrEx>
         <w:tc>
           <w:tcPr>
             <w:tcW w:w="2000" w:type="dxa"/>
@@ -17046,12 +15224,6 @@
         </w:tc>
       </w:tr>
       <w:tr>
-        <w:tblPrEx>
-          <w:tblCellMar>
-            <w:top w:w="0" w:type="dxa"/>
-            <w:bottom w:w="0" w:type="dxa"/>
-          </w:tblCellMar>
-        </w:tblPrEx>
         <w:tc>
           <w:tcPr>
             <w:tcW w:w="2000" w:type="dxa"/>
@@ -17110,12 +15282,6 @@
         </w:tc>
       </w:tr>
       <w:tr>
-        <w:tblPrEx>
-          <w:tblCellMar>
-            <w:top w:w="0" w:type="dxa"/>
-            <w:bottom w:w="0" w:type="dxa"/>
-          </w:tblCellMar>
-        </w:tblPrEx>
         <w:tc>
           <w:tcPr>
             <w:tcW w:w="2000" w:type="dxa"/>
@@ -17167,12 +15333,6 @@
         </w:tc>
       </w:tr>
       <w:tr>
-        <w:tblPrEx>
-          <w:tblCellMar>
-            <w:top w:w="0" w:type="dxa"/>
-            <w:bottom w:w="0" w:type="dxa"/>
-          </w:tblCellMar>
-        </w:tblPrEx>
         <w:tc>
           <w:tcPr>
             <w:tcW w:w="2000" w:type="dxa"/>
@@ -17224,12 +15384,6 @@
         </w:tc>
       </w:tr>
       <w:tr>
-        <w:tblPrEx>
-          <w:tblCellMar>
-            <w:top w:w="0" w:type="dxa"/>
-            <w:bottom w:w="0" w:type="dxa"/>
-          </w:tblCellMar>
-        </w:tblPrEx>
         <w:tc>
           <w:tcPr>
             <w:tcW w:w="2000" w:type="dxa"/>
@@ -17281,12 +15435,6 @@
         </w:tc>
       </w:tr>
       <w:tr>
-        <w:tblPrEx>
-          <w:tblCellMar>
-            <w:top w:w="0" w:type="dxa"/>
-            <w:bottom w:w="0" w:type="dxa"/>
-          </w:tblCellMar>
-        </w:tblPrEx>
         <w:tc>
           <w:tcPr>
             <w:tcW w:w="2000" w:type="dxa"/>
@@ -17338,12 +15486,6 @@
         </w:tc>
       </w:tr>
       <w:tr>
-        <w:tblPrEx>
-          <w:tblCellMar>
-            <w:top w:w="0" w:type="dxa"/>
-            <w:bottom w:w="0" w:type="dxa"/>
-          </w:tblCellMar>
-        </w:tblPrEx>
         <w:tc>
           <w:tcPr>
             <w:tcW w:w="2000" w:type="dxa"/>
@@ -17443,12 +15585,6 @@
         <w:gridCol w:w="5226"/>
       </w:tblGrid>
       <w:tr>
-        <w:tblPrEx>
-          <w:tblCellMar>
-            <w:top w:w="0" w:type="dxa"/>
-            <w:bottom w:w="0" w:type="dxa"/>
-          </w:tblCellMar>
-        </w:tblPrEx>
         <w:trPr>
           <w:tblHeader/>
         </w:trPr>
@@ -17517,12 +15653,6 @@
         </w:tc>
       </w:tr>
       <w:tr>
-        <w:tblPrEx>
-          <w:tblCellMar>
-            <w:top w:w="0" w:type="dxa"/>
-            <w:bottom w:w="0" w:type="dxa"/>
-          </w:tblCellMar>
-        </w:tblPrEx>
         <w:tc>
           <w:tcPr>
             <w:tcW w:w="2000" w:type="dxa"/>
@@ -17581,12 +15711,6 @@
         </w:tc>
       </w:tr>
       <w:tr>
-        <w:tblPrEx>
-          <w:tblCellMar>
-            <w:top w:w="0" w:type="dxa"/>
-            <w:bottom w:w="0" w:type="dxa"/>
-          </w:tblCellMar>
-        </w:tblPrEx>
         <w:tc>
           <w:tcPr>
             <w:tcW w:w="2000" w:type="dxa"/>
@@ -17645,12 +15769,6 @@
         </w:tc>
       </w:tr>
       <w:tr>
-        <w:tblPrEx>
-          <w:tblCellMar>
-            <w:top w:w="0" w:type="dxa"/>
-            <w:bottom w:w="0" w:type="dxa"/>
-          </w:tblCellMar>
-        </w:tblPrEx>
         <w:tc>
           <w:tcPr>
             <w:tcW w:w="2000" w:type="dxa"/>
@@ -17709,12 +15827,6 @@
         </w:tc>
       </w:tr>
       <w:tr>
-        <w:tblPrEx>
-          <w:tblCellMar>
-            <w:top w:w="0" w:type="dxa"/>
-            <w:bottom w:w="0" w:type="dxa"/>
-          </w:tblCellMar>
-        </w:tblPrEx>
         <w:tc>
           <w:tcPr>
             <w:tcW w:w="2000" w:type="dxa"/>
@@ -17779,6 +15891,7 @@
           <w:sz w:val="24"/>
           <w:szCs w:val="24"/>
         </w:rPr>
+        <w:lastRenderedPageBreak/>
         <w:t>messages</w:t>
       </w:r>
       <w:r>
@@ -17814,12 +15927,6 @@
         <w:gridCol w:w="5226"/>
       </w:tblGrid>
       <w:tr>
-        <w:tblPrEx>
-          <w:tblCellMar>
-            <w:top w:w="0" w:type="dxa"/>
-            <w:bottom w:w="0" w:type="dxa"/>
-          </w:tblCellMar>
-        </w:tblPrEx>
         <w:trPr>
           <w:tblHeader/>
         </w:trPr>
@@ -17888,12 +15995,6 @@
         </w:tc>
       </w:tr>
       <w:tr>
-        <w:tblPrEx>
-          <w:tblCellMar>
-            <w:top w:w="0" w:type="dxa"/>
-            <w:bottom w:w="0" w:type="dxa"/>
-          </w:tblCellMar>
-        </w:tblPrEx>
         <w:tc>
           <w:tcPr>
             <w:tcW w:w="2000" w:type="dxa"/>
@@ -17952,12 +16053,6 @@
         </w:tc>
       </w:tr>
       <w:tr>
-        <w:tblPrEx>
-          <w:tblCellMar>
-            <w:top w:w="0" w:type="dxa"/>
-            <w:bottom w:w="0" w:type="dxa"/>
-          </w:tblCellMar>
-        </w:tblPrEx>
         <w:tc>
           <w:tcPr>
             <w:tcW w:w="2000" w:type="dxa"/>
@@ -18016,12 +16111,6 @@
         </w:tc>
       </w:tr>
       <w:tr>
-        <w:tblPrEx>
-          <w:tblCellMar>
-            <w:top w:w="0" w:type="dxa"/>
-            <w:bottom w:w="0" w:type="dxa"/>
-          </w:tblCellMar>
-        </w:tblPrEx>
         <w:tc>
           <w:tcPr>
             <w:tcW w:w="2000" w:type="dxa"/>
@@ -18080,12 +16169,6 @@
         </w:tc>
       </w:tr>
       <w:tr>
-        <w:tblPrEx>
-          <w:tblCellMar>
-            <w:top w:w="0" w:type="dxa"/>
-            <w:bottom w:w="0" w:type="dxa"/>
-          </w:tblCellMar>
-        </w:tblPrEx>
         <w:tc>
           <w:tcPr>
             <w:tcW w:w="2000" w:type="dxa"/>
@@ -18137,12 +16220,6 @@
         </w:tc>
       </w:tr>
       <w:tr>
-        <w:tblPrEx>
-          <w:tblCellMar>
-            <w:top w:w="0" w:type="dxa"/>
-            <w:bottom w:w="0" w:type="dxa"/>
-          </w:tblCellMar>
-        </w:tblPrEx>
         <w:tc>
           <w:tcPr>
             <w:tcW w:w="2000" w:type="dxa"/>
@@ -18194,12 +16271,6 @@
         </w:tc>
       </w:tr>
       <w:tr>
-        <w:tblPrEx>
-          <w:tblCellMar>
-            <w:top w:w="0" w:type="dxa"/>
-            <w:bottom w:w="0" w:type="dxa"/>
-          </w:tblCellMar>
-        </w:tblPrEx>
         <w:tc>
           <w:tcPr>
             <w:tcW w:w="2000" w:type="dxa"/>
@@ -18258,12 +16329,6 @@
         </w:tc>
       </w:tr>
       <w:tr>
-        <w:tblPrEx>
-          <w:tblCellMar>
-            <w:top w:w="0" w:type="dxa"/>
-            <w:bottom w:w="0" w:type="dxa"/>
-          </w:tblCellMar>
-        </w:tblPrEx>
         <w:tc>
           <w:tcPr>
             <w:tcW w:w="2000" w:type="dxa"/>
@@ -18328,7 +16393,6 @@
           <w:sz w:val="24"/>
           <w:szCs w:val="24"/>
         </w:rPr>
-        <w:lastRenderedPageBreak/>
         <w:t>disputes</w:t>
       </w:r>
       <w:r>
@@ -18364,12 +16428,6 @@
         <w:gridCol w:w="2593"/>
       </w:tblGrid>
       <w:tr>
-        <w:tblPrEx>
-          <w:tblCellMar>
-            <w:top w:w="0" w:type="dxa"/>
-            <w:bottom w:w="0" w:type="dxa"/>
-          </w:tblCellMar>
-        </w:tblPrEx>
         <w:trPr>
           <w:tblHeader/>
         </w:trPr>
@@ -18438,12 +16496,6 @@
         </w:tc>
       </w:tr>
       <w:tr>
-        <w:tblPrEx>
-          <w:tblCellMar>
-            <w:top w:w="0" w:type="dxa"/>
-            <w:bottom w:w="0" w:type="dxa"/>
-          </w:tblCellMar>
-        </w:tblPrEx>
         <w:tc>
           <w:tcPr>
             <w:tcW w:w="2000" w:type="dxa"/>
@@ -18502,12 +16554,6 @@
         </w:tc>
       </w:tr>
       <w:tr>
-        <w:tblPrEx>
-          <w:tblCellMar>
-            <w:top w:w="0" w:type="dxa"/>
-            <w:bottom w:w="0" w:type="dxa"/>
-          </w:tblCellMar>
-        </w:tblPrEx>
         <w:tc>
           <w:tcPr>
             <w:tcW w:w="2000" w:type="dxa"/>
@@ -18566,12 +16612,6 @@
         </w:tc>
       </w:tr>
       <w:tr>
-        <w:tblPrEx>
-          <w:tblCellMar>
-            <w:top w:w="0" w:type="dxa"/>
-            <w:bottom w:w="0" w:type="dxa"/>
-          </w:tblCellMar>
-        </w:tblPrEx>
         <w:tc>
           <w:tcPr>
             <w:tcW w:w="2000" w:type="dxa"/>
@@ -18630,12 +16670,6 @@
         </w:tc>
       </w:tr>
       <w:tr>
-        <w:tblPrEx>
-          <w:tblCellMar>
-            <w:top w:w="0" w:type="dxa"/>
-            <w:bottom w:w="0" w:type="dxa"/>
-          </w:tblCellMar>
-        </w:tblPrEx>
         <w:tc>
           <w:tcPr>
             <w:tcW w:w="2000" w:type="dxa"/>
@@ -18687,12 +16721,6 @@
         </w:tc>
       </w:tr>
       <w:tr>
-        <w:tblPrEx>
-          <w:tblCellMar>
-            <w:top w:w="0" w:type="dxa"/>
-            <w:bottom w:w="0" w:type="dxa"/>
-          </w:tblCellMar>
-        </w:tblPrEx>
         <w:tc>
           <w:tcPr>
             <w:tcW w:w="2000" w:type="dxa"/>
@@ -18744,12 +16772,6 @@
         </w:tc>
       </w:tr>
       <w:tr>
-        <w:tblPrEx>
-          <w:tblCellMar>
-            <w:top w:w="0" w:type="dxa"/>
-            <w:bottom w:w="0" w:type="dxa"/>
-          </w:tblCellMar>
-        </w:tblPrEx>
         <w:tc>
           <w:tcPr>
             <w:tcW w:w="2000" w:type="dxa"/>
@@ -18801,12 +16823,6 @@
         </w:tc>
       </w:tr>
       <w:tr>
-        <w:tblPrEx>
-          <w:tblCellMar>
-            <w:top w:w="0" w:type="dxa"/>
-            <w:bottom w:w="0" w:type="dxa"/>
-          </w:tblCellMar>
-        </w:tblPrEx>
         <w:tc>
           <w:tcPr>
             <w:tcW w:w="2000" w:type="dxa"/>
@@ -18913,12 +16929,6 @@
         <w:gridCol w:w="5226"/>
       </w:tblGrid>
       <w:tr>
-        <w:tblPrEx>
-          <w:tblCellMar>
-            <w:top w:w="0" w:type="dxa"/>
-            <w:bottom w:w="0" w:type="dxa"/>
-          </w:tblCellMar>
-        </w:tblPrEx>
         <w:trPr>
           <w:tblHeader/>
         </w:trPr>
@@ -18987,12 +16997,6 @@
         </w:tc>
       </w:tr>
       <w:tr>
-        <w:tblPrEx>
-          <w:tblCellMar>
-            <w:top w:w="0" w:type="dxa"/>
-            <w:bottom w:w="0" w:type="dxa"/>
-          </w:tblCellMar>
-        </w:tblPrEx>
         <w:tc>
           <w:tcPr>
             <w:tcW w:w="2000" w:type="dxa"/>
@@ -19051,12 +17055,6 @@
         </w:tc>
       </w:tr>
       <w:tr>
-        <w:tblPrEx>
-          <w:tblCellMar>
-            <w:top w:w="0" w:type="dxa"/>
-            <w:bottom w:w="0" w:type="dxa"/>
-          </w:tblCellMar>
-        </w:tblPrEx>
         <w:tc>
           <w:tcPr>
             <w:tcW w:w="2000" w:type="dxa"/>
@@ -19115,12 +17113,6 @@
         </w:tc>
       </w:tr>
       <w:tr>
-        <w:tblPrEx>
-          <w:tblCellMar>
-            <w:top w:w="0" w:type="dxa"/>
-            <w:bottom w:w="0" w:type="dxa"/>
-          </w:tblCellMar>
-        </w:tblPrEx>
         <w:tc>
           <w:tcPr>
             <w:tcW w:w="2000" w:type="dxa"/>

</xml_diff>

<commit_message>
feat: feature send OTP by Email (#8)
</commit_message>
<xml_diff>
--- a/backend/docs/DANASEA_Database_Design.docx
+++ b/backend/docs/DANASEA_Database_Design.docx
@@ -231,12 +231,6 @@
         <w:gridCol w:w="3677"/>
       </w:tblGrid>
       <w:tr>
-        <w:tblPrEx>
-          <w:tblCellMar>
-            <w:top w:w="0" w:type="dxa"/>
-            <w:bottom w:w="0" w:type="dxa"/>
-          </w:tblCellMar>
-        </w:tblPrEx>
         <w:trPr>
           <w:tblHeader/>
         </w:trPr>
@@ -305,12 +299,6 @@
         </w:tc>
       </w:tr>
       <w:tr>
-        <w:tblPrEx>
-          <w:tblCellMar>
-            <w:top w:w="0" w:type="dxa"/>
-            <w:bottom w:w="0" w:type="dxa"/>
-          </w:tblCellMar>
-        </w:tblPrEx>
         <w:tc>
           <w:tcPr>
             <w:tcW w:w="2000" w:type="dxa"/>
@@ -369,12 +357,6 @@
         </w:tc>
       </w:tr>
       <w:tr>
-        <w:tblPrEx>
-          <w:tblCellMar>
-            <w:top w:w="0" w:type="dxa"/>
-            <w:bottom w:w="0" w:type="dxa"/>
-          </w:tblCellMar>
-        </w:tblPrEx>
         <w:tc>
           <w:tcPr>
             <w:tcW w:w="2000" w:type="dxa"/>
@@ -433,12 +415,6 @@
         </w:tc>
       </w:tr>
       <w:tr>
-        <w:tblPrEx>
-          <w:tblCellMar>
-            <w:top w:w="0" w:type="dxa"/>
-            <w:bottom w:w="0" w:type="dxa"/>
-          </w:tblCellMar>
-        </w:tblPrEx>
         <w:tc>
           <w:tcPr>
             <w:tcW w:w="2000" w:type="dxa"/>
@@ -497,12 +473,6 @@
         </w:tc>
       </w:tr>
       <w:tr>
-        <w:tblPrEx>
-          <w:tblCellMar>
-            <w:top w:w="0" w:type="dxa"/>
-            <w:bottom w:w="0" w:type="dxa"/>
-          </w:tblCellMar>
-        </w:tblPrEx>
         <w:tc>
           <w:tcPr>
             <w:tcW w:w="2000" w:type="dxa"/>
@@ -561,12 +531,6 @@
         </w:tc>
       </w:tr>
       <w:tr>
-        <w:tblPrEx>
-          <w:tblCellMar>
-            <w:top w:w="0" w:type="dxa"/>
-            <w:bottom w:w="0" w:type="dxa"/>
-          </w:tblCellMar>
-        </w:tblPrEx>
         <w:tc>
           <w:tcPr>
             <w:tcW w:w="2000" w:type="dxa"/>
@@ -625,12 +589,6 @@
         </w:tc>
       </w:tr>
       <w:tr>
-        <w:tblPrEx>
-          <w:tblCellMar>
-            <w:top w:w="0" w:type="dxa"/>
-            <w:bottom w:w="0" w:type="dxa"/>
-          </w:tblCellMar>
-        </w:tblPrEx>
         <w:tc>
           <w:tcPr>
             <w:tcW w:w="2000" w:type="dxa"/>
@@ -689,12 +647,6 @@
         </w:tc>
       </w:tr>
       <w:tr>
-        <w:tblPrEx>
-          <w:tblCellMar>
-            <w:top w:w="0" w:type="dxa"/>
-            <w:bottom w:w="0" w:type="dxa"/>
-          </w:tblCellMar>
-        </w:tblPrEx>
         <w:tc>
           <w:tcPr>
             <w:tcW w:w="2000" w:type="dxa"/>
@@ -746,12 +698,6 @@
         </w:tc>
       </w:tr>
       <w:tr>
-        <w:tblPrEx>
-          <w:tblCellMar>
-            <w:top w:w="0" w:type="dxa"/>
-            <w:bottom w:w="0" w:type="dxa"/>
-          </w:tblCellMar>
-        </w:tblPrEx>
         <w:tc>
           <w:tcPr>
             <w:tcW w:w="2000" w:type="dxa"/>
@@ -810,12 +756,6 @@
         </w:tc>
       </w:tr>
       <w:tr>
-        <w:tblPrEx>
-          <w:tblCellMar>
-            <w:top w:w="0" w:type="dxa"/>
-            <w:bottom w:w="0" w:type="dxa"/>
-          </w:tblCellMar>
-        </w:tblPrEx>
         <w:tc>
           <w:tcPr>
             <w:tcW w:w="2000" w:type="dxa"/>
@@ -874,12 +814,6 @@
         </w:tc>
       </w:tr>
       <w:tr>
-        <w:tblPrEx>
-          <w:tblCellMar>
-            <w:top w:w="0" w:type="dxa"/>
-            <w:bottom w:w="0" w:type="dxa"/>
-          </w:tblCellMar>
-        </w:tblPrEx>
         <w:tc>
           <w:tcPr>
             <w:tcW w:w="2000" w:type="dxa"/>
@@ -938,12 +872,6 @@
         </w:tc>
       </w:tr>
       <w:tr>
-        <w:tblPrEx>
-          <w:tblCellMar>
-            <w:top w:w="0" w:type="dxa"/>
-            <w:bottom w:w="0" w:type="dxa"/>
-          </w:tblCellMar>
-        </w:tblPrEx>
         <w:tc>
           <w:tcPr>
             <w:tcW w:w="2000" w:type="dxa"/>
@@ -1050,12 +978,6 @@
         <w:gridCol w:w="5226"/>
       </w:tblGrid>
       <w:tr>
-        <w:tblPrEx>
-          <w:tblCellMar>
-            <w:top w:w="0" w:type="dxa"/>
-            <w:bottom w:w="0" w:type="dxa"/>
-          </w:tblCellMar>
-        </w:tblPrEx>
         <w:trPr>
           <w:tblHeader/>
         </w:trPr>
@@ -1124,12 +1046,6 @@
         </w:tc>
       </w:tr>
       <w:tr>
-        <w:tblPrEx>
-          <w:tblCellMar>
-            <w:top w:w="0" w:type="dxa"/>
-            <w:bottom w:w="0" w:type="dxa"/>
-          </w:tblCellMar>
-        </w:tblPrEx>
         <w:tc>
           <w:tcPr>
             <w:tcW w:w="2000" w:type="dxa"/>
@@ -1188,12 +1104,6 @@
         </w:tc>
       </w:tr>
       <w:tr>
-        <w:tblPrEx>
-          <w:tblCellMar>
-            <w:top w:w="0" w:type="dxa"/>
-            <w:bottom w:w="0" w:type="dxa"/>
-          </w:tblCellMar>
-        </w:tblPrEx>
         <w:tc>
           <w:tcPr>
             <w:tcW w:w="2000" w:type="dxa"/>
@@ -1252,12 +1162,6 @@
         </w:tc>
       </w:tr>
       <w:tr>
-        <w:tblPrEx>
-          <w:tblCellMar>
-            <w:top w:w="0" w:type="dxa"/>
-            <w:bottom w:w="0" w:type="dxa"/>
-          </w:tblCellMar>
-        </w:tblPrEx>
         <w:tc>
           <w:tcPr>
             <w:tcW w:w="2000" w:type="dxa"/>
@@ -1316,12 +1220,6 @@
         </w:tc>
       </w:tr>
       <w:tr>
-        <w:tblPrEx>
-          <w:tblCellMar>
-            <w:top w:w="0" w:type="dxa"/>
-            <w:bottom w:w="0" w:type="dxa"/>
-          </w:tblCellMar>
-        </w:tblPrEx>
         <w:tc>
           <w:tcPr>
             <w:tcW w:w="2000" w:type="dxa"/>
@@ -1380,12 +1278,6 @@
         </w:tc>
       </w:tr>
       <w:tr>
-        <w:tblPrEx>
-          <w:tblCellMar>
-            <w:top w:w="0" w:type="dxa"/>
-            <w:bottom w:w="0" w:type="dxa"/>
-          </w:tblCellMar>
-        </w:tblPrEx>
         <w:tc>
           <w:tcPr>
             <w:tcW w:w="2000" w:type="dxa"/>
@@ -1439,449 +1331,6 @@
                 <w:szCs w:val="21"/>
               </w:rPr>
               <w:t>NULL cho tới khi dùng</w:t>
-            </w:r>
-          </w:p>
-        </w:tc>
-      </w:tr>
-    </w:tbl>
-    <w:p>
-      <w:pPr>
-        <w:spacing w:before="200" w:after="80"/>
-      </w:pPr>
-      <w:r>
-        <w:rPr>
-          <w:rFonts w:ascii="Consolas" w:eastAsia="Consolas" w:hAnsi="Consolas" w:cs="Consolas"/>
-          <w:b/>
-          <w:bCs/>
-          <w:color w:val="1F4E79"/>
-          <w:sz w:val="24"/>
-          <w:szCs w:val="24"/>
-        </w:rPr>
-        <w:t>email_verification_tokens</w:t>
-      </w:r>
-      <w:r>
-        <w:rPr>
-          <w:i/>
-          <w:iCs/>
-          <w:sz w:val="23"/>
-          <w:szCs w:val="23"/>
-        </w:rPr>
-        <w:t xml:space="preserve">  —  Token xác thực email khi đăng ký.</w:t>
-      </w:r>
-    </w:p>
-    <w:tbl>
-      <w:tblPr>
-        <w:tblW w:w="9026" w:type="dxa"/>
-        <w:tblBorders>
-          <w:top w:val="single" w:sz="4" w:space="0" w:color="auto"/>
-          <w:left w:val="single" w:sz="4" w:space="0" w:color="auto"/>
-          <w:bottom w:val="single" w:sz="4" w:space="0" w:color="auto"/>
-          <w:right w:val="single" w:sz="4" w:space="0" w:color="auto"/>
-          <w:insideH w:val="single" w:sz="4" w:space="0" w:color="auto"/>
-          <w:insideV w:val="single" w:sz="4" w:space="0" w:color="auto"/>
-        </w:tblBorders>
-        <w:tblCellMar>
-          <w:left w:w="10" w:type="dxa"/>
-          <w:right w:w="10" w:type="dxa"/>
-        </w:tblCellMar>
-        <w:tblLook w:val="0000" w:firstRow="0" w:lastRow="0" w:firstColumn="0" w:lastColumn="0" w:noHBand="0" w:noVBand="0"/>
-      </w:tblPr>
-      <w:tblGrid>
-        <w:gridCol w:w="2000"/>
-        <w:gridCol w:w="1800"/>
-        <w:gridCol w:w="5226"/>
-      </w:tblGrid>
-      <w:tr>
-        <w:tblPrEx>
-          <w:tblCellMar>
-            <w:top w:w="0" w:type="dxa"/>
-            <w:bottom w:w="0" w:type="dxa"/>
-          </w:tblCellMar>
-        </w:tblPrEx>
-        <w:trPr>
-          <w:tblHeader/>
-        </w:trPr>
-        <w:tc>
-          <w:tcPr>
-            <w:tcW w:w="2000" w:type="dxa"/>
-            <w:shd w:val="clear" w:color="auto" w:fill="D9D9D9"/>
-          </w:tcPr>
-          <w:p>
-            <w:pPr>
-              <w:spacing w:after="40" w:line="260" w:lineRule="auto"/>
-              <w:jc w:val="center"/>
-            </w:pPr>
-            <w:r>
-              <w:rPr>
-                <w:b/>
-                <w:bCs/>
-                <w:sz w:val="21"/>
-                <w:szCs w:val="21"/>
-              </w:rPr>
-              <w:lastRenderedPageBreak/>
-              <w:t>Trường</w:t>
-            </w:r>
-          </w:p>
-        </w:tc>
-        <w:tc>
-          <w:tcPr>
-            <w:tcW w:w="1800" w:type="dxa"/>
-            <w:shd w:val="clear" w:color="auto" w:fill="D9D9D9"/>
-          </w:tcPr>
-          <w:p>
-            <w:pPr>
-              <w:spacing w:after="40" w:line="260" w:lineRule="auto"/>
-              <w:jc w:val="center"/>
-            </w:pPr>
-            <w:r>
-              <w:rPr>
-                <w:b/>
-                <w:bCs/>
-                <w:sz w:val="21"/>
-                <w:szCs w:val="21"/>
-              </w:rPr>
-              <w:t>Kiểu dữ liệu</w:t>
-            </w:r>
-          </w:p>
-        </w:tc>
-        <w:tc>
-          <w:tcPr>
-            <w:tcW w:w="5226" w:type="dxa"/>
-            <w:shd w:val="clear" w:color="auto" w:fill="D9D9D9"/>
-          </w:tcPr>
-          <w:p>
-            <w:pPr>
-              <w:spacing w:after="40" w:line="260" w:lineRule="auto"/>
-              <w:jc w:val="center"/>
-            </w:pPr>
-            <w:r>
-              <w:rPr>
-                <w:b/>
-                <w:bCs/>
-                <w:sz w:val="21"/>
-                <w:szCs w:val="21"/>
-              </w:rPr>
-              <w:t>Ghi chú</w:t>
-            </w:r>
-          </w:p>
-        </w:tc>
-      </w:tr>
-      <w:tr>
-        <w:tblPrEx>
-          <w:tblCellMar>
-            <w:top w:w="0" w:type="dxa"/>
-            <w:bottom w:w="0" w:type="dxa"/>
-          </w:tblCellMar>
-        </w:tblPrEx>
-        <w:tc>
-          <w:tcPr>
-            <w:tcW w:w="2000" w:type="dxa"/>
-          </w:tcPr>
-          <w:p>
-            <w:pPr>
-              <w:spacing w:after="40" w:line="260" w:lineRule="auto"/>
-              <w:ind w:left="57" w:right="57"/>
-            </w:pPr>
-            <w:r>
-              <w:rPr>
-                <w:rFonts w:ascii="Consolas" w:eastAsia="Consolas" w:hAnsi="Consolas" w:cs="Consolas"/>
-                <w:sz w:val="21"/>
-                <w:szCs w:val="21"/>
-              </w:rPr>
-              <w:t>id</w:t>
-            </w:r>
-          </w:p>
-        </w:tc>
-        <w:tc>
-          <w:tcPr>
-            <w:tcW w:w="1800" w:type="dxa"/>
-          </w:tcPr>
-          <w:p>
-            <w:pPr>
-              <w:spacing w:after="40" w:line="260" w:lineRule="auto"/>
-              <w:ind w:left="57" w:right="57"/>
-            </w:pPr>
-            <w:r>
-              <w:rPr>
-                <w:rFonts w:ascii="Consolas" w:eastAsia="Consolas" w:hAnsi="Consolas" w:cs="Consolas"/>
-                <w:sz w:val="21"/>
-                <w:szCs w:val="21"/>
-              </w:rPr>
-              <w:t>UUID</w:t>
-            </w:r>
-          </w:p>
-        </w:tc>
-        <w:tc>
-          <w:tcPr>
-            <w:tcW w:w="5226" w:type="dxa"/>
-          </w:tcPr>
-          <w:p>
-            <w:pPr>
-              <w:spacing w:after="40" w:line="260" w:lineRule="auto"/>
-              <w:ind w:left="57" w:right="57"/>
-            </w:pPr>
-            <w:r>
-              <w:rPr>
-                <w:sz w:val="21"/>
-                <w:szCs w:val="21"/>
-              </w:rPr>
-              <w:t>PK</w:t>
-            </w:r>
-          </w:p>
-        </w:tc>
-      </w:tr>
-      <w:tr>
-        <w:tblPrEx>
-          <w:tblCellMar>
-            <w:top w:w="0" w:type="dxa"/>
-            <w:bottom w:w="0" w:type="dxa"/>
-          </w:tblCellMar>
-        </w:tblPrEx>
-        <w:tc>
-          <w:tcPr>
-            <w:tcW w:w="2000" w:type="dxa"/>
-          </w:tcPr>
-          <w:p>
-            <w:pPr>
-              <w:spacing w:after="40" w:line="260" w:lineRule="auto"/>
-              <w:ind w:left="57" w:right="57"/>
-            </w:pPr>
-            <w:r>
-              <w:rPr>
-                <w:rFonts w:ascii="Consolas" w:eastAsia="Consolas" w:hAnsi="Consolas" w:cs="Consolas"/>
-                <w:sz w:val="21"/>
-                <w:szCs w:val="21"/>
-              </w:rPr>
-              <w:t>user_id</w:t>
-            </w:r>
-          </w:p>
-        </w:tc>
-        <w:tc>
-          <w:tcPr>
-            <w:tcW w:w="1800" w:type="dxa"/>
-          </w:tcPr>
-          <w:p>
-            <w:pPr>
-              <w:spacing w:after="40" w:line="260" w:lineRule="auto"/>
-              <w:ind w:left="57" w:right="57"/>
-            </w:pPr>
-            <w:r>
-              <w:rPr>
-                <w:rFonts w:ascii="Consolas" w:eastAsia="Consolas" w:hAnsi="Consolas" w:cs="Consolas"/>
-                <w:sz w:val="21"/>
-                <w:szCs w:val="21"/>
-              </w:rPr>
-              <w:t>UUID</w:t>
-            </w:r>
-          </w:p>
-        </w:tc>
-        <w:tc>
-          <w:tcPr>
-            <w:tcW w:w="5226" w:type="dxa"/>
-          </w:tcPr>
-          <w:p>
-            <w:pPr>
-              <w:spacing w:after="40" w:line="260" w:lineRule="auto"/>
-              <w:ind w:left="57" w:right="57"/>
-            </w:pPr>
-            <w:r>
-              <w:rPr>
-                <w:sz w:val="21"/>
-                <w:szCs w:val="21"/>
-              </w:rPr>
-              <w:t>FK -&gt; users.id</w:t>
-            </w:r>
-          </w:p>
-        </w:tc>
-      </w:tr>
-      <w:tr>
-        <w:tblPrEx>
-          <w:tblCellMar>
-            <w:top w:w="0" w:type="dxa"/>
-            <w:bottom w:w="0" w:type="dxa"/>
-          </w:tblCellMar>
-        </w:tblPrEx>
-        <w:tc>
-          <w:tcPr>
-            <w:tcW w:w="2000" w:type="dxa"/>
-          </w:tcPr>
-          <w:p>
-            <w:pPr>
-              <w:spacing w:after="40" w:line="260" w:lineRule="auto"/>
-              <w:ind w:left="57" w:right="57"/>
-            </w:pPr>
-            <w:r>
-              <w:rPr>
-                <w:rFonts w:ascii="Consolas" w:eastAsia="Consolas" w:hAnsi="Consolas" w:cs="Consolas"/>
-                <w:sz w:val="21"/>
-                <w:szCs w:val="21"/>
-              </w:rPr>
-              <w:t>token_hash</w:t>
-            </w:r>
-          </w:p>
-        </w:tc>
-        <w:tc>
-          <w:tcPr>
-            <w:tcW w:w="1800" w:type="dxa"/>
-          </w:tcPr>
-          <w:p>
-            <w:pPr>
-              <w:spacing w:after="40" w:line="260" w:lineRule="auto"/>
-              <w:ind w:left="57" w:right="57"/>
-            </w:pPr>
-            <w:r>
-              <w:rPr>
-                <w:rFonts w:ascii="Consolas" w:eastAsia="Consolas" w:hAnsi="Consolas" w:cs="Consolas"/>
-                <w:sz w:val="21"/>
-                <w:szCs w:val="21"/>
-              </w:rPr>
-              <w:t>VARCHAR(255)</w:t>
-            </w:r>
-          </w:p>
-        </w:tc>
-        <w:tc>
-          <w:tcPr>
-            <w:tcW w:w="5226" w:type="dxa"/>
-          </w:tcPr>
-          <w:p>
-            <w:pPr>
-              <w:spacing w:after="40" w:line="260" w:lineRule="auto"/>
-              <w:ind w:left="57" w:right="57"/>
-            </w:pPr>
-            <w:r>
-              <w:rPr>
-                <w:sz w:val="21"/>
-                <w:szCs w:val="21"/>
-              </w:rPr>
-              <w:t>UNIQUE, NOT NULL</w:t>
-            </w:r>
-          </w:p>
-        </w:tc>
-      </w:tr>
-      <w:tr>
-        <w:tblPrEx>
-          <w:tblCellMar>
-            <w:top w:w="0" w:type="dxa"/>
-            <w:bottom w:w="0" w:type="dxa"/>
-          </w:tblCellMar>
-        </w:tblPrEx>
-        <w:tc>
-          <w:tcPr>
-            <w:tcW w:w="2000" w:type="dxa"/>
-          </w:tcPr>
-          <w:p>
-            <w:pPr>
-              <w:spacing w:after="40" w:line="260" w:lineRule="auto"/>
-              <w:ind w:left="57" w:right="57"/>
-            </w:pPr>
-            <w:r>
-              <w:rPr>
-                <w:rFonts w:ascii="Consolas" w:eastAsia="Consolas" w:hAnsi="Consolas" w:cs="Consolas"/>
-                <w:sz w:val="21"/>
-                <w:szCs w:val="21"/>
-              </w:rPr>
-              <w:t>expires_at</w:t>
-            </w:r>
-          </w:p>
-        </w:tc>
-        <w:tc>
-          <w:tcPr>
-            <w:tcW w:w="1800" w:type="dxa"/>
-          </w:tcPr>
-          <w:p>
-            <w:pPr>
-              <w:spacing w:after="40" w:line="260" w:lineRule="auto"/>
-              <w:ind w:left="57" w:right="57"/>
-            </w:pPr>
-            <w:r>
-              <w:rPr>
-                <w:rFonts w:ascii="Consolas" w:eastAsia="Consolas" w:hAnsi="Consolas" w:cs="Consolas"/>
-                <w:sz w:val="21"/>
-                <w:szCs w:val="21"/>
-              </w:rPr>
-              <w:t>TIMESTAMPTZ</w:t>
-            </w:r>
-          </w:p>
-        </w:tc>
-        <w:tc>
-          <w:tcPr>
-            <w:tcW w:w="5226" w:type="dxa"/>
-          </w:tcPr>
-          <w:p>
-            <w:pPr>
-              <w:spacing w:after="40" w:line="260" w:lineRule="auto"/>
-              <w:ind w:left="57" w:right="57"/>
-            </w:pPr>
-            <w:r>
-              <w:rPr>
-                <w:sz w:val="21"/>
-                <w:szCs w:val="21"/>
-              </w:rPr>
-              <w:t>NOT NULL</w:t>
-            </w:r>
-          </w:p>
-        </w:tc>
-      </w:tr>
-      <w:tr>
-        <w:tblPrEx>
-          <w:tblCellMar>
-            <w:top w:w="0" w:type="dxa"/>
-            <w:bottom w:w="0" w:type="dxa"/>
-          </w:tblCellMar>
-        </w:tblPrEx>
-        <w:tc>
-          <w:tcPr>
-            <w:tcW w:w="2000" w:type="dxa"/>
-          </w:tcPr>
-          <w:p>
-            <w:pPr>
-              <w:spacing w:after="40" w:line="260" w:lineRule="auto"/>
-              <w:ind w:left="57" w:right="57"/>
-            </w:pPr>
-            <w:r>
-              <w:rPr>
-                <w:rFonts w:ascii="Consolas" w:eastAsia="Consolas" w:hAnsi="Consolas" w:cs="Consolas"/>
-                <w:sz w:val="21"/>
-                <w:szCs w:val="21"/>
-              </w:rPr>
-              <w:t>verified_at</w:t>
-            </w:r>
-          </w:p>
-        </w:tc>
-        <w:tc>
-          <w:tcPr>
-            <w:tcW w:w="1800" w:type="dxa"/>
-          </w:tcPr>
-          <w:p>
-            <w:pPr>
-              <w:spacing w:after="40" w:line="260" w:lineRule="auto"/>
-              <w:ind w:left="57" w:right="57"/>
-            </w:pPr>
-            <w:r>
-              <w:rPr>
-                <w:rFonts w:ascii="Consolas" w:eastAsia="Consolas" w:hAnsi="Consolas" w:cs="Consolas"/>
-                <w:sz w:val="21"/>
-                <w:szCs w:val="21"/>
-              </w:rPr>
-              <w:t>TIMESTAMPTZ</w:t>
-            </w:r>
-          </w:p>
-        </w:tc>
-        <w:tc>
-          <w:tcPr>
-            <w:tcW w:w="5226" w:type="dxa"/>
-          </w:tcPr>
-          <w:p>
-            <w:pPr>
-              <w:spacing w:after="40" w:line="260" w:lineRule="auto"/>
-              <w:ind w:left="57" w:right="57"/>
-            </w:pPr>
-            <w:r>
-              <w:rPr>
-                <w:sz w:val="21"/>
-                <w:szCs w:val="21"/>
-              </w:rPr>
-              <w:t>NULL cho tới khi xác thực</w:t>
             </w:r>
           </w:p>
         </w:tc>
@@ -1935,12 +1384,6 @@
         <w:gridCol w:w="5226"/>
       </w:tblGrid>
       <w:tr>
-        <w:tblPrEx>
-          <w:tblCellMar>
-            <w:top w:w="0" w:type="dxa"/>
-            <w:bottom w:w="0" w:type="dxa"/>
-          </w:tblCellMar>
-        </w:tblPrEx>
         <w:trPr>
           <w:tblHeader/>
         </w:trPr>
@@ -1961,7 +1404,8 @@
                 <w:sz w:val="21"/>
                 <w:szCs w:val="21"/>
               </w:rPr>
-              <w:t xml:space="preserve">Trường</w:t>
+              <w:lastRenderedPageBreak/>
+              <w:t>Trường</w:t>
             </w:r>
           </w:p>
         </w:tc>
@@ -1982,7 +1426,7 @@
                 <w:sz w:val="21"/>
                 <w:szCs w:val="21"/>
               </w:rPr>
-              <w:t xml:space="preserve">Kiểu dữ liệu</w:t>
+              <w:t>Kiểu dữ liệu</w:t>
             </w:r>
           </w:p>
         </w:tc>
@@ -2003,519 +1447,471 @@
                 <w:sz w:val="21"/>
                 <w:szCs w:val="21"/>
               </w:rPr>
-              <w:t xml:space="preserve">Ghi chú</w:t>
-            </w:r>
-          </w:p>
-        </w:tc>
-      </w:tr>
-      <w:tr>
-        <w:tblPrEx>
-          <w:tblCellMar>
-            <w:top w:w="0" w:type="dxa"/>
-            <w:bottom w:w="0" w:type="dxa"/>
-          </w:tblCellMar>
-        </w:tblPrEx>
-        <w:tc>
-          <w:tcPr>
-            <w:tcW w:w="2000" w:type="dxa"/>
-          </w:tcPr>
-          <w:p>
-            <w:pPr>
-              <w:spacing w:after="40" w:line="260" w:lineRule="auto"/>
-              <w:ind w:left="57" w:right="57"/>
-            </w:pPr>
-            <w:r>
-              <w:rPr>
-                <w:rFonts w:ascii="Consolas" w:eastAsia="Consolas" w:hAnsi="Consolas" w:cs="Consolas"/>
-                <w:sz w:val="21"/>
-                <w:szCs w:val="21"/>
-              </w:rPr>
-              <w:t xml:space="preserve">id</w:t>
-            </w:r>
-          </w:p>
-        </w:tc>
-        <w:tc>
-          <w:tcPr>
-            <w:tcW w:w="1800" w:type="dxa"/>
-          </w:tcPr>
-          <w:p>
-            <w:pPr>
-              <w:spacing w:after="40" w:line="260" w:lineRule="auto"/>
-              <w:ind w:left="57" w:right="57"/>
-            </w:pPr>
-            <w:r>
-              <w:rPr>
-                <w:rFonts w:ascii="Consolas" w:eastAsia="Consolas" w:hAnsi="Consolas" w:cs="Consolas"/>
-                <w:sz w:val="21"/>
-                <w:szCs w:val="21"/>
-              </w:rPr>
-              <w:t xml:space="preserve">UUID</w:t>
-            </w:r>
-          </w:p>
-        </w:tc>
-        <w:tc>
-          <w:tcPr>
-            <w:tcW w:w="5226" w:type="dxa"/>
-          </w:tcPr>
-          <w:p>
-            <w:pPr>
-              <w:spacing w:after="40" w:line="260" w:lineRule="auto"/>
-              <w:ind w:left="57" w:right="57"/>
-            </w:pPr>
-            <w:r>
-              <w:rPr>
-                <w:sz w:val="21"/>
-                <w:szCs w:val="21"/>
-              </w:rPr>
-              <w:t xml:space="preserve">PK</w:t>
-            </w:r>
-          </w:p>
-        </w:tc>
-      </w:tr>
-      <w:tr>
-        <w:tblPrEx>
-          <w:tblCellMar>
-            <w:top w:w="0" w:type="dxa"/>
-            <w:bottom w:w="0" w:type="dxa"/>
-          </w:tblCellMar>
-        </w:tblPrEx>
-        <w:tc>
-          <w:tcPr>
-            <w:tcW w:w="2000" w:type="dxa"/>
-          </w:tcPr>
-          <w:p>
-            <w:pPr>
-              <w:spacing w:after="40" w:line="260" w:lineRule="auto"/>
-              <w:ind w:left="57" w:right="57"/>
-            </w:pPr>
-            <w:r>
-              <w:rPr>
-                <w:rFonts w:ascii="Consolas" w:eastAsia="Consolas" w:hAnsi="Consolas" w:cs="Consolas"/>
-                <w:sz w:val="21"/>
-                <w:szCs w:val="21"/>
-              </w:rPr>
-              <w:t xml:space="preserve">user_id</w:t>
-            </w:r>
-          </w:p>
-        </w:tc>
-        <w:tc>
-          <w:tcPr>
-            <w:tcW w:w="1800" w:type="dxa"/>
-          </w:tcPr>
-          <w:p>
-            <w:pPr>
-              <w:spacing w:after="40" w:line="260" w:lineRule="auto"/>
-              <w:ind w:left="57" w:right="57"/>
-            </w:pPr>
-            <w:r>
-              <w:rPr>
-                <w:rFonts w:ascii="Consolas" w:eastAsia="Consolas" w:hAnsi="Consolas" w:cs="Consolas"/>
-                <w:sz w:val="21"/>
-                <w:szCs w:val="21"/>
-              </w:rPr>
-              <w:t xml:space="preserve">UUID</w:t>
-            </w:r>
-          </w:p>
-        </w:tc>
-        <w:tc>
-          <w:tcPr>
-            <w:tcW w:w="5226" w:type="dxa"/>
-          </w:tcPr>
-          <w:p>
-            <w:pPr>
-              <w:spacing w:after="40" w:line="260" w:lineRule="auto"/>
-              <w:ind w:left="57" w:right="57"/>
-            </w:pPr>
-            <w:r>
-              <w:rPr>
-                <w:sz w:val="21"/>
-                <w:szCs w:val="21"/>
-              </w:rPr>
-              <w:t xml:space="preserve">FK -&gt; users.id</w:t>
-            </w:r>
-          </w:p>
-        </w:tc>
-      </w:tr>
-      <w:tr>
-        <w:tblPrEx>
-          <w:tblCellMar>
-            <w:top w:w="0" w:type="dxa"/>
-            <w:bottom w:w="0" w:type="dxa"/>
-          </w:tblCellMar>
-        </w:tblPrEx>
-        <w:tc>
-          <w:tcPr>
-            <w:tcW w:w="2000" w:type="dxa"/>
-          </w:tcPr>
-          <w:p>
-            <w:pPr>
-              <w:spacing w:after="40" w:line="260" w:lineRule="auto"/>
-              <w:ind w:left="57" w:right="57"/>
-            </w:pPr>
-            <w:r>
-              <w:rPr>
-                <w:rFonts w:ascii="Consolas" w:eastAsia="Consolas" w:hAnsi="Consolas" w:cs="Consolas"/>
-                <w:sz w:val="21"/>
-                <w:szCs w:val="21"/>
-              </w:rPr>
-              <w:t xml:space="preserve">token_hash</w:t>
-            </w:r>
-          </w:p>
-        </w:tc>
-        <w:tc>
-          <w:tcPr>
-            <w:tcW w:w="1800" w:type="dxa"/>
-          </w:tcPr>
-          <w:p>
-            <w:pPr>
-              <w:spacing w:after="40" w:line="260" w:lineRule="auto"/>
-              <w:ind w:left="57" w:right="57"/>
-            </w:pPr>
-            <w:r>
-              <w:rPr>
-                <w:rFonts w:ascii="Consolas" w:eastAsia="Consolas" w:hAnsi="Consolas" w:cs="Consolas"/>
-                <w:sz w:val="21"/>
-                <w:szCs w:val="21"/>
-              </w:rPr>
-              <w:t xml:space="preserve">VARCHAR(255)</w:t>
-            </w:r>
-          </w:p>
-        </w:tc>
-        <w:tc>
-          <w:tcPr>
-            <w:tcW w:w="5226" w:type="dxa"/>
-          </w:tcPr>
-          <w:p>
-            <w:pPr>
-              <w:spacing w:after="40" w:line="260" w:lineRule="auto"/>
-              <w:ind w:left="57" w:right="57"/>
-            </w:pPr>
-            <w:r>
-              <w:rPr>
-                <w:sz w:val="21"/>
-                <w:szCs w:val="21"/>
-              </w:rPr>
-              <w:t xml:space="preserve">UNIQUE, NOT NULL</w:t>
-            </w:r>
-          </w:p>
-        </w:tc>
-      </w:tr>
-      <w:tr>
-        <w:tblPrEx>
-          <w:tblCellMar>
-            <w:top w:w="0" w:type="dxa"/>
-            <w:bottom w:w="0" w:type="dxa"/>
-          </w:tblCellMar>
-        </w:tblPrEx>
-        <w:tc>
-          <w:tcPr>
-            <w:tcW w:w="2000" w:type="dxa"/>
-          </w:tcPr>
-          <w:p>
-            <w:pPr>
-              <w:spacing w:after="40" w:line="260" w:lineRule="auto"/>
-              <w:ind w:left="57" w:right="57"/>
-            </w:pPr>
-            <w:r>
-              <w:rPr>
-                <w:rFonts w:ascii="Consolas" w:eastAsia="Consolas" w:hAnsi="Consolas" w:cs="Consolas"/>
-                <w:sz w:val="21"/>
-                <w:szCs w:val="21"/>
-              </w:rPr>
-              <w:t xml:space="preserve">family_id</w:t>
-            </w:r>
-          </w:p>
-        </w:tc>
-        <w:tc>
-          <w:tcPr>
-            <w:tcW w:w="1800" w:type="dxa"/>
-          </w:tcPr>
-          <w:p>
-            <w:pPr>
-              <w:spacing w:after="40" w:line="260" w:lineRule="auto"/>
-              <w:ind w:left="57" w:right="57"/>
-            </w:pPr>
-            <w:r>
-              <w:rPr>
-                <w:rFonts w:ascii="Consolas" w:eastAsia="Consolas" w:hAnsi="Consolas" w:cs="Consolas"/>
-                <w:sz w:val="21"/>
-                <w:szCs w:val="21"/>
-              </w:rPr>
-              <w:t xml:space="preserve">UUID</w:t>
-            </w:r>
-          </w:p>
-        </w:tc>
-        <w:tc>
-          <w:tcPr>
-            <w:tcW w:w="5226" w:type="dxa"/>
-          </w:tcPr>
-          <w:p>
-            <w:pPr>
-              <w:spacing w:after="40" w:line="260" w:lineRule="auto"/>
-              <w:ind w:left="57" w:right="57"/>
-            </w:pPr>
-            <w:r>
-              <w:rPr>
-                <w:sz w:val="21"/>
-                <w:szCs w:val="21"/>
-              </w:rPr>
-              <w:t xml:space="preserve">NOT NULL — nhóm các token cùng một chuỗi rotation, dùng để thu hồi toàn bộ chain khi phát hiện tái sử dụng</w:t>
-            </w:r>
-          </w:p>
-        </w:tc>
-      </w:tr>
-      <w:tr>
-        <w:tblPrEx>
-          <w:tblCellMar>
-            <w:top w:w="0" w:type="dxa"/>
-            <w:bottom w:w="0" w:type="dxa"/>
-          </w:tblCellMar>
-        </w:tblPrEx>
-        <w:tc>
-          <w:tcPr>
-            <w:tcW w:w="2000" w:type="dxa"/>
-          </w:tcPr>
-          <w:p>
-            <w:pPr>
-              <w:spacing w:after="40" w:line="260" w:lineRule="auto"/>
-              <w:ind w:left="57" w:right="57"/>
-            </w:pPr>
-            <w:r>
-              <w:rPr>
-                <w:rFonts w:ascii="Consolas" w:eastAsia="Consolas" w:hAnsi="Consolas" w:cs="Consolas"/>
-                <w:sz w:val="21"/>
-                <w:szCs w:val="21"/>
-              </w:rPr>
-              <w:t xml:space="preserve">replaced_by_id</w:t>
-            </w:r>
-          </w:p>
-        </w:tc>
-        <w:tc>
-          <w:tcPr>
-            <w:tcW w:w="1800" w:type="dxa"/>
-          </w:tcPr>
-          <w:p>
-            <w:pPr>
-              <w:spacing w:after="40" w:line="260" w:lineRule="auto"/>
-              <w:ind w:left="57" w:right="57"/>
-            </w:pPr>
-            <w:r>
-              <w:rPr>
-                <w:rFonts w:ascii="Consolas" w:eastAsia="Consolas" w:hAnsi="Consolas" w:cs="Consolas"/>
-                <w:sz w:val="21"/>
-                <w:szCs w:val="21"/>
-              </w:rPr>
-              <w:t xml:space="preserve">UUID</w:t>
-            </w:r>
-          </w:p>
-        </w:tc>
-        <w:tc>
-          <w:tcPr>
-            <w:tcW w:w="5226" w:type="dxa"/>
-          </w:tcPr>
-          <w:p>
-            <w:pPr>
-              <w:spacing w:after="40" w:line="260" w:lineRule="auto"/>
-              <w:ind w:left="57" w:right="57"/>
-            </w:pPr>
-            <w:r>
-              <w:rPr>
-                <w:sz w:val="21"/>
-                <w:szCs w:val="21"/>
-              </w:rPr>
-              <w:t xml:space="preserve">FK -&gt; refresh_tokens.id, NULL cho tới khi bị rotate</w:t>
-            </w:r>
-          </w:p>
-        </w:tc>
-      </w:tr>
-      <w:tr>
-        <w:tblPrEx>
-          <w:tblCellMar>
-            <w:top w:w="0" w:type="dxa"/>
-            <w:bottom w:w="0" w:type="dxa"/>
-          </w:tblCellMar>
-        </w:tblPrEx>
-        <w:tc>
-          <w:tcPr>
-            <w:tcW w:w="2000" w:type="dxa"/>
-          </w:tcPr>
-          <w:p>
-            <w:pPr>
-              <w:spacing w:after="40" w:line="260" w:lineRule="auto"/>
-              <w:ind w:left="57" w:right="57"/>
-            </w:pPr>
-            <w:r>
-              <w:rPr>
-                <w:rFonts w:ascii="Consolas" w:eastAsia="Consolas" w:hAnsi="Consolas" w:cs="Consolas"/>
-                <w:sz w:val="21"/>
-                <w:szCs w:val="21"/>
-              </w:rPr>
-              <w:t xml:space="preserve">expires_at</w:t>
-            </w:r>
-          </w:p>
-        </w:tc>
-        <w:tc>
-          <w:tcPr>
-            <w:tcW w:w="1800" w:type="dxa"/>
-          </w:tcPr>
-          <w:p>
-            <w:pPr>
-              <w:spacing w:after="40" w:line="260" w:lineRule="auto"/>
-              <w:ind w:left="57" w:right="57"/>
-            </w:pPr>
-            <w:r>
-              <w:rPr>
-                <w:rFonts w:ascii="Consolas" w:eastAsia="Consolas" w:hAnsi="Consolas" w:cs="Consolas"/>
-                <w:sz w:val="21"/>
-                <w:szCs w:val="21"/>
-              </w:rPr>
-              <w:t xml:space="preserve">TIMESTAMPTZ</w:t>
-            </w:r>
-          </w:p>
-        </w:tc>
-        <w:tc>
-          <w:tcPr>
-            <w:tcW w:w="5226" w:type="dxa"/>
-          </w:tcPr>
-          <w:p>
-            <w:pPr>
-              <w:spacing w:after="40" w:line="260" w:lineRule="auto"/>
-              <w:ind w:left="57" w:right="57"/>
-            </w:pPr>
-            <w:r>
-              <w:rPr>
-                <w:sz w:val="21"/>
-                <w:szCs w:val="21"/>
-              </w:rPr>
-              <w:t xml:space="preserve">NOT NULL</w:t>
-            </w:r>
-          </w:p>
-        </w:tc>
-      </w:tr>
-      <w:tr>
-        <w:tblPrEx>
-          <w:tblCellMar>
-            <w:top w:w="0" w:type="dxa"/>
-            <w:bottom w:w="0" w:type="dxa"/>
-          </w:tblCellMar>
-        </w:tblPrEx>
-        <w:tc>
-          <w:tcPr>
-            <w:tcW w:w="2000" w:type="dxa"/>
-          </w:tcPr>
-          <w:p>
-            <w:pPr>
-              <w:spacing w:after="40" w:line="260" w:lineRule="auto"/>
-              <w:ind w:left="57" w:right="57"/>
-            </w:pPr>
-            <w:r>
-              <w:rPr>
-                <w:rFonts w:ascii="Consolas" w:eastAsia="Consolas" w:hAnsi="Consolas" w:cs="Consolas"/>
-                <w:sz w:val="21"/>
-                <w:szCs w:val="21"/>
-              </w:rPr>
-              <w:t xml:space="preserve">revoked_at</w:t>
-            </w:r>
-          </w:p>
-        </w:tc>
-        <w:tc>
-          <w:tcPr>
-            <w:tcW w:w="1800" w:type="dxa"/>
-          </w:tcPr>
-          <w:p>
-            <w:pPr>
-              <w:spacing w:after="40" w:line="260" w:lineRule="auto"/>
-              <w:ind w:left="57" w:right="57"/>
-            </w:pPr>
-            <w:r>
-              <w:rPr>
-                <w:rFonts w:ascii="Consolas" w:eastAsia="Consolas" w:hAnsi="Consolas" w:cs="Consolas"/>
-                <w:sz w:val="21"/>
-                <w:szCs w:val="21"/>
-              </w:rPr>
-              <w:t xml:space="preserve">TIMESTAMPTZ</w:t>
-            </w:r>
-          </w:p>
-        </w:tc>
-        <w:tc>
-          <w:tcPr>
-            <w:tcW w:w="5226" w:type="dxa"/>
-          </w:tcPr>
-          <w:p>
-            <w:pPr>
-              <w:spacing w:after="40" w:line="260" w:lineRule="auto"/>
-              <w:ind w:left="57" w:right="57"/>
-            </w:pPr>
-            <w:r>
-              <w:rPr>
-                <w:sz w:val="21"/>
-                <w:szCs w:val="21"/>
-              </w:rPr>
-              <w:t xml:space="preserve">NULL cho tới khi bị thu hồi (logout hoặc phát hiện tái sử dụng)</w:t>
-            </w:r>
-          </w:p>
-        </w:tc>
-      </w:tr>
-      <w:tr>
-        <w:tblPrEx>
-          <w:tblCellMar>
-            <w:top w:w="0" w:type="dxa"/>
-            <w:bottom w:w="0" w:type="dxa"/>
-          </w:tblCellMar>
-        </w:tblPrEx>
-        <w:tc>
-          <w:tcPr>
-            <w:tcW w:w="2000" w:type="dxa"/>
-          </w:tcPr>
-          <w:p>
-            <w:pPr>
-              <w:spacing w:after="40" w:line="260" w:lineRule="auto"/>
-              <w:ind w:left="57" w:right="57"/>
-            </w:pPr>
-            <w:r>
-              <w:rPr>
-                <w:rFonts w:ascii="Consolas" w:eastAsia="Consolas" w:hAnsi="Consolas" w:cs="Consolas"/>
-                <w:sz w:val="21"/>
-                <w:szCs w:val="21"/>
-              </w:rPr>
-              <w:t xml:space="preserve">created_at</w:t>
-            </w:r>
-          </w:p>
-        </w:tc>
-        <w:tc>
-          <w:tcPr>
-            <w:tcW w:w="1800" w:type="dxa"/>
-          </w:tcPr>
-          <w:p>
-            <w:pPr>
-              <w:spacing w:after="40" w:line="260" w:lineRule="auto"/>
-              <w:ind w:left="57" w:right="57"/>
-            </w:pPr>
-            <w:r>
-              <w:rPr>
-                <w:rFonts w:ascii="Consolas" w:eastAsia="Consolas" w:hAnsi="Consolas" w:cs="Consolas"/>
-                <w:sz w:val="21"/>
-                <w:szCs w:val="21"/>
-              </w:rPr>
-              <w:t xml:space="preserve">TIMESTAMPTZ</w:t>
-            </w:r>
-          </w:p>
-        </w:tc>
-        <w:tc>
-          <w:tcPr>
-            <w:tcW w:w="5226" w:type="dxa"/>
-          </w:tcPr>
-          <w:p>
-            <w:pPr>
-              <w:spacing w:after="40" w:line="260" w:lineRule="auto"/>
-              <w:ind w:left="57" w:right="57"/>
-            </w:pPr>
-            <w:r>
-              <w:rPr>
-                <w:sz w:val="21"/>
-                <w:szCs w:val="21"/>
-              </w:rPr>
-              <w:t xml:space="preserve">DEFAULT now()</w:t>
+              <w:t>Ghi chú</w:t>
+            </w:r>
+          </w:p>
+        </w:tc>
+      </w:tr>
+      <w:tr>
+        <w:tc>
+          <w:tcPr>
+            <w:tcW w:w="2000" w:type="dxa"/>
+          </w:tcPr>
+          <w:p>
+            <w:pPr>
+              <w:spacing w:after="40" w:line="260" w:lineRule="auto"/>
+              <w:ind w:left="57" w:right="57"/>
+            </w:pPr>
+            <w:r>
+              <w:rPr>
+                <w:rFonts w:ascii="Consolas" w:eastAsia="Consolas" w:hAnsi="Consolas" w:cs="Consolas"/>
+                <w:sz w:val="21"/>
+                <w:szCs w:val="21"/>
+              </w:rPr>
+              <w:t>id</w:t>
+            </w:r>
+          </w:p>
+        </w:tc>
+        <w:tc>
+          <w:tcPr>
+            <w:tcW w:w="1800" w:type="dxa"/>
+          </w:tcPr>
+          <w:p>
+            <w:pPr>
+              <w:spacing w:after="40" w:line="260" w:lineRule="auto"/>
+              <w:ind w:left="57" w:right="57"/>
+            </w:pPr>
+            <w:r>
+              <w:rPr>
+                <w:rFonts w:ascii="Consolas" w:eastAsia="Consolas" w:hAnsi="Consolas" w:cs="Consolas"/>
+                <w:sz w:val="21"/>
+                <w:szCs w:val="21"/>
+              </w:rPr>
+              <w:t>UUID</w:t>
+            </w:r>
+          </w:p>
+        </w:tc>
+        <w:tc>
+          <w:tcPr>
+            <w:tcW w:w="5226" w:type="dxa"/>
+          </w:tcPr>
+          <w:p>
+            <w:pPr>
+              <w:spacing w:after="40" w:line="260" w:lineRule="auto"/>
+              <w:ind w:left="57" w:right="57"/>
+            </w:pPr>
+            <w:r>
+              <w:rPr>
+                <w:sz w:val="21"/>
+                <w:szCs w:val="21"/>
+              </w:rPr>
+              <w:t>PK</w:t>
+            </w:r>
+          </w:p>
+        </w:tc>
+      </w:tr>
+      <w:tr>
+        <w:tc>
+          <w:tcPr>
+            <w:tcW w:w="2000" w:type="dxa"/>
+          </w:tcPr>
+          <w:p>
+            <w:pPr>
+              <w:spacing w:after="40" w:line="260" w:lineRule="auto"/>
+              <w:ind w:left="57" w:right="57"/>
+            </w:pPr>
+            <w:r>
+              <w:rPr>
+                <w:rFonts w:ascii="Consolas" w:eastAsia="Consolas" w:hAnsi="Consolas" w:cs="Consolas"/>
+                <w:sz w:val="21"/>
+                <w:szCs w:val="21"/>
+              </w:rPr>
+              <w:t>user_id</w:t>
+            </w:r>
+          </w:p>
+        </w:tc>
+        <w:tc>
+          <w:tcPr>
+            <w:tcW w:w="1800" w:type="dxa"/>
+          </w:tcPr>
+          <w:p>
+            <w:pPr>
+              <w:spacing w:after="40" w:line="260" w:lineRule="auto"/>
+              <w:ind w:left="57" w:right="57"/>
+            </w:pPr>
+            <w:r>
+              <w:rPr>
+                <w:rFonts w:ascii="Consolas" w:eastAsia="Consolas" w:hAnsi="Consolas" w:cs="Consolas"/>
+                <w:sz w:val="21"/>
+                <w:szCs w:val="21"/>
+              </w:rPr>
+              <w:t>UUID</w:t>
+            </w:r>
+          </w:p>
+        </w:tc>
+        <w:tc>
+          <w:tcPr>
+            <w:tcW w:w="5226" w:type="dxa"/>
+          </w:tcPr>
+          <w:p>
+            <w:pPr>
+              <w:spacing w:after="40" w:line="260" w:lineRule="auto"/>
+              <w:ind w:left="57" w:right="57"/>
+            </w:pPr>
+            <w:r>
+              <w:rPr>
+                <w:sz w:val="21"/>
+                <w:szCs w:val="21"/>
+              </w:rPr>
+              <w:t>FK -&gt; users.id</w:t>
+            </w:r>
+          </w:p>
+        </w:tc>
+      </w:tr>
+      <w:tr>
+        <w:tc>
+          <w:tcPr>
+            <w:tcW w:w="2000" w:type="dxa"/>
+          </w:tcPr>
+          <w:p>
+            <w:pPr>
+              <w:spacing w:after="40" w:line="260" w:lineRule="auto"/>
+              <w:ind w:left="57" w:right="57"/>
+            </w:pPr>
+            <w:r>
+              <w:rPr>
+                <w:rFonts w:ascii="Consolas" w:eastAsia="Consolas" w:hAnsi="Consolas" w:cs="Consolas"/>
+                <w:sz w:val="21"/>
+                <w:szCs w:val="21"/>
+              </w:rPr>
+              <w:t>token_hash</w:t>
+            </w:r>
+          </w:p>
+        </w:tc>
+        <w:tc>
+          <w:tcPr>
+            <w:tcW w:w="1800" w:type="dxa"/>
+          </w:tcPr>
+          <w:p>
+            <w:pPr>
+              <w:spacing w:after="40" w:line="260" w:lineRule="auto"/>
+              <w:ind w:left="57" w:right="57"/>
+            </w:pPr>
+            <w:r>
+              <w:rPr>
+                <w:rFonts w:ascii="Consolas" w:eastAsia="Consolas" w:hAnsi="Consolas" w:cs="Consolas"/>
+                <w:sz w:val="21"/>
+                <w:szCs w:val="21"/>
+              </w:rPr>
+              <w:t>VARCHAR(255)</w:t>
+            </w:r>
+          </w:p>
+        </w:tc>
+        <w:tc>
+          <w:tcPr>
+            <w:tcW w:w="5226" w:type="dxa"/>
+          </w:tcPr>
+          <w:p>
+            <w:pPr>
+              <w:spacing w:after="40" w:line="260" w:lineRule="auto"/>
+              <w:ind w:left="57" w:right="57"/>
+            </w:pPr>
+            <w:r>
+              <w:rPr>
+                <w:sz w:val="21"/>
+                <w:szCs w:val="21"/>
+              </w:rPr>
+              <w:t>UNIQUE, NOT NULL</w:t>
+            </w:r>
+          </w:p>
+        </w:tc>
+      </w:tr>
+      <w:tr>
+        <w:tc>
+          <w:tcPr>
+            <w:tcW w:w="2000" w:type="dxa"/>
+          </w:tcPr>
+          <w:p>
+            <w:pPr>
+              <w:spacing w:after="40" w:line="260" w:lineRule="auto"/>
+              <w:ind w:left="57" w:right="57"/>
+            </w:pPr>
+            <w:r>
+              <w:rPr>
+                <w:rFonts w:ascii="Consolas" w:eastAsia="Consolas" w:hAnsi="Consolas" w:cs="Consolas"/>
+                <w:sz w:val="21"/>
+                <w:szCs w:val="21"/>
+              </w:rPr>
+              <w:t>family_id</w:t>
+            </w:r>
+          </w:p>
+        </w:tc>
+        <w:tc>
+          <w:tcPr>
+            <w:tcW w:w="1800" w:type="dxa"/>
+          </w:tcPr>
+          <w:p>
+            <w:pPr>
+              <w:spacing w:after="40" w:line="260" w:lineRule="auto"/>
+              <w:ind w:left="57" w:right="57"/>
+            </w:pPr>
+            <w:r>
+              <w:rPr>
+                <w:rFonts w:ascii="Consolas" w:eastAsia="Consolas" w:hAnsi="Consolas" w:cs="Consolas"/>
+                <w:sz w:val="21"/>
+                <w:szCs w:val="21"/>
+              </w:rPr>
+              <w:t>UUID</w:t>
+            </w:r>
+          </w:p>
+        </w:tc>
+        <w:tc>
+          <w:tcPr>
+            <w:tcW w:w="5226" w:type="dxa"/>
+          </w:tcPr>
+          <w:p>
+            <w:pPr>
+              <w:spacing w:after="40" w:line="260" w:lineRule="auto"/>
+              <w:ind w:left="57" w:right="57"/>
+            </w:pPr>
+            <w:r>
+              <w:rPr>
+                <w:sz w:val="21"/>
+                <w:szCs w:val="21"/>
+              </w:rPr>
+              <w:t>NOT NULL — nhóm các token cùng một chuỗi rotation, dùng để thu hồi toàn bộ chain khi phát hiện tái sử dụng</w:t>
+            </w:r>
+          </w:p>
+        </w:tc>
+      </w:tr>
+      <w:tr>
+        <w:tc>
+          <w:tcPr>
+            <w:tcW w:w="2000" w:type="dxa"/>
+          </w:tcPr>
+          <w:p>
+            <w:pPr>
+              <w:spacing w:after="40" w:line="260" w:lineRule="auto"/>
+              <w:ind w:left="57" w:right="57"/>
+            </w:pPr>
+            <w:r>
+              <w:rPr>
+                <w:rFonts w:ascii="Consolas" w:eastAsia="Consolas" w:hAnsi="Consolas" w:cs="Consolas"/>
+                <w:sz w:val="21"/>
+                <w:szCs w:val="21"/>
+              </w:rPr>
+              <w:t>replaced_by_id</w:t>
+            </w:r>
+          </w:p>
+        </w:tc>
+        <w:tc>
+          <w:tcPr>
+            <w:tcW w:w="1800" w:type="dxa"/>
+          </w:tcPr>
+          <w:p>
+            <w:pPr>
+              <w:spacing w:after="40" w:line="260" w:lineRule="auto"/>
+              <w:ind w:left="57" w:right="57"/>
+            </w:pPr>
+            <w:r>
+              <w:rPr>
+                <w:rFonts w:ascii="Consolas" w:eastAsia="Consolas" w:hAnsi="Consolas" w:cs="Consolas"/>
+                <w:sz w:val="21"/>
+                <w:szCs w:val="21"/>
+              </w:rPr>
+              <w:t>UUID</w:t>
+            </w:r>
+          </w:p>
+        </w:tc>
+        <w:tc>
+          <w:tcPr>
+            <w:tcW w:w="5226" w:type="dxa"/>
+          </w:tcPr>
+          <w:p>
+            <w:pPr>
+              <w:spacing w:after="40" w:line="260" w:lineRule="auto"/>
+              <w:ind w:left="57" w:right="57"/>
+            </w:pPr>
+            <w:r>
+              <w:rPr>
+                <w:sz w:val="21"/>
+                <w:szCs w:val="21"/>
+              </w:rPr>
+              <w:t>FK -&gt; refresh_tokens.id, NULL cho tới khi bị rotate</w:t>
+            </w:r>
+          </w:p>
+        </w:tc>
+      </w:tr>
+      <w:tr>
+        <w:tc>
+          <w:tcPr>
+            <w:tcW w:w="2000" w:type="dxa"/>
+          </w:tcPr>
+          <w:p>
+            <w:pPr>
+              <w:spacing w:after="40" w:line="260" w:lineRule="auto"/>
+              <w:ind w:left="57" w:right="57"/>
+            </w:pPr>
+            <w:r>
+              <w:rPr>
+                <w:rFonts w:ascii="Consolas" w:eastAsia="Consolas" w:hAnsi="Consolas" w:cs="Consolas"/>
+                <w:sz w:val="21"/>
+                <w:szCs w:val="21"/>
+              </w:rPr>
+              <w:t>expires_at</w:t>
+            </w:r>
+          </w:p>
+        </w:tc>
+        <w:tc>
+          <w:tcPr>
+            <w:tcW w:w="1800" w:type="dxa"/>
+          </w:tcPr>
+          <w:p>
+            <w:pPr>
+              <w:spacing w:after="40" w:line="260" w:lineRule="auto"/>
+              <w:ind w:left="57" w:right="57"/>
+            </w:pPr>
+            <w:r>
+              <w:rPr>
+                <w:rFonts w:ascii="Consolas" w:eastAsia="Consolas" w:hAnsi="Consolas" w:cs="Consolas"/>
+                <w:sz w:val="21"/>
+                <w:szCs w:val="21"/>
+              </w:rPr>
+              <w:t>TIMESTAMPTZ</w:t>
+            </w:r>
+          </w:p>
+        </w:tc>
+        <w:tc>
+          <w:tcPr>
+            <w:tcW w:w="5226" w:type="dxa"/>
+          </w:tcPr>
+          <w:p>
+            <w:pPr>
+              <w:spacing w:after="40" w:line="260" w:lineRule="auto"/>
+              <w:ind w:left="57" w:right="57"/>
+            </w:pPr>
+            <w:r>
+              <w:rPr>
+                <w:sz w:val="21"/>
+                <w:szCs w:val="21"/>
+              </w:rPr>
+              <w:t>NOT NULL</w:t>
+            </w:r>
+          </w:p>
+        </w:tc>
+      </w:tr>
+      <w:tr>
+        <w:tc>
+          <w:tcPr>
+            <w:tcW w:w="2000" w:type="dxa"/>
+          </w:tcPr>
+          <w:p>
+            <w:pPr>
+              <w:spacing w:after="40" w:line="260" w:lineRule="auto"/>
+              <w:ind w:left="57" w:right="57"/>
+            </w:pPr>
+            <w:r>
+              <w:rPr>
+                <w:rFonts w:ascii="Consolas" w:eastAsia="Consolas" w:hAnsi="Consolas" w:cs="Consolas"/>
+                <w:sz w:val="21"/>
+                <w:szCs w:val="21"/>
+              </w:rPr>
+              <w:t>revoked_at</w:t>
+            </w:r>
+          </w:p>
+        </w:tc>
+        <w:tc>
+          <w:tcPr>
+            <w:tcW w:w="1800" w:type="dxa"/>
+          </w:tcPr>
+          <w:p>
+            <w:pPr>
+              <w:spacing w:after="40" w:line="260" w:lineRule="auto"/>
+              <w:ind w:left="57" w:right="57"/>
+            </w:pPr>
+            <w:r>
+              <w:rPr>
+                <w:rFonts w:ascii="Consolas" w:eastAsia="Consolas" w:hAnsi="Consolas" w:cs="Consolas"/>
+                <w:sz w:val="21"/>
+                <w:szCs w:val="21"/>
+              </w:rPr>
+              <w:t>TIMESTAMPTZ</w:t>
+            </w:r>
+          </w:p>
+        </w:tc>
+        <w:tc>
+          <w:tcPr>
+            <w:tcW w:w="5226" w:type="dxa"/>
+          </w:tcPr>
+          <w:p>
+            <w:pPr>
+              <w:spacing w:after="40" w:line="260" w:lineRule="auto"/>
+              <w:ind w:left="57" w:right="57"/>
+            </w:pPr>
+            <w:r>
+              <w:rPr>
+                <w:sz w:val="21"/>
+                <w:szCs w:val="21"/>
+              </w:rPr>
+              <w:t>NULL cho tới khi bị thu hồi (logout hoặc phát hiện tái sử dụng)</w:t>
+            </w:r>
+          </w:p>
+        </w:tc>
+      </w:tr>
+      <w:tr>
+        <w:tc>
+          <w:tcPr>
+            <w:tcW w:w="2000" w:type="dxa"/>
+          </w:tcPr>
+          <w:p>
+            <w:pPr>
+              <w:spacing w:after="40" w:line="260" w:lineRule="auto"/>
+              <w:ind w:left="57" w:right="57"/>
+            </w:pPr>
+            <w:r>
+              <w:rPr>
+                <w:rFonts w:ascii="Consolas" w:eastAsia="Consolas" w:hAnsi="Consolas" w:cs="Consolas"/>
+                <w:sz w:val="21"/>
+                <w:szCs w:val="21"/>
+              </w:rPr>
+              <w:t>created_at</w:t>
+            </w:r>
+          </w:p>
+        </w:tc>
+        <w:tc>
+          <w:tcPr>
+            <w:tcW w:w="1800" w:type="dxa"/>
+          </w:tcPr>
+          <w:p>
+            <w:pPr>
+              <w:spacing w:after="40" w:line="260" w:lineRule="auto"/>
+              <w:ind w:left="57" w:right="57"/>
+            </w:pPr>
+            <w:r>
+              <w:rPr>
+                <w:rFonts w:ascii="Consolas" w:eastAsia="Consolas" w:hAnsi="Consolas" w:cs="Consolas"/>
+                <w:sz w:val="21"/>
+                <w:szCs w:val="21"/>
+              </w:rPr>
+              <w:t>TIMESTAMPTZ</w:t>
+            </w:r>
+          </w:p>
+        </w:tc>
+        <w:tc>
+          <w:tcPr>
+            <w:tcW w:w="5226" w:type="dxa"/>
+          </w:tcPr>
+          <w:p>
+            <w:pPr>
+              <w:spacing w:after="40" w:line="260" w:lineRule="auto"/>
+              <w:ind w:left="57" w:right="57"/>
+            </w:pPr>
+            <w:r>
+              <w:rPr>
+                <w:sz w:val="21"/>
+                <w:szCs w:val="21"/>
+              </w:rPr>
+              <w:t>DEFAULT now()</w:t>
             </w:r>
           </w:p>
         </w:tc>
@@ -2595,12 +1991,6 @@
         <w:gridCol w:w="5226"/>
       </w:tblGrid>
       <w:tr>
-        <w:tblPrEx>
-          <w:tblCellMar>
-            <w:top w:w="0" w:type="dxa"/>
-            <w:bottom w:w="0" w:type="dxa"/>
-          </w:tblCellMar>
-        </w:tblPrEx>
         <w:trPr>
           <w:tblHeader/>
         </w:trPr>
@@ -2669,12 +2059,6 @@
         </w:tc>
       </w:tr>
       <w:tr>
-        <w:tblPrEx>
-          <w:tblCellMar>
-            <w:top w:w="0" w:type="dxa"/>
-            <w:bottom w:w="0" w:type="dxa"/>
-          </w:tblCellMar>
-        </w:tblPrEx>
         <w:tc>
           <w:tcPr>
             <w:tcW w:w="2000" w:type="dxa"/>
@@ -2733,12 +2117,6 @@
         </w:tc>
       </w:tr>
       <w:tr>
-        <w:tblPrEx>
-          <w:tblCellMar>
-            <w:top w:w="0" w:type="dxa"/>
-            <w:bottom w:w="0" w:type="dxa"/>
-          </w:tblCellMar>
-        </w:tblPrEx>
         <w:tc>
           <w:tcPr>
             <w:tcW w:w="2000" w:type="dxa"/>
@@ -2797,12 +2175,6 @@
         </w:tc>
       </w:tr>
       <w:tr>
-        <w:tblPrEx>
-          <w:tblCellMar>
-            <w:top w:w="0" w:type="dxa"/>
-            <w:bottom w:w="0" w:type="dxa"/>
-          </w:tblCellMar>
-        </w:tblPrEx>
         <w:tc>
           <w:tcPr>
             <w:tcW w:w="2000" w:type="dxa"/>
@@ -2861,12 +2233,6 @@
         </w:tc>
       </w:tr>
       <w:tr>
-        <w:tblPrEx>
-          <w:tblCellMar>
-            <w:top w:w="0" w:type="dxa"/>
-            <w:bottom w:w="0" w:type="dxa"/>
-          </w:tblCellMar>
-        </w:tblPrEx>
         <w:tc>
           <w:tcPr>
             <w:tcW w:w="2000" w:type="dxa"/>
@@ -2925,12 +2291,6 @@
         </w:tc>
       </w:tr>
       <w:tr>
-        <w:tblPrEx>
-          <w:tblCellMar>
-            <w:top w:w="0" w:type="dxa"/>
-            <w:bottom w:w="0" w:type="dxa"/>
-          </w:tblCellMar>
-        </w:tblPrEx>
         <w:tc>
           <w:tcPr>
             <w:tcW w:w="2000" w:type="dxa"/>
@@ -2989,12 +2349,6 @@
         </w:tc>
       </w:tr>
       <w:tr>
-        <w:tblPrEx>
-          <w:tblCellMar>
-            <w:top w:w="0" w:type="dxa"/>
-            <w:bottom w:w="0" w:type="dxa"/>
-          </w:tblCellMar>
-        </w:tblPrEx>
         <w:tc>
           <w:tcPr>
             <w:tcW w:w="2000" w:type="dxa"/>
@@ -3053,12 +2407,6 @@
         </w:tc>
       </w:tr>
       <w:tr>
-        <w:tblPrEx>
-          <w:tblCellMar>
-            <w:top w:w="0" w:type="dxa"/>
-            <w:bottom w:w="0" w:type="dxa"/>
-          </w:tblCellMar>
-        </w:tblPrEx>
         <w:tc>
           <w:tcPr>
             <w:tcW w:w="2000" w:type="dxa"/>
@@ -3181,12 +2529,6 @@
         <w:gridCol w:w="2984"/>
       </w:tblGrid>
       <w:tr>
-        <w:tblPrEx>
-          <w:tblCellMar>
-            <w:top w:w="0" w:type="dxa"/>
-            <w:bottom w:w="0" w:type="dxa"/>
-          </w:tblCellMar>
-        </w:tblPrEx>
         <w:trPr>
           <w:tblHeader/>
         </w:trPr>
@@ -3255,12 +2597,6 @@
         </w:tc>
       </w:tr>
       <w:tr>
-        <w:tblPrEx>
-          <w:tblCellMar>
-            <w:top w:w="0" w:type="dxa"/>
-            <w:bottom w:w="0" w:type="dxa"/>
-          </w:tblCellMar>
-        </w:tblPrEx>
         <w:tc>
           <w:tcPr>
             <w:tcW w:w="2000" w:type="dxa"/>
@@ -3319,12 +2655,6 @@
         </w:tc>
       </w:tr>
       <w:tr>
-        <w:tblPrEx>
-          <w:tblCellMar>
-            <w:top w:w="0" w:type="dxa"/>
-            <w:bottom w:w="0" w:type="dxa"/>
-          </w:tblCellMar>
-        </w:tblPrEx>
         <w:tc>
           <w:tcPr>
             <w:tcW w:w="2000" w:type="dxa"/>
@@ -3383,12 +2713,6 @@
         </w:tc>
       </w:tr>
       <w:tr>
-        <w:tblPrEx>
-          <w:tblCellMar>
-            <w:top w:w="0" w:type="dxa"/>
-            <w:bottom w:w="0" w:type="dxa"/>
-          </w:tblCellMar>
-        </w:tblPrEx>
         <w:tc>
           <w:tcPr>
             <w:tcW w:w="2000" w:type="dxa"/>
@@ -3447,12 +2771,6 @@
         </w:tc>
       </w:tr>
       <w:tr>
-        <w:tblPrEx>
-          <w:tblCellMar>
-            <w:top w:w="0" w:type="dxa"/>
-            <w:bottom w:w="0" w:type="dxa"/>
-          </w:tblCellMar>
-        </w:tblPrEx>
         <w:tc>
           <w:tcPr>
             <w:tcW w:w="2000" w:type="dxa"/>
@@ -3511,12 +2829,6 @@
         </w:tc>
       </w:tr>
       <w:tr>
-        <w:tblPrEx>
-          <w:tblCellMar>
-            <w:top w:w="0" w:type="dxa"/>
-            <w:bottom w:w="0" w:type="dxa"/>
-          </w:tblCellMar>
-        </w:tblPrEx>
         <w:tc>
           <w:tcPr>
             <w:tcW w:w="2000" w:type="dxa"/>
@@ -3568,12 +2880,6 @@
         </w:tc>
       </w:tr>
       <w:tr>
-        <w:tblPrEx>
-          <w:tblCellMar>
-            <w:top w:w="0" w:type="dxa"/>
-            <w:bottom w:w="0" w:type="dxa"/>
-          </w:tblCellMar>
-        </w:tblPrEx>
         <w:tc>
           <w:tcPr>
             <w:tcW w:w="2000" w:type="dxa"/>
@@ -3632,12 +2938,6 @@
         </w:tc>
       </w:tr>
       <w:tr>
-        <w:tblPrEx>
-          <w:tblCellMar>
-            <w:top w:w="0" w:type="dxa"/>
-            <w:bottom w:w="0" w:type="dxa"/>
-          </w:tblCellMar>
-        </w:tblPrEx>
         <w:tc>
           <w:tcPr>
             <w:tcW w:w="2000" w:type="dxa"/>
@@ -3689,12 +2989,6 @@
         </w:tc>
       </w:tr>
       <w:tr>
-        <w:tblPrEx>
-          <w:tblCellMar>
-            <w:top w:w="0" w:type="dxa"/>
-            <w:bottom w:w="0" w:type="dxa"/>
-          </w:tblCellMar>
-        </w:tblPrEx>
         <w:tc>
           <w:tcPr>
             <w:tcW w:w="2000" w:type="dxa"/>
@@ -3746,12 +3040,6 @@
         </w:tc>
       </w:tr>
       <w:tr>
-        <w:tblPrEx>
-          <w:tblCellMar>
-            <w:top w:w="0" w:type="dxa"/>
-            <w:bottom w:w="0" w:type="dxa"/>
-          </w:tblCellMar>
-        </w:tblPrEx>
         <w:tc>
           <w:tcPr>
             <w:tcW w:w="2000" w:type="dxa"/>
@@ -3810,12 +3098,6 @@
         </w:tc>
       </w:tr>
       <w:tr>
-        <w:tblPrEx>
-          <w:tblCellMar>
-            <w:top w:w="0" w:type="dxa"/>
-            <w:bottom w:w="0" w:type="dxa"/>
-          </w:tblCellMar>
-        </w:tblPrEx>
         <w:tc>
           <w:tcPr>
             <w:tcW w:w="2000" w:type="dxa"/>
@@ -3874,12 +3156,6 @@
         </w:tc>
       </w:tr>
       <w:tr>
-        <w:tblPrEx>
-          <w:tblCellMar>
-            <w:top w:w="0" w:type="dxa"/>
-            <w:bottom w:w="0" w:type="dxa"/>
-          </w:tblCellMar>
-        </w:tblPrEx>
         <w:tc>
           <w:tcPr>
             <w:tcW w:w="2000" w:type="dxa"/>
@@ -3938,12 +3214,6 @@
         </w:tc>
       </w:tr>
       <w:tr>
-        <w:tblPrEx>
-          <w:tblCellMar>
-            <w:top w:w="0" w:type="dxa"/>
-            <w:bottom w:w="0" w:type="dxa"/>
-          </w:tblCellMar>
-        </w:tblPrEx>
         <w:tc>
           <w:tcPr>
             <w:tcW w:w="2000" w:type="dxa"/>
@@ -4002,12 +3272,6 @@
         </w:tc>
       </w:tr>
       <w:tr>
-        <w:tblPrEx>
-          <w:tblCellMar>
-            <w:top w:w="0" w:type="dxa"/>
-            <w:bottom w:w="0" w:type="dxa"/>
-          </w:tblCellMar>
-        </w:tblPrEx>
         <w:tc>
           <w:tcPr>
             <w:tcW w:w="2000" w:type="dxa"/>
@@ -4066,12 +3330,6 @@
         </w:tc>
       </w:tr>
       <w:tr>
-        <w:tblPrEx>
-          <w:tblCellMar>
-            <w:top w:w="0" w:type="dxa"/>
-            <w:bottom w:w="0" w:type="dxa"/>
-          </w:tblCellMar>
-        </w:tblPrEx>
         <w:tc>
           <w:tcPr>
             <w:tcW w:w="2000" w:type="dxa"/>
@@ -4178,12 +3436,6 @@
         <w:gridCol w:w="3250"/>
       </w:tblGrid>
       <w:tr>
-        <w:tblPrEx>
-          <w:tblCellMar>
-            <w:top w:w="0" w:type="dxa"/>
-            <w:bottom w:w="0" w:type="dxa"/>
-          </w:tblCellMar>
-        </w:tblPrEx>
         <w:trPr>
           <w:tblHeader/>
         </w:trPr>
@@ -4204,6 +3456,7 @@
                 <w:sz w:val="21"/>
                 <w:szCs w:val="21"/>
               </w:rPr>
+              <w:lastRenderedPageBreak/>
               <w:t>Trường</w:t>
             </w:r>
           </w:p>
@@ -4252,12 +3505,6 @@
         </w:tc>
       </w:tr>
       <w:tr>
-        <w:tblPrEx>
-          <w:tblCellMar>
-            <w:top w:w="0" w:type="dxa"/>
-            <w:bottom w:w="0" w:type="dxa"/>
-          </w:tblCellMar>
-        </w:tblPrEx>
         <w:tc>
           <w:tcPr>
             <w:tcW w:w="2000" w:type="dxa"/>
@@ -4316,12 +3563,6 @@
         </w:tc>
       </w:tr>
       <w:tr>
-        <w:tblPrEx>
-          <w:tblCellMar>
-            <w:top w:w="0" w:type="dxa"/>
-            <w:bottom w:w="0" w:type="dxa"/>
-          </w:tblCellMar>
-        </w:tblPrEx>
         <w:tc>
           <w:tcPr>
             <w:tcW w:w="2000" w:type="dxa"/>
@@ -4380,12 +3621,6 @@
         </w:tc>
       </w:tr>
       <w:tr>
-        <w:tblPrEx>
-          <w:tblCellMar>
-            <w:top w:w="0" w:type="dxa"/>
-            <w:bottom w:w="0" w:type="dxa"/>
-          </w:tblCellMar>
-        </w:tblPrEx>
         <w:tc>
           <w:tcPr>
             <w:tcW w:w="2000" w:type="dxa"/>
@@ -4437,28 +3672,21 @@
         </w:tc>
       </w:tr>
       <w:tr>
-        <w:tblPrEx>
-          <w:tblCellMar>
-            <w:top w:w="0" w:type="dxa"/>
-            <w:bottom w:w="0" w:type="dxa"/>
-          </w:tblCellMar>
-        </w:tblPrEx>
-        <w:tc>
-          <w:tcPr>
-            <w:tcW w:w="2000" w:type="dxa"/>
-          </w:tcPr>
-          <w:p>
-            <w:pPr>
-              <w:spacing w:after="40" w:line="260" w:lineRule="auto"/>
-              <w:ind w:left="57" w:right="57"/>
-            </w:pPr>
-            <w:r>
-              <w:rPr>
-                <w:rFonts w:ascii="Consolas" w:eastAsia="Consolas" w:hAnsi="Consolas" w:cs="Consolas"/>
-                <w:sz w:val="21"/>
-                <w:szCs w:val="21"/>
-              </w:rPr>
-              <w:lastRenderedPageBreak/>
+        <w:tc>
+          <w:tcPr>
+            <w:tcW w:w="2000" w:type="dxa"/>
+          </w:tcPr>
+          <w:p>
+            <w:pPr>
+              <w:spacing w:after="40" w:line="260" w:lineRule="auto"/>
+              <w:ind w:left="57" w:right="57"/>
+            </w:pPr>
+            <w:r>
+              <w:rPr>
+                <w:rFonts w:ascii="Consolas" w:eastAsia="Consolas" w:hAnsi="Consolas" w:cs="Consolas"/>
+                <w:sz w:val="21"/>
+                <w:szCs w:val="21"/>
+              </w:rPr>
               <w:t>file_url</w:t>
             </w:r>
           </w:p>
@@ -4502,12 +3730,6 @@
         </w:tc>
       </w:tr>
       <w:tr>
-        <w:tblPrEx>
-          <w:tblCellMar>
-            <w:top w:w="0" w:type="dxa"/>
-            <w:bottom w:w="0" w:type="dxa"/>
-          </w:tblCellMar>
-        </w:tblPrEx>
         <w:tc>
           <w:tcPr>
             <w:tcW w:w="2000" w:type="dxa"/>
@@ -4566,12 +3788,6 @@
         </w:tc>
       </w:tr>
       <w:tr>
-        <w:tblPrEx>
-          <w:tblCellMar>
-            <w:top w:w="0" w:type="dxa"/>
-            <w:bottom w:w="0" w:type="dxa"/>
-          </w:tblCellMar>
-        </w:tblPrEx>
         <w:tc>
           <w:tcPr>
             <w:tcW w:w="2000" w:type="dxa"/>
@@ -4678,12 +3894,6 @@
         <w:gridCol w:w="5226"/>
       </w:tblGrid>
       <w:tr>
-        <w:tblPrEx>
-          <w:tblCellMar>
-            <w:top w:w="0" w:type="dxa"/>
-            <w:bottom w:w="0" w:type="dxa"/>
-          </w:tblCellMar>
-        </w:tblPrEx>
         <w:trPr>
           <w:tblHeader/>
         </w:trPr>
@@ -4752,12 +3962,6 @@
         </w:tc>
       </w:tr>
       <w:tr>
-        <w:tblPrEx>
-          <w:tblCellMar>
-            <w:top w:w="0" w:type="dxa"/>
-            <w:bottom w:w="0" w:type="dxa"/>
-          </w:tblCellMar>
-        </w:tblPrEx>
         <w:tc>
           <w:tcPr>
             <w:tcW w:w="2000" w:type="dxa"/>
@@ -4816,12 +4020,6 @@
         </w:tc>
       </w:tr>
       <w:tr>
-        <w:tblPrEx>
-          <w:tblCellMar>
-            <w:top w:w="0" w:type="dxa"/>
-            <w:bottom w:w="0" w:type="dxa"/>
-          </w:tblCellMar>
-        </w:tblPrEx>
         <w:tc>
           <w:tcPr>
             <w:tcW w:w="2000" w:type="dxa"/>
@@ -4880,12 +4078,6 @@
         </w:tc>
       </w:tr>
       <w:tr>
-        <w:tblPrEx>
-          <w:tblCellMar>
-            <w:top w:w="0" w:type="dxa"/>
-            <w:bottom w:w="0" w:type="dxa"/>
-          </w:tblCellMar>
-        </w:tblPrEx>
         <w:tc>
           <w:tcPr>
             <w:tcW w:w="2000" w:type="dxa"/>
@@ -4944,12 +4136,6 @@
         </w:tc>
       </w:tr>
       <w:tr>
-        <w:tblPrEx>
-          <w:tblCellMar>
-            <w:top w:w="0" w:type="dxa"/>
-            <w:bottom w:w="0" w:type="dxa"/>
-          </w:tblCellMar>
-        </w:tblPrEx>
         <w:tc>
           <w:tcPr>
             <w:tcW w:w="2000" w:type="dxa"/>
@@ -5008,12 +4194,6 @@
         </w:tc>
       </w:tr>
       <w:tr>
-        <w:tblPrEx>
-          <w:tblCellMar>
-            <w:top w:w="0" w:type="dxa"/>
-            <w:bottom w:w="0" w:type="dxa"/>
-          </w:tblCellMar>
-        </w:tblPrEx>
         <w:tc>
           <w:tcPr>
             <w:tcW w:w="2000" w:type="dxa"/>
@@ -5072,12 +4252,6 @@
         </w:tc>
       </w:tr>
       <w:tr>
-        <w:tblPrEx>
-          <w:tblCellMar>
-            <w:top w:w="0" w:type="dxa"/>
-            <w:bottom w:w="0" w:type="dxa"/>
-          </w:tblCellMar>
-        </w:tblPrEx>
         <w:tc>
           <w:tcPr>
             <w:tcW w:w="2000" w:type="dxa"/>
@@ -5129,12 +4303,6 @@
         </w:tc>
       </w:tr>
       <w:tr>
-        <w:tblPrEx>
-          <w:tblCellMar>
-            <w:top w:w="0" w:type="dxa"/>
-            <w:bottom w:w="0" w:type="dxa"/>
-          </w:tblCellMar>
-        </w:tblPrEx>
         <w:tc>
           <w:tcPr>
             <w:tcW w:w="2000" w:type="dxa"/>
@@ -5241,12 +4409,6 @@
         <w:gridCol w:w="3610"/>
       </w:tblGrid>
       <w:tr>
-        <w:tblPrEx>
-          <w:tblCellMar>
-            <w:top w:w="0" w:type="dxa"/>
-            <w:bottom w:w="0" w:type="dxa"/>
-          </w:tblCellMar>
-        </w:tblPrEx>
         <w:trPr>
           <w:tblHeader/>
         </w:trPr>
@@ -5315,12 +4477,6 @@
         </w:tc>
       </w:tr>
       <w:tr>
-        <w:tblPrEx>
-          <w:tblCellMar>
-            <w:top w:w="0" w:type="dxa"/>
-            <w:bottom w:w="0" w:type="dxa"/>
-          </w:tblCellMar>
-        </w:tblPrEx>
         <w:tc>
           <w:tcPr>
             <w:tcW w:w="1983" w:type="dxa"/>
@@ -5379,12 +4535,6 @@
         </w:tc>
       </w:tr>
       <w:tr>
-        <w:tblPrEx>
-          <w:tblCellMar>
-            <w:top w:w="0" w:type="dxa"/>
-            <w:bottom w:w="0" w:type="dxa"/>
-          </w:tblCellMar>
-        </w:tblPrEx>
         <w:tc>
           <w:tcPr>
             <w:tcW w:w="1983" w:type="dxa"/>
@@ -5443,12 +4593,6 @@
         </w:tc>
       </w:tr>
       <w:tr>
-        <w:tblPrEx>
-          <w:tblCellMar>
-            <w:top w:w="0" w:type="dxa"/>
-            <w:bottom w:w="0" w:type="dxa"/>
-          </w:tblCellMar>
-        </w:tblPrEx>
         <w:tc>
           <w:tcPr>
             <w:tcW w:w="1983" w:type="dxa"/>
@@ -5507,12 +4651,6 @@
         </w:tc>
       </w:tr>
       <w:tr>
-        <w:tblPrEx>
-          <w:tblCellMar>
-            <w:top w:w="0" w:type="dxa"/>
-            <w:bottom w:w="0" w:type="dxa"/>
-          </w:tblCellMar>
-        </w:tblPrEx>
         <w:tc>
           <w:tcPr>
             <w:tcW w:w="1983" w:type="dxa"/>
@@ -5571,12 +4709,6 @@
         </w:tc>
       </w:tr>
       <w:tr>
-        <w:tblPrEx>
-          <w:tblCellMar>
-            <w:top w:w="0" w:type="dxa"/>
-            <w:bottom w:w="0" w:type="dxa"/>
-          </w:tblCellMar>
-        </w:tblPrEx>
         <w:tc>
           <w:tcPr>
             <w:tcW w:w="1983" w:type="dxa"/>
@@ -5635,12 +4767,6 @@
         </w:tc>
       </w:tr>
       <w:tr>
-        <w:tblPrEx>
-          <w:tblCellMar>
-            <w:top w:w="0" w:type="dxa"/>
-            <w:bottom w:w="0" w:type="dxa"/>
-          </w:tblCellMar>
-        </w:tblPrEx>
         <w:tc>
           <w:tcPr>
             <w:tcW w:w="1983" w:type="dxa"/>
@@ -5692,12 +4818,6 @@
         </w:tc>
       </w:tr>
       <w:tr>
-        <w:tblPrEx>
-          <w:tblCellMar>
-            <w:top w:w="0" w:type="dxa"/>
-            <w:bottom w:w="0" w:type="dxa"/>
-          </w:tblCellMar>
-        </w:tblPrEx>
         <w:tc>
           <w:tcPr>
             <w:tcW w:w="1983" w:type="dxa"/>
@@ -5756,12 +4876,6 @@
         </w:tc>
       </w:tr>
       <w:tr>
-        <w:tblPrEx>
-          <w:tblCellMar>
-            <w:top w:w="0" w:type="dxa"/>
-            <w:bottom w:w="0" w:type="dxa"/>
-          </w:tblCellMar>
-        </w:tblPrEx>
         <w:tc>
           <w:tcPr>
             <w:tcW w:w="1983" w:type="dxa"/>
@@ -5813,12 +4927,6 @@
         </w:tc>
       </w:tr>
       <w:tr>
-        <w:tblPrEx>
-          <w:tblCellMar>
-            <w:top w:w="0" w:type="dxa"/>
-            <w:bottom w:w="0" w:type="dxa"/>
-          </w:tblCellMar>
-        </w:tblPrEx>
         <w:tc>
           <w:tcPr>
             <w:tcW w:w="1983" w:type="dxa"/>
@@ -5877,12 +4985,6 @@
         </w:tc>
       </w:tr>
       <w:tr>
-        <w:tblPrEx>
-          <w:tblCellMar>
-            <w:top w:w="0" w:type="dxa"/>
-            <w:bottom w:w="0" w:type="dxa"/>
-          </w:tblCellMar>
-        </w:tblPrEx>
         <w:tc>
           <w:tcPr>
             <w:tcW w:w="1983" w:type="dxa"/>
@@ -5934,12 +5036,6 @@
         </w:tc>
       </w:tr>
       <w:tr>
-        <w:tblPrEx>
-          <w:tblCellMar>
-            <w:top w:w="0" w:type="dxa"/>
-            <w:bottom w:w="0" w:type="dxa"/>
-          </w:tblCellMar>
-        </w:tblPrEx>
         <w:tc>
           <w:tcPr>
             <w:tcW w:w="1983" w:type="dxa"/>
@@ -5998,12 +5094,6 @@
         </w:tc>
       </w:tr>
       <w:tr>
-        <w:tblPrEx>
-          <w:tblCellMar>
-            <w:top w:w="0" w:type="dxa"/>
-            <w:bottom w:w="0" w:type="dxa"/>
-          </w:tblCellMar>
-        </w:tblPrEx>
         <w:tc>
           <w:tcPr>
             <w:tcW w:w="1983" w:type="dxa"/>
@@ -6088,12 +5178,6 @@
         </w:tc>
       </w:tr>
       <w:tr>
-        <w:tblPrEx>
-          <w:tblCellMar>
-            <w:top w:w="0" w:type="dxa"/>
-            <w:bottom w:w="0" w:type="dxa"/>
-          </w:tblCellMar>
-        </w:tblPrEx>
         <w:tc>
           <w:tcPr>
             <w:tcW w:w="1983" w:type="dxa"/>
@@ -6152,12 +5236,6 @@
         </w:tc>
       </w:tr>
       <w:tr>
-        <w:tblPrEx>
-          <w:tblCellMar>
-            <w:top w:w="0" w:type="dxa"/>
-            <w:bottom w:w="0" w:type="dxa"/>
-          </w:tblCellMar>
-        </w:tblPrEx>
         <w:tc>
           <w:tcPr>
             <w:tcW w:w="1983" w:type="dxa"/>
@@ -6216,12 +5294,6 @@
         </w:tc>
       </w:tr>
       <w:tr>
-        <w:tblPrEx>
-          <w:tblCellMar>
-            <w:top w:w="0" w:type="dxa"/>
-            <w:bottom w:w="0" w:type="dxa"/>
-          </w:tblCellMar>
-        </w:tblPrEx>
         <w:tc>
           <w:tcPr>
             <w:tcW w:w="1983" w:type="dxa"/>
@@ -6280,12 +5352,6 @@
         </w:tc>
       </w:tr>
       <w:tr>
-        <w:tblPrEx>
-          <w:tblCellMar>
-            <w:top w:w="0" w:type="dxa"/>
-            <w:bottom w:w="0" w:type="dxa"/>
-          </w:tblCellMar>
-        </w:tblPrEx>
         <w:tc>
           <w:tcPr>
             <w:tcW w:w="1983" w:type="dxa"/>
@@ -6344,12 +5410,6 @@
         </w:tc>
       </w:tr>
       <w:tr>
-        <w:tblPrEx>
-          <w:tblCellMar>
-            <w:top w:w="0" w:type="dxa"/>
-            <w:bottom w:w="0" w:type="dxa"/>
-          </w:tblCellMar>
-        </w:tblPrEx>
         <w:tc>
           <w:tcPr>
             <w:tcW w:w="1983" w:type="dxa"/>
@@ -6408,12 +5468,6 @@
         </w:tc>
       </w:tr>
       <w:tr>
-        <w:tblPrEx>
-          <w:tblCellMar>
-            <w:top w:w="0" w:type="dxa"/>
-            <w:bottom w:w="0" w:type="dxa"/>
-          </w:tblCellMar>
-        </w:tblPrEx>
         <w:tc>
           <w:tcPr>
             <w:tcW w:w="1983" w:type="dxa"/>
@@ -6429,6 +5483,7 @@
                 <w:sz w:val="21"/>
                 <w:szCs w:val="21"/>
               </w:rPr>
+              <w:lastRenderedPageBreak/>
               <w:t>created_at / updated_at</w:t>
             </w:r>
           </w:p>
@@ -6513,12 +5568,6 @@
         <w:gridCol w:w="5226"/>
       </w:tblGrid>
       <w:tr>
-        <w:tblPrEx>
-          <w:tblCellMar>
-            <w:top w:w="0" w:type="dxa"/>
-            <w:bottom w:w="0" w:type="dxa"/>
-          </w:tblCellMar>
-        </w:tblPrEx>
         <w:trPr>
           <w:tblHeader/>
         </w:trPr>
@@ -6539,7 +5588,6 @@
                 <w:sz w:val="21"/>
                 <w:szCs w:val="21"/>
               </w:rPr>
-              <w:lastRenderedPageBreak/>
               <w:t>Trường</w:t>
             </w:r>
           </w:p>
@@ -6588,12 +5636,6 @@
         </w:tc>
       </w:tr>
       <w:tr>
-        <w:tblPrEx>
-          <w:tblCellMar>
-            <w:top w:w="0" w:type="dxa"/>
-            <w:bottom w:w="0" w:type="dxa"/>
-          </w:tblCellMar>
-        </w:tblPrEx>
         <w:tc>
           <w:tcPr>
             <w:tcW w:w="2000" w:type="dxa"/>
@@ -6652,12 +5694,6 @@
         </w:tc>
       </w:tr>
       <w:tr>
-        <w:tblPrEx>
-          <w:tblCellMar>
-            <w:top w:w="0" w:type="dxa"/>
-            <w:bottom w:w="0" w:type="dxa"/>
-          </w:tblCellMar>
-        </w:tblPrEx>
         <w:tc>
           <w:tcPr>
             <w:tcW w:w="2000" w:type="dxa"/>
@@ -6716,12 +5752,6 @@
         </w:tc>
       </w:tr>
       <w:tr>
-        <w:tblPrEx>
-          <w:tblCellMar>
-            <w:top w:w="0" w:type="dxa"/>
-            <w:bottom w:w="0" w:type="dxa"/>
-          </w:tblCellMar>
-        </w:tblPrEx>
         <w:tc>
           <w:tcPr>
             <w:tcW w:w="2000" w:type="dxa"/>
@@ -6780,12 +5810,6 @@
         </w:tc>
       </w:tr>
       <w:tr>
-        <w:tblPrEx>
-          <w:tblCellMar>
-            <w:top w:w="0" w:type="dxa"/>
-            <w:bottom w:w="0" w:type="dxa"/>
-          </w:tblCellMar>
-        </w:tblPrEx>
         <w:tc>
           <w:tcPr>
             <w:tcW w:w="2000" w:type="dxa"/>
@@ -6892,12 +5916,6 @@
         <w:gridCol w:w="3553"/>
       </w:tblGrid>
       <w:tr>
-        <w:tblPrEx>
-          <w:tblCellMar>
-            <w:top w:w="0" w:type="dxa"/>
-            <w:bottom w:w="0" w:type="dxa"/>
-          </w:tblCellMar>
-        </w:tblPrEx>
         <w:trPr>
           <w:tblHeader/>
         </w:trPr>
@@ -6966,12 +5984,6 @@
         </w:tc>
       </w:tr>
       <w:tr>
-        <w:tblPrEx>
-          <w:tblCellMar>
-            <w:top w:w="0" w:type="dxa"/>
-            <w:bottom w:w="0" w:type="dxa"/>
-          </w:tblCellMar>
-        </w:tblPrEx>
         <w:tc>
           <w:tcPr>
             <w:tcW w:w="2000" w:type="dxa"/>
@@ -7030,12 +6042,6 @@
         </w:tc>
       </w:tr>
       <w:tr>
-        <w:tblPrEx>
-          <w:tblCellMar>
-            <w:top w:w="0" w:type="dxa"/>
-            <w:bottom w:w="0" w:type="dxa"/>
-          </w:tblCellMar>
-        </w:tblPrEx>
         <w:tc>
           <w:tcPr>
             <w:tcW w:w="2000" w:type="dxa"/>
@@ -7094,12 +6100,6 @@
         </w:tc>
       </w:tr>
       <w:tr>
-        <w:tblPrEx>
-          <w:tblCellMar>
-            <w:top w:w="0" w:type="dxa"/>
-            <w:bottom w:w="0" w:type="dxa"/>
-          </w:tblCellMar>
-        </w:tblPrEx>
         <w:tc>
           <w:tcPr>
             <w:tcW w:w="2000" w:type="dxa"/>
@@ -7158,12 +6158,6 @@
         </w:tc>
       </w:tr>
       <w:tr>
-        <w:tblPrEx>
-          <w:tblCellMar>
-            <w:top w:w="0" w:type="dxa"/>
-            <w:bottom w:w="0" w:type="dxa"/>
-          </w:tblCellMar>
-        </w:tblPrEx>
         <w:tc>
           <w:tcPr>
             <w:tcW w:w="2000" w:type="dxa"/>
@@ -7222,12 +6216,6 @@
         </w:tc>
       </w:tr>
       <w:tr>
-        <w:tblPrEx>
-          <w:tblCellMar>
-            <w:top w:w="0" w:type="dxa"/>
-            <w:bottom w:w="0" w:type="dxa"/>
-          </w:tblCellMar>
-        </w:tblPrEx>
         <w:tc>
           <w:tcPr>
             <w:tcW w:w="2000" w:type="dxa"/>
@@ -7327,12 +6315,6 @@
         <w:gridCol w:w="5226"/>
       </w:tblGrid>
       <w:tr>
-        <w:tblPrEx>
-          <w:tblCellMar>
-            <w:top w:w="0" w:type="dxa"/>
-            <w:bottom w:w="0" w:type="dxa"/>
-          </w:tblCellMar>
-        </w:tblPrEx>
         <w:trPr>
           <w:tblHeader/>
         </w:trPr>
@@ -7401,12 +6383,6 @@
         </w:tc>
       </w:tr>
       <w:tr>
-        <w:tblPrEx>
-          <w:tblCellMar>
-            <w:top w:w="0" w:type="dxa"/>
-            <w:bottom w:w="0" w:type="dxa"/>
-          </w:tblCellMar>
-        </w:tblPrEx>
         <w:tc>
           <w:tcPr>
             <w:tcW w:w="2000" w:type="dxa"/>
@@ -7465,12 +6441,6 @@
         </w:tc>
       </w:tr>
       <w:tr>
-        <w:tblPrEx>
-          <w:tblCellMar>
-            <w:top w:w="0" w:type="dxa"/>
-            <w:bottom w:w="0" w:type="dxa"/>
-          </w:tblCellMar>
-        </w:tblPrEx>
         <w:tc>
           <w:tcPr>
             <w:tcW w:w="2000" w:type="dxa"/>
@@ -7529,12 +6499,6 @@
         </w:tc>
       </w:tr>
       <w:tr>
-        <w:tblPrEx>
-          <w:tblCellMar>
-            <w:top w:w="0" w:type="dxa"/>
-            <w:bottom w:w="0" w:type="dxa"/>
-          </w:tblCellMar>
-        </w:tblPrEx>
         <w:tc>
           <w:tcPr>
             <w:tcW w:w="2000" w:type="dxa"/>
@@ -7593,12 +6557,6 @@
         </w:tc>
       </w:tr>
       <w:tr>
-        <w:tblPrEx>
-          <w:tblCellMar>
-            <w:top w:w="0" w:type="dxa"/>
-            <w:bottom w:w="0" w:type="dxa"/>
-          </w:tblCellMar>
-        </w:tblPrEx>
         <w:tc>
           <w:tcPr>
             <w:tcW w:w="2000" w:type="dxa"/>
@@ -7705,12 +6663,6 @@
         <w:gridCol w:w="5226"/>
       </w:tblGrid>
       <w:tr>
-        <w:tblPrEx>
-          <w:tblCellMar>
-            <w:top w:w="0" w:type="dxa"/>
-            <w:bottom w:w="0" w:type="dxa"/>
-          </w:tblCellMar>
-        </w:tblPrEx>
         <w:trPr>
           <w:tblHeader/>
         </w:trPr>
@@ -7779,12 +6731,6 @@
         </w:tc>
       </w:tr>
       <w:tr>
-        <w:tblPrEx>
-          <w:tblCellMar>
-            <w:top w:w="0" w:type="dxa"/>
-            <w:bottom w:w="0" w:type="dxa"/>
-          </w:tblCellMar>
-        </w:tblPrEx>
         <w:tc>
           <w:tcPr>
             <w:tcW w:w="2000" w:type="dxa"/>
@@ -7843,12 +6789,6 @@
         </w:tc>
       </w:tr>
       <w:tr>
-        <w:tblPrEx>
-          <w:tblCellMar>
-            <w:top w:w="0" w:type="dxa"/>
-            <w:bottom w:w="0" w:type="dxa"/>
-          </w:tblCellMar>
-        </w:tblPrEx>
         <w:tc>
           <w:tcPr>
             <w:tcW w:w="2000" w:type="dxa"/>
@@ -7907,12 +6847,6 @@
         </w:tc>
       </w:tr>
       <w:tr>
-        <w:tblPrEx>
-          <w:tblCellMar>
-            <w:top w:w="0" w:type="dxa"/>
-            <w:bottom w:w="0" w:type="dxa"/>
-          </w:tblCellMar>
-        </w:tblPrEx>
         <w:tc>
           <w:tcPr>
             <w:tcW w:w="2000" w:type="dxa"/>
@@ -7971,12 +6905,6 @@
         </w:tc>
       </w:tr>
       <w:tr>
-        <w:tblPrEx>
-          <w:tblCellMar>
-            <w:top w:w="0" w:type="dxa"/>
-            <w:bottom w:w="0" w:type="dxa"/>
-          </w:tblCellMar>
-        </w:tblPrEx>
         <w:tc>
           <w:tcPr>
             <w:tcW w:w="2000" w:type="dxa"/>
@@ -8035,12 +6963,6 @@
         </w:tc>
       </w:tr>
       <w:tr>
-        <w:tblPrEx>
-          <w:tblCellMar>
-            <w:top w:w="0" w:type="dxa"/>
-            <w:bottom w:w="0" w:type="dxa"/>
-          </w:tblCellMar>
-        </w:tblPrEx>
         <w:tc>
           <w:tcPr>
             <w:tcW w:w="2000" w:type="dxa"/>
@@ -8163,12 +7085,6 @@
         <w:gridCol w:w="4133"/>
       </w:tblGrid>
       <w:tr>
-        <w:tblPrEx>
-          <w:tblCellMar>
-            <w:top w:w="0" w:type="dxa"/>
-            <w:bottom w:w="0" w:type="dxa"/>
-          </w:tblCellMar>
-        </w:tblPrEx>
         <w:trPr>
           <w:tblHeader/>
         </w:trPr>
@@ -8237,12 +7153,6 @@
         </w:tc>
       </w:tr>
       <w:tr>
-        <w:tblPrEx>
-          <w:tblCellMar>
-            <w:top w:w="0" w:type="dxa"/>
-            <w:bottom w:w="0" w:type="dxa"/>
-          </w:tblCellMar>
-        </w:tblPrEx>
         <w:tc>
           <w:tcPr>
             <w:tcW w:w="2000" w:type="dxa"/>
@@ -8301,12 +7211,6 @@
         </w:tc>
       </w:tr>
       <w:tr>
-        <w:tblPrEx>
-          <w:tblCellMar>
-            <w:top w:w="0" w:type="dxa"/>
-            <w:bottom w:w="0" w:type="dxa"/>
-          </w:tblCellMar>
-        </w:tblPrEx>
         <w:tc>
           <w:tcPr>
             <w:tcW w:w="2000" w:type="dxa"/>
@@ -8365,12 +7269,6 @@
         </w:tc>
       </w:tr>
       <w:tr>
-        <w:tblPrEx>
-          <w:tblCellMar>
-            <w:top w:w="0" w:type="dxa"/>
-            <w:bottom w:w="0" w:type="dxa"/>
-          </w:tblCellMar>
-        </w:tblPrEx>
         <w:tc>
           <w:tcPr>
             <w:tcW w:w="2000" w:type="dxa"/>
@@ -8429,12 +7327,6 @@
         </w:tc>
       </w:tr>
       <w:tr>
-        <w:tblPrEx>
-          <w:tblCellMar>
-            <w:top w:w="0" w:type="dxa"/>
-            <w:bottom w:w="0" w:type="dxa"/>
-          </w:tblCellMar>
-        </w:tblPrEx>
         <w:tc>
           <w:tcPr>
             <w:tcW w:w="2000" w:type="dxa"/>
@@ -8493,27 +7385,22 @@
         </w:tc>
       </w:tr>
       <w:tr>
-        <w:tblPrEx>
-          <w:tblCellMar>
-            <w:top w:w="0" w:type="dxa"/>
-            <w:bottom w:w="0" w:type="dxa"/>
-          </w:tblCellMar>
-        </w:tblPrEx>
-        <w:tc>
-          <w:tcPr>
-            <w:tcW w:w="2000" w:type="dxa"/>
-          </w:tcPr>
-          <w:p>
-            <w:pPr>
-              <w:spacing w:after="40" w:line="260" w:lineRule="auto"/>
-              <w:ind w:left="57" w:right="57"/>
-            </w:pPr>
-            <w:r>
-              <w:rPr>
-                <w:rFonts w:ascii="Consolas" w:eastAsia="Consolas" w:hAnsi="Consolas" w:cs="Consolas"/>
-                <w:sz w:val="21"/>
-                <w:szCs w:val="21"/>
-              </w:rPr>
+        <w:tc>
+          <w:tcPr>
+            <w:tcW w:w="2000" w:type="dxa"/>
+          </w:tcPr>
+          <w:p>
+            <w:pPr>
+              <w:spacing w:after="40" w:line="260" w:lineRule="auto"/>
+              <w:ind w:left="57" w:right="57"/>
+            </w:pPr>
+            <w:r>
+              <w:rPr>
+                <w:rFonts w:ascii="Consolas" w:eastAsia="Consolas" w:hAnsi="Consolas" w:cs="Consolas"/>
+                <w:sz w:val="21"/>
+                <w:szCs w:val="21"/>
+              </w:rPr>
+              <w:lastRenderedPageBreak/>
               <w:t>capacity</w:t>
             </w:r>
           </w:p>
@@ -8557,12 +7444,6 @@
         </w:tc>
       </w:tr>
       <w:tr>
-        <w:tblPrEx>
-          <w:tblCellMar>
-            <w:top w:w="0" w:type="dxa"/>
-            <w:bottom w:w="0" w:type="dxa"/>
-          </w:tblCellMar>
-        </w:tblPrEx>
         <w:tc>
           <w:tcPr>
             <w:tcW w:w="2000" w:type="dxa"/>
@@ -8621,12 +7502,6 @@
         </w:tc>
       </w:tr>
       <w:tr>
-        <w:tblPrEx>
-          <w:tblCellMar>
-            <w:top w:w="0" w:type="dxa"/>
-            <w:bottom w:w="0" w:type="dxa"/>
-          </w:tblCellMar>
-        </w:tblPrEx>
         <w:tc>
           <w:tcPr>
             <w:tcW w:w="2000" w:type="dxa"/>
@@ -8703,7 +7578,6 @@
           <w:sz w:val="24"/>
           <w:szCs w:val="24"/>
         </w:rPr>
-        <w:lastRenderedPageBreak/>
         <w:t>Ghi chú kỹ thuật: khóa giữ chỗ (Inventory Locking)</w:t>
       </w:r>
     </w:p>
@@ -8790,12 +7664,6 @@
         <w:gridCol w:w="2288"/>
       </w:tblGrid>
       <w:tr>
-        <w:tblPrEx>
-          <w:tblCellMar>
-            <w:top w:w="0" w:type="dxa"/>
-            <w:bottom w:w="0" w:type="dxa"/>
-          </w:tblCellMar>
-        </w:tblPrEx>
         <w:trPr>
           <w:tblHeader/>
         </w:trPr>
@@ -8864,12 +7732,6 @@
         </w:tc>
       </w:tr>
       <w:tr>
-        <w:tblPrEx>
-          <w:tblCellMar>
-            <w:top w:w="0" w:type="dxa"/>
-            <w:bottom w:w="0" w:type="dxa"/>
-          </w:tblCellMar>
-        </w:tblPrEx>
         <w:tc>
           <w:tcPr>
             <w:tcW w:w="2000" w:type="dxa"/>
@@ -8928,12 +7790,6 @@
         </w:tc>
       </w:tr>
       <w:tr>
-        <w:tblPrEx>
-          <w:tblCellMar>
-            <w:top w:w="0" w:type="dxa"/>
-            <w:bottom w:w="0" w:type="dxa"/>
-          </w:tblCellMar>
-        </w:tblPrEx>
         <w:tc>
           <w:tcPr>
             <w:tcW w:w="2000" w:type="dxa"/>
@@ -8992,12 +7848,6 @@
         </w:tc>
       </w:tr>
       <w:tr>
-        <w:tblPrEx>
-          <w:tblCellMar>
-            <w:top w:w="0" w:type="dxa"/>
-            <w:bottom w:w="0" w:type="dxa"/>
-          </w:tblCellMar>
-        </w:tblPrEx>
         <w:tc>
           <w:tcPr>
             <w:tcW w:w="2000" w:type="dxa"/>
@@ -9069,12 +7919,6 @@
         </w:tc>
       </w:tr>
       <w:tr>
-        <w:tblPrEx>
-          <w:tblCellMar>
-            <w:top w:w="0" w:type="dxa"/>
-            <w:bottom w:w="0" w:type="dxa"/>
-          </w:tblCellMar>
-        </w:tblPrEx>
         <w:tc>
           <w:tcPr>
             <w:tcW w:w="2000" w:type="dxa"/>
@@ -9126,12 +7970,6 @@
         </w:tc>
       </w:tr>
       <w:tr>
-        <w:tblPrEx>
-          <w:tblCellMar>
-            <w:top w:w="0" w:type="dxa"/>
-            <w:bottom w:w="0" w:type="dxa"/>
-          </w:tblCellMar>
-        </w:tblPrEx>
         <w:tc>
           <w:tcPr>
             <w:tcW w:w="2000" w:type="dxa"/>
@@ -9190,12 +8028,6 @@
         </w:tc>
       </w:tr>
       <w:tr>
-        <w:tblPrEx>
-          <w:tblCellMar>
-            <w:top w:w="0" w:type="dxa"/>
-            <w:bottom w:w="0" w:type="dxa"/>
-          </w:tblCellMar>
-        </w:tblPrEx>
         <w:tc>
           <w:tcPr>
             <w:tcW w:w="2000" w:type="dxa"/>
@@ -9295,12 +8127,6 @@
         <w:gridCol w:w="2753"/>
       </w:tblGrid>
       <w:tr>
-        <w:tblPrEx>
-          <w:tblCellMar>
-            <w:top w:w="0" w:type="dxa"/>
-            <w:bottom w:w="0" w:type="dxa"/>
-          </w:tblCellMar>
-        </w:tblPrEx>
         <w:trPr>
           <w:tblHeader/>
         </w:trPr>
@@ -9369,12 +8195,6 @@
         </w:tc>
       </w:tr>
       <w:tr>
-        <w:tblPrEx>
-          <w:tblCellMar>
-            <w:top w:w="0" w:type="dxa"/>
-            <w:bottom w:w="0" w:type="dxa"/>
-          </w:tblCellMar>
-        </w:tblPrEx>
         <w:tc>
           <w:tcPr>
             <w:tcW w:w="2000" w:type="dxa"/>
@@ -9433,12 +8253,6 @@
         </w:tc>
       </w:tr>
       <w:tr>
-        <w:tblPrEx>
-          <w:tblCellMar>
-            <w:top w:w="0" w:type="dxa"/>
-            <w:bottom w:w="0" w:type="dxa"/>
-          </w:tblCellMar>
-        </w:tblPrEx>
         <w:tc>
           <w:tcPr>
             <w:tcW w:w="2000" w:type="dxa"/>
@@ -9497,12 +8311,6 @@
         </w:tc>
       </w:tr>
       <w:tr>
-        <w:tblPrEx>
-          <w:tblCellMar>
-            <w:top w:w="0" w:type="dxa"/>
-            <w:bottom w:w="0" w:type="dxa"/>
-          </w:tblCellMar>
-        </w:tblPrEx>
         <w:tc>
           <w:tcPr>
             <w:tcW w:w="2000" w:type="dxa"/>
@@ -9561,12 +8369,6 @@
         </w:tc>
       </w:tr>
       <w:tr>
-        <w:tblPrEx>
-          <w:tblCellMar>
-            <w:top w:w="0" w:type="dxa"/>
-            <w:bottom w:w="0" w:type="dxa"/>
-          </w:tblCellMar>
-        </w:tblPrEx>
         <w:tc>
           <w:tcPr>
             <w:tcW w:w="2000" w:type="dxa"/>
@@ -9625,12 +8427,6 @@
         </w:tc>
       </w:tr>
       <w:tr>
-        <w:tblPrEx>
-          <w:tblCellMar>
-            <w:top w:w="0" w:type="dxa"/>
-            <w:bottom w:w="0" w:type="dxa"/>
-          </w:tblCellMar>
-        </w:tblPrEx>
         <w:tc>
           <w:tcPr>
             <w:tcW w:w="2000" w:type="dxa"/>
@@ -9682,12 +8478,6 @@
         </w:tc>
       </w:tr>
       <w:tr>
-        <w:tblPrEx>
-          <w:tblCellMar>
-            <w:top w:w="0" w:type="dxa"/>
-            <w:bottom w:w="0" w:type="dxa"/>
-          </w:tblCellMar>
-        </w:tblPrEx>
         <w:tc>
           <w:tcPr>
             <w:tcW w:w="2000" w:type="dxa"/>
@@ -9746,12 +8536,6 @@
         </w:tc>
       </w:tr>
       <w:tr>
-        <w:tblPrEx>
-          <w:tblCellMar>
-            <w:top w:w="0" w:type="dxa"/>
-            <w:bottom w:w="0" w:type="dxa"/>
-          </w:tblCellMar>
-        </w:tblPrEx>
         <w:tc>
           <w:tcPr>
             <w:tcW w:w="2000" w:type="dxa"/>
@@ -9810,12 +8594,6 @@
         </w:tc>
       </w:tr>
       <w:tr>
-        <w:tblPrEx>
-          <w:tblCellMar>
-            <w:top w:w="0" w:type="dxa"/>
-            <w:bottom w:w="0" w:type="dxa"/>
-          </w:tblCellMar>
-        </w:tblPrEx>
         <w:tc>
           <w:tcPr>
             <w:tcW w:w="2000" w:type="dxa"/>
@@ -9887,12 +8665,6 @@
         </w:tc>
       </w:tr>
       <w:tr>
-        <w:tblPrEx>
-          <w:tblCellMar>
-            <w:top w:w="0" w:type="dxa"/>
-            <w:bottom w:w="0" w:type="dxa"/>
-          </w:tblCellMar>
-        </w:tblPrEx>
         <w:tc>
           <w:tcPr>
             <w:tcW w:w="2000" w:type="dxa"/>
@@ -9951,12 +8723,6 @@
         </w:tc>
       </w:tr>
       <w:tr>
-        <w:tblPrEx>
-          <w:tblCellMar>
-            <w:top w:w="0" w:type="dxa"/>
-            <w:bottom w:w="0" w:type="dxa"/>
-          </w:tblCellMar>
-        </w:tblPrEx>
         <w:tc>
           <w:tcPr>
             <w:tcW w:w="2000" w:type="dxa"/>
@@ -10015,27 +8781,22 @@
         </w:tc>
       </w:tr>
       <w:tr>
-        <w:tblPrEx>
-          <w:tblCellMar>
-            <w:top w:w="0" w:type="dxa"/>
-            <w:bottom w:w="0" w:type="dxa"/>
-          </w:tblCellMar>
-        </w:tblPrEx>
-        <w:tc>
-          <w:tcPr>
-            <w:tcW w:w="2000" w:type="dxa"/>
-          </w:tcPr>
-          <w:p>
-            <w:pPr>
-              <w:spacing w:after="40" w:line="260" w:lineRule="auto"/>
-              <w:ind w:left="57" w:right="57"/>
-            </w:pPr>
-            <w:r>
-              <w:rPr>
-                <w:rFonts w:ascii="Consolas" w:eastAsia="Consolas" w:hAnsi="Consolas" w:cs="Consolas"/>
-                <w:sz w:val="21"/>
-                <w:szCs w:val="21"/>
-              </w:rPr>
+        <w:tc>
+          <w:tcPr>
+            <w:tcW w:w="2000" w:type="dxa"/>
+          </w:tcPr>
+          <w:p>
+            <w:pPr>
+              <w:spacing w:after="40" w:line="260" w:lineRule="auto"/>
+              <w:ind w:left="57" w:right="57"/>
+            </w:pPr>
+            <w:r>
+              <w:rPr>
+                <w:rFonts w:ascii="Consolas" w:eastAsia="Consolas" w:hAnsi="Consolas" w:cs="Consolas"/>
+                <w:sz w:val="21"/>
+                <w:szCs w:val="21"/>
+              </w:rPr>
+              <w:lastRenderedPageBreak/>
               <w:t>checked_in_at</w:t>
             </w:r>
           </w:p>
@@ -10128,12 +8889,6 @@
         <w:gridCol w:w="2794"/>
       </w:tblGrid>
       <w:tr>
-        <w:tblPrEx>
-          <w:tblCellMar>
-            <w:top w:w="0" w:type="dxa"/>
-            <w:bottom w:w="0" w:type="dxa"/>
-          </w:tblCellMar>
-        </w:tblPrEx>
         <w:trPr>
           <w:tblHeader/>
         </w:trPr>
@@ -10202,12 +8957,6 @@
         </w:tc>
       </w:tr>
       <w:tr>
-        <w:tblPrEx>
-          <w:tblCellMar>
-            <w:top w:w="0" w:type="dxa"/>
-            <w:bottom w:w="0" w:type="dxa"/>
-          </w:tblCellMar>
-        </w:tblPrEx>
         <w:tc>
           <w:tcPr>
             <w:tcW w:w="2830" w:type="dxa"/>
@@ -10266,12 +9015,6 @@
         </w:tc>
       </w:tr>
       <w:tr>
-        <w:tblPrEx>
-          <w:tblCellMar>
-            <w:top w:w="0" w:type="dxa"/>
-            <w:bottom w:w="0" w:type="dxa"/>
-          </w:tblCellMar>
-        </w:tblPrEx>
         <w:tc>
           <w:tcPr>
             <w:tcW w:w="2830" w:type="dxa"/>
@@ -10287,7 +9030,6 @@
                 <w:sz w:val="21"/>
                 <w:szCs w:val="21"/>
               </w:rPr>
-              <w:lastRenderedPageBreak/>
               <w:t>master_order_id</w:t>
             </w:r>
           </w:p>
@@ -10331,12 +9073,6 @@
         </w:tc>
       </w:tr>
       <w:tr>
-        <w:tblPrEx>
-          <w:tblCellMar>
-            <w:top w:w="0" w:type="dxa"/>
-            <w:bottom w:w="0" w:type="dxa"/>
-          </w:tblCellMar>
-        </w:tblPrEx>
         <w:tc>
           <w:tcPr>
             <w:tcW w:w="2830" w:type="dxa"/>
@@ -10388,12 +9124,6 @@
         </w:tc>
       </w:tr>
       <w:tr>
-        <w:tblPrEx>
-          <w:tblCellMar>
-            <w:top w:w="0" w:type="dxa"/>
-            <w:bottom w:w="0" w:type="dxa"/>
-          </w:tblCellMar>
-        </w:tblPrEx>
         <w:tc>
           <w:tcPr>
             <w:tcW w:w="2830" w:type="dxa"/>
@@ -10452,12 +9182,6 @@
         </w:tc>
       </w:tr>
       <w:tr>
-        <w:tblPrEx>
-          <w:tblCellMar>
-            <w:top w:w="0" w:type="dxa"/>
-            <w:bottom w:w="0" w:type="dxa"/>
-          </w:tblCellMar>
-        </w:tblPrEx>
         <w:tc>
           <w:tcPr>
             <w:tcW w:w="2830" w:type="dxa"/>
@@ -10509,12 +9233,6 @@
         </w:tc>
       </w:tr>
       <w:tr>
-        <w:tblPrEx>
-          <w:tblCellMar>
-            <w:top w:w="0" w:type="dxa"/>
-            <w:bottom w:w="0" w:type="dxa"/>
-          </w:tblCellMar>
-        </w:tblPrEx>
         <w:tc>
           <w:tcPr>
             <w:tcW w:w="2830" w:type="dxa"/>
@@ -10586,12 +9304,6 @@
         </w:tc>
       </w:tr>
       <w:tr>
-        <w:tblPrEx>
-          <w:tblCellMar>
-            <w:top w:w="0" w:type="dxa"/>
-            <w:bottom w:w="0" w:type="dxa"/>
-          </w:tblCellMar>
-        </w:tblPrEx>
         <w:tc>
           <w:tcPr>
             <w:tcW w:w="2830" w:type="dxa"/>
@@ -10653,12 +9365,6 @@
         </w:tc>
       </w:tr>
       <w:tr>
-        <w:tblPrEx>
-          <w:tblCellMar>
-            <w:top w:w="0" w:type="dxa"/>
-            <w:bottom w:w="0" w:type="dxa"/>
-          </w:tblCellMar>
-        </w:tblPrEx>
         <w:tc>
           <w:tcPr>
             <w:tcW w:w="2830" w:type="dxa"/>
@@ -10758,12 +9464,6 @@
         <w:gridCol w:w="3331"/>
       </w:tblGrid>
       <w:tr>
-        <w:tblPrEx>
-          <w:tblCellMar>
-            <w:top w:w="0" w:type="dxa"/>
-            <w:bottom w:w="0" w:type="dxa"/>
-          </w:tblCellMar>
-        </w:tblPrEx>
         <w:trPr>
           <w:tblHeader/>
         </w:trPr>
@@ -10832,12 +9532,6 @@
         </w:tc>
       </w:tr>
       <w:tr>
-        <w:tblPrEx>
-          <w:tblCellMar>
-            <w:top w:w="0" w:type="dxa"/>
-            <w:bottom w:w="0" w:type="dxa"/>
-          </w:tblCellMar>
-        </w:tblPrEx>
         <w:tc>
           <w:tcPr>
             <w:tcW w:w="2000" w:type="dxa"/>
@@ -10896,12 +9590,6 @@
         </w:tc>
       </w:tr>
       <w:tr>
-        <w:tblPrEx>
-          <w:tblCellMar>
-            <w:top w:w="0" w:type="dxa"/>
-            <w:bottom w:w="0" w:type="dxa"/>
-          </w:tblCellMar>
-        </w:tblPrEx>
         <w:tc>
           <w:tcPr>
             <w:tcW w:w="2000" w:type="dxa"/>
@@ -10960,12 +9648,6 @@
         </w:tc>
       </w:tr>
       <w:tr>
-        <w:tblPrEx>
-          <w:tblCellMar>
-            <w:top w:w="0" w:type="dxa"/>
-            <w:bottom w:w="0" w:type="dxa"/>
-          </w:tblCellMar>
-        </w:tblPrEx>
         <w:tc>
           <w:tcPr>
             <w:tcW w:w="2000" w:type="dxa"/>
@@ -11017,12 +9699,6 @@
         </w:tc>
       </w:tr>
       <w:tr>
-        <w:tblPrEx>
-          <w:tblCellMar>
-            <w:top w:w="0" w:type="dxa"/>
-            <w:bottom w:w="0" w:type="dxa"/>
-          </w:tblCellMar>
-        </w:tblPrEx>
         <w:tc>
           <w:tcPr>
             <w:tcW w:w="2000" w:type="dxa"/>
@@ -11101,12 +9777,6 @@
         </w:tc>
       </w:tr>
       <w:tr>
-        <w:tblPrEx>
-          <w:tblCellMar>
-            <w:top w:w="0" w:type="dxa"/>
-            <w:bottom w:w="0" w:type="dxa"/>
-          </w:tblCellMar>
-        </w:tblPrEx>
         <w:tc>
           <w:tcPr>
             <w:tcW w:w="2000" w:type="dxa"/>
@@ -11158,12 +9828,6 @@
         </w:tc>
       </w:tr>
       <w:tr>
-        <w:tblPrEx>
-          <w:tblCellMar>
-            <w:top w:w="0" w:type="dxa"/>
-            <w:bottom w:w="0" w:type="dxa"/>
-          </w:tblCellMar>
-        </w:tblPrEx>
         <w:tc>
           <w:tcPr>
             <w:tcW w:w="2000" w:type="dxa"/>
@@ -11263,12 +9927,6 @@
         <w:gridCol w:w="5226"/>
       </w:tblGrid>
       <w:tr>
-        <w:tblPrEx>
-          <w:tblCellMar>
-            <w:top w:w="0" w:type="dxa"/>
-            <w:bottom w:w="0" w:type="dxa"/>
-          </w:tblCellMar>
-        </w:tblPrEx>
         <w:trPr>
           <w:tblHeader/>
         </w:trPr>
@@ -11337,12 +9995,6 @@
         </w:tc>
       </w:tr>
       <w:tr>
-        <w:tblPrEx>
-          <w:tblCellMar>
-            <w:top w:w="0" w:type="dxa"/>
-            <w:bottom w:w="0" w:type="dxa"/>
-          </w:tblCellMar>
-        </w:tblPrEx>
         <w:tc>
           <w:tcPr>
             <w:tcW w:w="2000" w:type="dxa"/>
@@ -11401,12 +10053,6 @@
         </w:tc>
       </w:tr>
       <w:tr>
-        <w:tblPrEx>
-          <w:tblCellMar>
-            <w:top w:w="0" w:type="dxa"/>
-            <w:bottom w:w="0" w:type="dxa"/>
-          </w:tblCellMar>
-        </w:tblPrEx>
         <w:tc>
           <w:tcPr>
             <w:tcW w:w="2000" w:type="dxa"/>
@@ -11465,12 +10111,6 @@
         </w:tc>
       </w:tr>
       <w:tr>
-        <w:tblPrEx>
-          <w:tblCellMar>
-            <w:top w:w="0" w:type="dxa"/>
-            <w:bottom w:w="0" w:type="dxa"/>
-          </w:tblCellMar>
-        </w:tblPrEx>
         <w:tc>
           <w:tcPr>
             <w:tcW w:w="2000" w:type="dxa"/>
@@ -11529,12 +10169,6 @@
         </w:tc>
       </w:tr>
       <w:tr>
-        <w:tblPrEx>
-          <w:tblCellMar>
-            <w:top w:w="0" w:type="dxa"/>
-            <w:bottom w:w="0" w:type="dxa"/>
-          </w:tblCellMar>
-        </w:tblPrEx>
         <w:tc>
           <w:tcPr>
             <w:tcW w:w="2000" w:type="dxa"/>
@@ -11586,12 +10220,6 @@
         </w:tc>
       </w:tr>
       <w:tr>
-        <w:tblPrEx>
-          <w:tblCellMar>
-            <w:top w:w="0" w:type="dxa"/>
-            <w:bottom w:w="0" w:type="dxa"/>
-          </w:tblCellMar>
-        </w:tblPrEx>
         <w:tc>
           <w:tcPr>
             <w:tcW w:w="2000" w:type="dxa"/>
@@ -11698,12 +10326,6 @@
         <w:gridCol w:w="4411"/>
       </w:tblGrid>
       <w:tr>
-        <w:tblPrEx>
-          <w:tblCellMar>
-            <w:top w:w="0" w:type="dxa"/>
-            <w:bottom w:w="0" w:type="dxa"/>
-          </w:tblCellMar>
-        </w:tblPrEx>
         <w:trPr>
           <w:tblHeader/>
         </w:trPr>
@@ -11772,12 +10394,6 @@
         </w:tc>
       </w:tr>
       <w:tr>
-        <w:tblPrEx>
-          <w:tblCellMar>
-            <w:top w:w="0" w:type="dxa"/>
-            <w:bottom w:w="0" w:type="dxa"/>
-          </w:tblCellMar>
-        </w:tblPrEx>
         <w:tc>
           <w:tcPr>
             <w:tcW w:w="2000" w:type="dxa"/>
@@ -11836,12 +10452,6 @@
         </w:tc>
       </w:tr>
       <w:tr>
-        <w:tblPrEx>
-          <w:tblCellMar>
-            <w:top w:w="0" w:type="dxa"/>
-            <w:bottom w:w="0" w:type="dxa"/>
-          </w:tblCellMar>
-        </w:tblPrEx>
         <w:tc>
           <w:tcPr>
             <w:tcW w:w="2000" w:type="dxa"/>
@@ -11900,12 +10510,6 @@
         </w:tc>
       </w:tr>
       <w:tr>
-        <w:tblPrEx>
-          <w:tblCellMar>
-            <w:top w:w="0" w:type="dxa"/>
-            <w:bottom w:w="0" w:type="dxa"/>
-          </w:tblCellMar>
-        </w:tblPrEx>
         <w:tc>
           <w:tcPr>
             <w:tcW w:w="2000" w:type="dxa"/>
@@ -11957,12 +10561,6 @@
         </w:tc>
       </w:tr>
       <w:tr>
-        <w:tblPrEx>
-          <w:tblCellMar>
-            <w:top w:w="0" w:type="dxa"/>
-            <w:bottom w:w="0" w:type="dxa"/>
-          </w:tblCellMar>
-        </w:tblPrEx>
         <w:tc>
           <w:tcPr>
             <w:tcW w:w="2000" w:type="dxa"/>
@@ -12021,12 +10619,6 @@
         </w:tc>
       </w:tr>
       <w:tr>
-        <w:tblPrEx>
-          <w:tblCellMar>
-            <w:top w:w="0" w:type="dxa"/>
-            <w:bottom w:w="0" w:type="dxa"/>
-          </w:tblCellMar>
-        </w:tblPrEx>
         <w:tc>
           <w:tcPr>
             <w:tcW w:w="2000" w:type="dxa"/>
@@ -12078,27 +10670,22 @@
         </w:tc>
       </w:tr>
       <w:tr>
-        <w:tblPrEx>
-          <w:tblCellMar>
-            <w:top w:w="0" w:type="dxa"/>
-            <w:bottom w:w="0" w:type="dxa"/>
-          </w:tblCellMar>
-        </w:tblPrEx>
-        <w:tc>
-          <w:tcPr>
-            <w:tcW w:w="2000" w:type="dxa"/>
-          </w:tcPr>
-          <w:p>
-            <w:pPr>
-              <w:spacing w:after="40" w:line="260" w:lineRule="auto"/>
-              <w:ind w:left="57" w:right="57"/>
-            </w:pPr>
-            <w:r>
-              <w:rPr>
-                <w:rFonts w:ascii="Consolas" w:eastAsia="Consolas" w:hAnsi="Consolas" w:cs="Consolas"/>
-                <w:sz w:val="21"/>
-                <w:szCs w:val="21"/>
-              </w:rPr>
+        <w:tc>
+          <w:tcPr>
+            <w:tcW w:w="2000" w:type="dxa"/>
+          </w:tcPr>
+          <w:p>
+            <w:pPr>
+              <w:spacing w:after="40" w:line="260" w:lineRule="auto"/>
+              <w:ind w:left="57" w:right="57"/>
+            </w:pPr>
+            <w:r>
+              <w:rPr>
+                <w:rFonts w:ascii="Consolas" w:eastAsia="Consolas" w:hAnsi="Consolas" w:cs="Consolas"/>
+                <w:sz w:val="21"/>
+                <w:szCs w:val="21"/>
+              </w:rPr>
+              <w:lastRenderedPageBreak/>
               <w:t>max_uses / used_count</w:t>
             </w:r>
           </w:p>
@@ -12135,12 +10722,6 @@
         </w:tc>
       </w:tr>
       <w:tr>
-        <w:tblPrEx>
-          <w:tblCellMar>
-            <w:top w:w="0" w:type="dxa"/>
-            <w:bottom w:w="0" w:type="dxa"/>
-          </w:tblCellMar>
-        </w:tblPrEx>
         <w:tc>
           <w:tcPr>
             <w:tcW w:w="2000" w:type="dxa"/>
@@ -12192,12 +10773,6 @@
         </w:tc>
       </w:tr>
       <w:tr>
-        <w:tblPrEx>
-          <w:tblCellMar>
-            <w:top w:w="0" w:type="dxa"/>
-            <w:bottom w:w="0" w:type="dxa"/>
-          </w:tblCellMar>
-        </w:tblPrEx>
         <w:tc>
           <w:tcPr>
             <w:tcW w:w="2000" w:type="dxa"/>
@@ -12304,12 +10879,6 @@
         <w:gridCol w:w="5226"/>
       </w:tblGrid>
       <w:tr>
-        <w:tblPrEx>
-          <w:tblCellMar>
-            <w:top w:w="0" w:type="dxa"/>
-            <w:bottom w:w="0" w:type="dxa"/>
-          </w:tblCellMar>
-        </w:tblPrEx>
         <w:trPr>
           <w:tblHeader/>
         </w:trPr>
@@ -12330,7 +10899,6 @@
                 <w:sz w:val="21"/>
                 <w:szCs w:val="21"/>
               </w:rPr>
-              <w:lastRenderedPageBreak/>
               <w:t>Trường</w:t>
             </w:r>
           </w:p>
@@ -12379,12 +10947,6 @@
         </w:tc>
       </w:tr>
       <w:tr>
-        <w:tblPrEx>
-          <w:tblCellMar>
-            <w:top w:w="0" w:type="dxa"/>
-            <w:bottom w:w="0" w:type="dxa"/>
-          </w:tblCellMar>
-        </w:tblPrEx>
         <w:tc>
           <w:tcPr>
             <w:tcW w:w="2000" w:type="dxa"/>
@@ -12443,12 +11005,6 @@
         </w:tc>
       </w:tr>
       <w:tr>
-        <w:tblPrEx>
-          <w:tblCellMar>
-            <w:top w:w="0" w:type="dxa"/>
-            <w:bottom w:w="0" w:type="dxa"/>
-          </w:tblCellMar>
-        </w:tblPrEx>
         <w:tc>
           <w:tcPr>
             <w:tcW w:w="2000" w:type="dxa"/>
@@ -12507,12 +11063,6 @@
         </w:tc>
       </w:tr>
       <w:tr>
-        <w:tblPrEx>
-          <w:tblCellMar>
-            <w:top w:w="0" w:type="dxa"/>
-            <w:bottom w:w="0" w:type="dxa"/>
-          </w:tblCellMar>
-        </w:tblPrEx>
         <w:tc>
           <w:tcPr>
             <w:tcW w:w="2000" w:type="dxa"/>
@@ -12571,12 +11121,6 @@
         </w:tc>
       </w:tr>
       <w:tr>
-        <w:tblPrEx>
-          <w:tblCellMar>
-            <w:top w:w="0" w:type="dxa"/>
-            <w:bottom w:w="0" w:type="dxa"/>
-          </w:tblCellMar>
-        </w:tblPrEx>
         <w:tc>
           <w:tcPr>
             <w:tcW w:w="2000" w:type="dxa"/>
@@ -12705,12 +11249,6 @@
         <w:gridCol w:w="4495"/>
       </w:tblGrid>
       <w:tr>
-        <w:tblPrEx>
-          <w:tblCellMar>
-            <w:top w:w="0" w:type="dxa"/>
-            <w:bottom w:w="0" w:type="dxa"/>
-          </w:tblCellMar>
-        </w:tblPrEx>
         <w:trPr>
           <w:tblHeader/>
         </w:trPr>
@@ -12779,12 +11317,6 @@
         </w:tc>
       </w:tr>
       <w:tr>
-        <w:tblPrEx>
-          <w:tblCellMar>
-            <w:top w:w="0" w:type="dxa"/>
-            <w:bottom w:w="0" w:type="dxa"/>
-          </w:tblCellMar>
-        </w:tblPrEx>
         <w:tc>
           <w:tcPr>
             <w:tcW w:w="2000" w:type="dxa"/>
@@ -12843,12 +11375,6 @@
         </w:tc>
       </w:tr>
       <w:tr>
-        <w:tblPrEx>
-          <w:tblCellMar>
-            <w:top w:w="0" w:type="dxa"/>
-            <w:bottom w:w="0" w:type="dxa"/>
-          </w:tblCellMar>
-        </w:tblPrEx>
         <w:tc>
           <w:tcPr>
             <w:tcW w:w="2000" w:type="dxa"/>
@@ -12907,12 +11433,6 @@
         </w:tc>
       </w:tr>
       <w:tr>
-        <w:tblPrEx>
-          <w:tblCellMar>
-            <w:top w:w="0" w:type="dxa"/>
-            <w:bottom w:w="0" w:type="dxa"/>
-          </w:tblCellMar>
-        </w:tblPrEx>
         <w:tc>
           <w:tcPr>
             <w:tcW w:w="2000" w:type="dxa"/>
@@ -12964,12 +11484,6 @@
         </w:tc>
       </w:tr>
       <w:tr>
-        <w:tblPrEx>
-          <w:tblCellMar>
-            <w:top w:w="0" w:type="dxa"/>
-            <w:bottom w:w="0" w:type="dxa"/>
-          </w:tblCellMar>
-        </w:tblPrEx>
         <w:tc>
           <w:tcPr>
             <w:tcW w:w="2000" w:type="dxa"/>
@@ -13021,12 +11535,6 @@
         </w:tc>
       </w:tr>
       <w:tr>
-        <w:tblPrEx>
-          <w:tblCellMar>
-            <w:top w:w="0" w:type="dxa"/>
-            <w:bottom w:w="0" w:type="dxa"/>
-          </w:tblCellMar>
-        </w:tblPrEx>
         <w:tc>
           <w:tcPr>
             <w:tcW w:w="2000" w:type="dxa"/>
@@ -13078,12 +11586,6 @@
         </w:tc>
       </w:tr>
       <w:tr>
-        <w:tblPrEx>
-          <w:tblCellMar>
-            <w:top w:w="0" w:type="dxa"/>
-            <w:bottom w:w="0" w:type="dxa"/>
-          </w:tblCellMar>
-        </w:tblPrEx>
         <w:tc>
           <w:tcPr>
             <w:tcW w:w="2000" w:type="dxa"/>
@@ -13183,12 +11685,6 @@
         <w:gridCol w:w="5226"/>
       </w:tblGrid>
       <w:tr>
-        <w:tblPrEx>
-          <w:tblCellMar>
-            <w:top w:w="0" w:type="dxa"/>
-            <w:bottom w:w="0" w:type="dxa"/>
-          </w:tblCellMar>
-        </w:tblPrEx>
         <w:trPr>
           <w:tblHeader/>
         </w:trPr>
@@ -13257,12 +11753,6 @@
         </w:tc>
       </w:tr>
       <w:tr>
-        <w:tblPrEx>
-          <w:tblCellMar>
-            <w:top w:w="0" w:type="dxa"/>
-            <w:bottom w:w="0" w:type="dxa"/>
-          </w:tblCellMar>
-        </w:tblPrEx>
         <w:tc>
           <w:tcPr>
             <w:tcW w:w="2000" w:type="dxa"/>
@@ -13321,12 +11811,6 @@
         </w:tc>
       </w:tr>
       <w:tr>
-        <w:tblPrEx>
-          <w:tblCellMar>
-            <w:top w:w="0" w:type="dxa"/>
-            <w:bottom w:w="0" w:type="dxa"/>
-          </w:tblCellMar>
-        </w:tblPrEx>
         <w:tc>
           <w:tcPr>
             <w:tcW w:w="2000" w:type="dxa"/>
@@ -13385,12 +11869,6 @@
         </w:tc>
       </w:tr>
       <w:tr>
-        <w:tblPrEx>
-          <w:tblCellMar>
-            <w:top w:w="0" w:type="dxa"/>
-            <w:bottom w:w="0" w:type="dxa"/>
-          </w:tblCellMar>
-        </w:tblPrEx>
         <w:tc>
           <w:tcPr>
             <w:tcW w:w="2000" w:type="dxa"/>
@@ -13442,12 +11920,6 @@
         </w:tc>
       </w:tr>
       <w:tr>
-        <w:tblPrEx>
-          <w:tblCellMar>
-            <w:top w:w="0" w:type="dxa"/>
-            <w:bottom w:w="0" w:type="dxa"/>
-          </w:tblCellMar>
-        </w:tblPrEx>
         <w:tc>
           <w:tcPr>
             <w:tcW w:w="2000" w:type="dxa"/>
@@ -13499,12 +11971,6 @@
         </w:tc>
       </w:tr>
       <w:tr>
-        <w:tblPrEx>
-          <w:tblCellMar>
-            <w:top w:w="0" w:type="dxa"/>
-            <w:bottom w:w="0" w:type="dxa"/>
-          </w:tblCellMar>
-        </w:tblPrEx>
         <w:tc>
           <w:tcPr>
             <w:tcW w:w="2000" w:type="dxa"/>
@@ -13620,12 +12086,6 @@
         <w:gridCol w:w="5226"/>
       </w:tblGrid>
       <w:tr>
-        <w:tblPrEx>
-          <w:tblCellMar>
-            <w:top w:w="0" w:type="dxa"/>
-            <w:bottom w:w="0" w:type="dxa"/>
-          </w:tblCellMar>
-        </w:tblPrEx>
         <w:trPr>
           <w:tblHeader/>
         </w:trPr>
@@ -13694,12 +12154,6 @@
         </w:tc>
       </w:tr>
       <w:tr>
-        <w:tblPrEx>
-          <w:tblCellMar>
-            <w:top w:w="0" w:type="dxa"/>
-            <w:bottom w:w="0" w:type="dxa"/>
-          </w:tblCellMar>
-        </w:tblPrEx>
         <w:tc>
           <w:tcPr>
             <w:tcW w:w="2000" w:type="dxa"/>
@@ -13758,12 +12212,6 @@
         </w:tc>
       </w:tr>
       <w:tr>
-        <w:tblPrEx>
-          <w:tblCellMar>
-            <w:top w:w="0" w:type="dxa"/>
-            <w:bottom w:w="0" w:type="dxa"/>
-          </w:tblCellMar>
-        </w:tblPrEx>
         <w:tc>
           <w:tcPr>
             <w:tcW w:w="2000" w:type="dxa"/>
@@ -13822,12 +12270,6 @@
         </w:tc>
       </w:tr>
       <w:tr>
-        <w:tblPrEx>
-          <w:tblCellMar>
-            <w:top w:w="0" w:type="dxa"/>
-            <w:bottom w:w="0" w:type="dxa"/>
-          </w:tblCellMar>
-        </w:tblPrEx>
         <w:tc>
           <w:tcPr>
             <w:tcW w:w="2000" w:type="dxa"/>
@@ -13892,6 +12334,7 @@
           <w:sz w:val="24"/>
           <w:szCs w:val="24"/>
         </w:rPr>
+        <w:lastRenderedPageBreak/>
         <w:t>ai_messages</w:t>
       </w:r>
       <w:r>
@@ -13927,12 +12370,6 @@
         <w:gridCol w:w="4050"/>
       </w:tblGrid>
       <w:tr>
-        <w:tblPrEx>
-          <w:tblCellMar>
-            <w:top w:w="0" w:type="dxa"/>
-            <w:bottom w:w="0" w:type="dxa"/>
-          </w:tblCellMar>
-        </w:tblPrEx>
         <w:trPr>
           <w:tblHeader/>
         </w:trPr>
@@ -14001,12 +12438,6 @@
         </w:tc>
       </w:tr>
       <w:tr>
-        <w:tblPrEx>
-          <w:tblCellMar>
-            <w:top w:w="0" w:type="dxa"/>
-            <w:bottom w:w="0" w:type="dxa"/>
-          </w:tblCellMar>
-        </w:tblPrEx>
         <w:tc>
           <w:tcPr>
             <w:tcW w:w="2000" w:type="dxa"/>
@@ -14065,12 +12496,6 @@
         </w:tc>
       </w:tr>
       <w:tr>
-        <w:tblPrEx>
-          <w:tblCellMar>
-            <w:top w:w="0" w:type="dxa"/>
-            <w:bottom w:w="0" w:type="dxa"/>
-          </w:tblCellMar>
-        </w:tblPrEx>
         <w:tc>
           <w:tcPr>
             <w:tcW w:w="2000" w:type="dxa"/>
@@ -14129,12 +12554,6 @@
         </w:tc>
       </w:tr>
       <w:tr>
-        <w:tblPrEx>
-          <w:tblCellMar>
-            <w:top w:w="0" w:type="dxa"/>
-            <w:bottom w:w="0" w:type="dxa"/>
-          </w:tblCellMar>
-        </w:tblPrEx>
         <w:tc>
           <w:tcPr>
             <w:tcW w:w="2000" w:type="dxa"/>
@@ -14186,12 +12605,6 @@
         </w:tc>
       </w:tr>
       <w:tr>
-        <w:tblPrEx>
-          <w:tblCellMar>
-            <w:top w:w="0" w:type="dxa"/>
-            <w:bottom w:w="0" w:type="dxa"/>
-          </w:tblCellMar>
-        </w:tblPrEx>
         <w:tc>
           <w:tcPr>
             <w:tcW w:w="2000" w:type="dxa"/>
@@ -14243,12 +12656,6 @@
         </w:tc>
       </w:tr>
       <w:tr>
-        <w:tblPrEx>
-          <w:tblCellMar>
-            <w:top w:w="0" w:type="dxa"/>
-            <w:bottom w:w="0" w:type="dxa"/>
-          </w:tblCellMar>
-        </w:tblPrEx>
         <w:tc>
           <w:tcPr>
             <w:tcW w:w="2000" w:type="dxa"/>
@@ -14307,12 +12714,6 @@
         </w:tc>
       </w:tr>
       <w:tr>
-        <w:tblPrEx>
-          <w:tblCellMar>
-            <w:top w:w="0" w:type="dxa"/>
-            <w:bottom w:w="0" w:type="dxa"/>
-          </w:tblCellMar>
-        </w:tblPrEx>
         <w:tc>
           <w:tcPr>
             <w:tcW w:w="2000" w:type="dxa"/>
@@ -14377,7 +12778,6 @@
           <w:sz w:val="28"/>
           <w:szCs w:val="28"/>
         </w:rPr>
-        <w:lastRenderedPageBreak/>
         <w:t>7. Vận hành, Đối soát &amp; Đánh giá (EPIC-07)</w:t>
       </w:r>
     </w:p>
@@ -14429,12 +12829,6 @@
         <w:gridCol w:w="5345"/>
       </w:tblGrid>
       <w:tr>
-        <w:tblPrEx>
-          <w:tblCellMar>
-            <w:top w:w="0" w:type="dxa"/>
-            <w:bottom w:w="0" w:type="dxa"/>
-          </w:tblCellMar>
-        </w:tblPrEx>
         <w:trPr>
           <w:tblHeader/>
         </w:trPr>
@@ -14503,12 +12897,6 @@
         </w:tc>
       </w:tr>
       <w:tr>
-        <w:tblPrEx>
-          <w:tblCellMar>
-            <w:top w:w="0" w:type="dxa"/>
-            <w:bottom w:w="0" w:type="dxa"/>
-          </w:tblCellMar>
-        </w:tblPrEx>
         <w:tc>
           <w:tcPr>
             <w:tcW w:w="2097" w:type="dxa"/>
@@ -14567,12 +12955,6 @@
         </w:tc>
       </w:tr>
       <w:tr>
-        <w:tblPrEx>
-          <w:tblCellMar>
-            <w:top w:w="0" w:type="dxa"/>
-            <w:bottom w:w="0" w:type="dxa"/>
-          </w:tblCellMar>
-        </w:tblPrEx>
         <w:tc>
           <w:tcPr>
             <w:tcW w:w="2097" w:type="dxa"/>
@@ -14631,12 +13013,6 @@
         </w:tc>
       </w:tr>
       <w:tr>
-        <w:tblPrEx>
-          <w:tblCellMar>
-            <w:top w:w="0" w:type="dxa"/>
-            <w:bottom w:w="0" w:type="dxa"/>
-          </w:tblCellMar>
-        </w:tblPrEx>
         <w:tc>
           <w:tcPr>
             <w:tcW w:w="2097" w:type="dxa"/>
@@ -14695,12 +13071,6 @@
         </w:tc>
       </w:tr>
       <w:tr>
-        <w:tblPrEx>
-          <w:tblCellMar>
-            <w:top w:w="0" w:type="dxa"/>
-            <w:bottom w:w="0" w:type="dxa"/>
-          </w:tblCellMar>
-        </w:tblPrEx>
         <w:tc>
           <w:tcPr>
             <w:tcW w:w="2097" w:type="dxa"/>
@@ -14759,12 +13129,6 @@
         </w:tc>
       </w:tr>
       <w:tr>
-        <w:tblPrEx>
-          <w:tblCellMar>
-            <w:top w:w="0" w:type="dxa"/>
-            <w:bottom w:w="0" w:type="dxa"/>
-          </w:tblCellMar>
-        </w:tblPrEx>
         <w:tc>
           <w:tcPr>
             <w:tcW w:w="2097" w:type="dxa"/>
@@ -14816,12 +13180,6 @@
         </w:tc>
       </w:tr>
       <w:tr>
-        <w:tblPrEx>
-          <w:tblCellMar>
-            <w:top w:w="0" w:type="dxa"/>
-            <w:bottom w:w="0" w:type="dxa"/>
-          </w:tblCellMar>
-        </w:tblPrEx>
         <w:tc>
           <w:tcPr>
             <w:tcW w:w="2097" w:type="dxa"/>
@@ -14880,12 +13238,6 @@
         </w:tc>
       </w:tr>
       <w:tr>
-        <w:tblPrEx>
-          <w:tblCellMar>
-            <w:top w:w="0" w:type="dxa"/>
-            <w:bottom w:w="0" w:type="dxa"/>
-          </w:tblCellMar>
-        </w:tblPrEx>
         <w:tc>
           <w:tcPr>
             <w:tcW w:w="2097" w:type="dxa"/>
@@ -14937,12 +13289,6 @@
         </w:tc>
       </w:tr>
       <w:tr>
-        <w:tblPrEx>
-          <w:tblCellMar>
-            <w:top w:w="0" w:type="dxa"/>
-            <w:bottom w:w="0" w:type="dxa"/>
-          </w:tblCellMar>
-        </w:tblPrEx>
         <w:tc>
           <w:tcPr>
             <w:tcW w:w="2097" w:type="dxa"/>
@@ -15049,12 +13395,6 @@
         <w:gridCol w:w="4524"/>
       </w:tblGrid>
       <w:tr>
-        <w:tblPrEx>
-          <w:tblCellMar>
-            <w:top w:w="0" w:type="dxa"/>
-            <w:bottom w:w="0" w:type="dxa"/>
-          </w:tblCellMar>
-        </w:tblPrEx>
         <w:trPr>
           <w:tblHeader/>
         </w:trPr>
@@ -15123,12 +13463,6 @@
         </w:tc>
       </w:tr>
       <w:tr>
-        <w:tblPrEx>
-          <w:tblCellMar>
-            <w:top w:w="0" w:type="dxa"/>
-            <w:bottom w:w="0" w:type="dxa"/>
-          </w:tblCellMar>
-        </w:tblPrEx>
         <w:tc>
           <w:tcPr>
             <w:tcW w:w="2099" w:type="dxa"/>
@@ -15187,12 +13521,6 @@
         </w:tc>
       </w:tr>
       <w:tr>
-        <w:tblPrEx>
-          <w:tblCellMar>
-            <w:top w:w="0" w:type="dxa"/>
-            <w:bottom w:w="0" w:type="dxa"/>
-          </w:tblCellMar>
-        </w:tblPrEx>
         <w:tc>
           <w:tcPr>
             <w:tcW w:w="2099" w:type="dxa"/>
@@ -15251,12 +13579,6 @@
         </w:tc>
       </w:tr>
       <w:tr>
-        <w:tblPrEx>
-          <w:tblCellMar>
-            <w:top w:w="0" w:type="dxa"/>
-            <w:bottom w:w="0" w:type="dxa"/>
-          </w:tblCellMar>
-        </w:tblPrEx>
         <w:tc>
           <w:tcPr>
             <w:tcW w:w="2099" w:type="dxa"/>
@@ -15308,12 +13630,6 @@
         </w:tc>
       </w:tr>
       <w:tr>
-        <w:tblPrEx>
-          <w:tblCellMar>
-            <w:top w:w="0" w:type="dxa"/>
-            <w:bottom w:w="0" w:type="dxa"/>
-          </w:tblCellMar>
-        </w:tblPrEx>
         <w:tc>
           <w:tcPr>
             <w:tcW w:w="2099" w:type="dxa"/>
@@ -15365,12 +13681,6 @@
         </w:tc>
       </w:tr>
       <w:tr>
-        <w:tblPrEx>
-          <w:tblCellMar>
-            <w:top w:w="0" w:type="dxa"/>
-            <w:bottom w:w="0" w:type="dxa"/>
-          </w:tblCellMar>
-        </w:tblPrEx>
         <w:tc>
           <w:tcPr>
             <w:tcW w:w="2099" w:type="dxa"/>
@@ -15422,12 +13732,6 @@
         </w:tc>
       </w:tr>
       <w:tr>
-        <w:tblPrEx>
-          <w:tblCellMar>
-            <w:top w:w="0" w:type="dxa"/>
-            <w:bottom w:w="0" w:type="dxa"/>
-          </w:tblCellMar>
-        </w:tblPrEx>
         <w:tc>
           <w:tcPr>
             <w:tcW w:w="2099" w:type="dxa"/>
@@ -15527,12 +13831,6 @@
         <w:gridCol w:w="5226"/>
       </w:tblGrid>
       <w:tr>
-        <w:tblPrEx>
-          <w:tblCellMar>
-            <w:top w:w="0" w:type="dxa"/>
-            <w:bottom w:w="0" w:type="dxa"/>
-          </w:tblCellMar>
-        </w:tblPrEx>
         <w:trPr>
           <w:tblHeader/>
         </w:trPr>
@@ -15601,12 +13899,6 @@
         </w:tc>
       </w:tr>
       <w:tr>
-        <w:tblPrEx>
-          <w:tblCellMar>
-            <w:top w:w="0" w:type="dxa"/>
-            <w:bottom w:w="0" w:type="dxa"/>
-          </w:tblCellMar>
-        </w:tblPrEx>
         <w:tc>
           <w:tcPr>
             <w:tcW w:w="2000" w:type="dxa"/>
@@ -15665,12 +13957,6 @@
         </w:tc>
       </w:tr>
       <w:tr>
-        <w:tblPrEx>
-          <w:tblCellMar>
-            <w:top w:w="0" w:type="dxa"/>
-            <w:bottom w:w="0" w:type="dxa"/>
-          </w:tblCellMar>
-        </w:tblPrEx>
         <w:tc>
           <w:tcPr>
             <w:tcW w:w="2000" w:type="dxa"/>
@@ -15729,12 +14015,6 @@
         </w:tc>
       </w:tr>
       <w:tr>
-        <w:tblPrEx>
-          <w:tblCellMar>
-            <w:top w:w="0" w:type="dxa"/>
-            <w:bottom w:w="0" w:type="dxa"/>
-          </w:tblCellMar>
-        </w:tblPrEx>
         <w:tc>
           <w:tcPr>
             <w:tcW w:w="2000" w:type="dxa"/>
@@ -15793,12 +14073,6 @@
         </w:tc>
       </w:tr>
       <w:tr>
-        <w:tblPrEx>
-          <w:tblCellMar>
-            <w:top w:w="0" w:type="dxa"/>
-            <w:bottom w:w="0" w:type="dxa"/>
-          </w:tblCellMar>
-        </w:tblPrEx>
         <w:tc>
           <w:tcPr>
             <w:tcW w:w="2000" w:type="dxa"/>
@@ -15898,12 +14172,6 @@
         <w:gridCol w:w="2738"/>
       </w:tblGrid>
       <w:tr>
-        <w:tblPrEx>
-          <w:tblCellMar>
-            <w:top w:w="0" w:type="dxa"/>
-            <w:bottom w:w="0" w:type="dxa"/>
-          </w:tblCellMar>
-        </w:tblPrEx>
         <w:trPr>
           <w:tblHeader/>
         </w:trPr>
@@ -15924,6 +14192,7 @@
                 <w:sz w:val="21"/>
                 <w:szCs w:val="21"/>
               </w:rPr>
+              <w:lastRenderedPageBreak/>
               <w:t>Trường</w:t>
             </w:r>
           </w:p>
@@ -15972,12 +14241,6 @@
         </w:tc>
       </w:tr>
       <w:tr>
-        <w:tblPrEx>
-          <w:tblCellMar>
-            <w:top w:w="0" w:type="dxa"/>
-            <w:bottom w:w="0" w:type="dxa"/>
-          </w:tblCellMar>
-        </w:tblPrEx>
         <w:tc>
           <w:tcPr>
             <w:tcW w:w="2000" w:type="dxa"/>
@@ -16036,12 +14299,6 @@
         </w:tc>
       </w:tr>
       <w:tr>
-        <w:tblPrEx>
-          <w:tblCellMar>
-            <w:top w:w="0" w:type="dxa"/>
-            <w:bottom w:w="0" w:type="dxa"/>
-          </w:tblCellMar>
-        </w:tblPrEx>
         <w:tc>
           <w:tcPr>
             <w:tcW w:w="2000" w:type="dxa"/>
@@ -16100,12 +14357,6 @@
         </w:tc>
       </w:tr>
       <w:tr>
-        <w:tblPrEx>
-          <w:tblCellMar>
-            <w:top w:w="0" w:type="dxa"/>
-            <w:bottom w:w="0" w:type="dxa"/>
-          </w:tblCellMar>
-        </w:tblPrEx>
         <w:tc>
           <w:tcPr>
             <w:tcW w:w="2000" w:type="dxa"/>
@@ -16164,12 +14415,6 @@
         </w:tc>
       </w:tr>
       <w:tr>
-        <w:tblPrEx>
-          <w:tblCellMar>
-            <w:top w:w="0" w:type="dxa"/>
-            <w:bottom w:w="0" w:type="dxa"/>
-          </w:tblCellMar>
-        </w:tblPrEx>
         <w:tc>
           <w:tcPr>
             <w:tcW w:w="2000" w:type="dxa"/>
@@ -16221,12 +14466,6 @@
         </w:tc>
       </w:tr>
       <w:tr>
-        <w:tblPrEx>
-          <w:tblCellMar>
-            <w:top w:w="0" w:type="dxa"/>
-            <w:bottom w:w="0" w:type="dxa"/>
-          </w:tblCellMar>
-        </w:tblPrEx>
         <w:tc>
           <w:tcPr>
             <w:tcW w:w="2000" w:type="dxa"/>
@@ -16278,12 +14517,6 @@
         </w:tc>
       </w:tr>
       <w:tr>
-        <w:tblPrEx>
-          <w:tblCellMar>
-            <w:top w:w="0" w:type="dxa"/>
-            <w:bottom w:w="0" w:type="dxa"/>
-          </w:tblCellMar>
-        </w:tblPrEx>
         <w:tc>
           <w:tcPr>
             <w:tcW w:w="2000" w:type="dxa"/>
@@ -16355,7 +14588,6 @@
           <w:sz w:val="28"/>
           <w:szCs w:val="28"/>
         </w:rPr>
-        <w:lastRenderedPageBreak/>
         <w:t>8. Cấu hình hệ thống (EPIC-08)</w:t>
       </w:r>
     </w:p>
@@ -16407,12 +14639,6 @@
         <w:gridCol w:w="5226"/>
       </w:tblGrid>
       <w:tr>
-        <w:tblPrEx>
-          <w:tblCellMar>
-            <w:top w:w="0" w:type="dxa"/>
-            <w:bottom w:w="0" w:type="dxa"/>
-          </w:tblCellMar>
-        </w:tblPrEx>
         <w:trPr>
           <w:tblHeader/>
         </w:trPr>
@@ -16481,12 +14707,6 @@
         </w:tc>
       </w:tr>
       <w:tr>
-        <w:tblPrEx>
-          <w:tblCellMar>
-            <w:top w:w="0" w:type="dxa"/>
-            <w:bottom w:w="0" w:type="dxa"/>
-          </w:tblCellMar>
-        </w:tblPrEx>
         <w:tc>
           <w:tcPr>
             <w:tcW w:w="2000" w:type="dxa"/>
@@ -16545,12 +14765,6 @@
         </w:tc>
       </w:tr>
       <w:tr>
-        <w:tblPrEx>
-          <w:tblCellMar>
-            <w:top w:w="0" w:type="dxa"/>
-            <w:bottom w:w="0" w:type="dxa"/>
-          </w:tblCellMar>
-        </w:tblPrEx>
         <w:tc>
           <w:tcPr>
             <w:tcW w:w="2000" w:type="dxa"/>
@@ -16609,12 +14823,6 @@
         </w:tc>
       </w:tr>
       <w:tr>
-        <w:tblPrEx>
-          <w:tblCellMar>
-            <w:top w:w="0" w:type="dxa"/>
-            <w:bottom w:w="0" w:type="dxa"/>
-          </w:tblCellMar>
-        </w:tblPrEx>
         <w:tc>
           <w:tcPr>
             <w:tcW w:w="2000" w:type="dxa"/>
@@ -16666,12 +14874,6 @@
         </w:tc>
       </w:tr>
       <w:tr>
-        <w:tblPrEx>
-          <w:tblCellMar>
-            <w:top w:w="0" w:type="dxa"/>
-            <w:bottom w:w="0" w:type="dxa"/>
-          </w:tblCellMar>
-        </w:tblPrEx>
         <w:tc>
           <w:tcPr>
             <w:tcW w:w="2000" w:type="dxa"/>
@@ -16723,12 +14925,6 @@
         </w:tc>
       </w:tr>
       <w:tr>
-        <w:tblPrEx>
-          <w:tblCellMar>
-            <w:top w:w="0" w:type="dxa"/>
-            <w:bottom w:w="0" w:type="dxa"/>
-          </w:tblCellMar>
-        </w:tblPrEx>
         <w:tc>
           <w:tcPr>
             <w:tcW w:w="2000" w:type="dxa"/>
@@ -16844,12 +15040,6 @@
         <w:gridCol w:w="2984"/>
       </w:tblGrid>
       <w:tr>
-        <w:tblPrEx>
-          <w:tblCellMar>
-            <w:top w:w="0" w:type="dxa"/>
-            <w:bottom w:w="0" w:type="dxa"/>
-          </w:tblCellMar>
-        </w:tblPrEx>
         <w:trPr>
           <w:tblHeader/>
         </w:trPr>
@@ -16918,12 +15108,6 @@
         </w:tc>
       </w:tr>
       <w:tr>
-        <w:tblPrEx>
-          <w:tblCellMar>
-            <w:top w:w="0" w:type="dxa"/>
-            <w:bottom w:w="0" w:type="dxa"/>
-          </w:tblCellMar>
-        </w:tblPrEx>
         <w:tc>
           <w:tcPr>
             <w:tcW w:w="2000" w:type="dxa"/>
@@ -16982,12 +15166,6 @@
         </w:tc>
       </w:tr>
       <w:tr>
-        <w:tblPrEx>
-          <w:tblCellMar>
-            <w:top w:w="0" w:type="dxa"/>
-            <w:bottom w:w="0" w:type="dxa"/>
-          </w:tblCellMar>
-        </w:tblPrEx>
         <w:tc>
           <w:tcPr>
             <w:tcW w:w="2000" w:type="dxa"/>
@@ -17046,12 +15224,6 @@
         </w:tc>
       </w:tr>
       <w:tr>
-        <w:tblPrEx>
-          <w:tblCellMar>
-            <w:top w:w="0" w:type="dxa"/>
-            <w:bottom w:w="0" w:type="dxa"/>
-          </w:tblCellMar>
-        </w:tblPrEx>
         <w:tc>
           <w:tcPr>
             <w:tcW w:w="2000" w:type="dxa"/>
@@ -17110,12 +15282,6 @@
         </w:tc>
       </w:tr>
       <w:tr>
-        <w:tblPrEx>
-          <w:tblCellMar>
-            <w:top w:w="0" w:type="dxa"/>
-            <w:bottom w:w="0" w:type="dxa"/>
-          </w:tblCellMar>
-        </w:tblPrEx>
         <w:tc>
           <w:tcPr>
             <w:tcW w:w="2000" w:type="dxa"/>
@@ -17167,12 +15333,6 @@
         </w:tc>
       </w:tr>
       <w:tr>
-        <w:tblPrEx>
-          <w:tblCellMar>
-            <w:top w:w="0" w:type="dxa"/>
-            <w:bottom w:w="0" w:type="dxa"/>
-          </w:tblCellMar>
-        </w:tblPrEx>
         <w:tc>
           <w:tcPr>
             <w:tcW w:w="2000" w:type="dxa"/>
@@ -17224,12 +15384,6 @@
         </w:tc>
       </w:tr>
       <w:tr>
-        <w:tblPrEx>
-          <w:tblCellMar>
-            <w:top w:w="0" w:type="dxa"/>
-            <w:bottom w:w="0" w:type="dxa"/>
-          </w:tblCellMar>
-        </w:tblPrEx>
         <w:tc>
           <w:tcPr>
             <w:tcW w:w="2000" w:type="dxa"/>
@@ -17281,12 +15435,6 @@
         </w:tc>
       </w:tr>
       <w:tr>
-        <w:tblPrEx>
-          <w:tblCellMar>
-            <w:top w:w="0" w:type="dxa"/>
-            <w:bottom w:w="0" w:type="dxa"/>
-          </w:tblCellMar>
-        </w:tblPrEx>
         <w:tc>
           <w:tcPr>
             <w:tcW w:w="2000" w:type="dxa"/>
@@ -17338,12 +15486,6 @@
         </w:tc>
       </w:tr>
       <w:tr>
-        <w:tblPrEx>
-          <w:tblCellMar>
-            <w:top w:w="0" w:type="dxa"/>
-            <w:bottom w:w="0" w:type="dxa"/>
-          </w:tblCellMar>
-        </w:tblPrEx>
         <w:tc>
           <w:tcPr>
             <w:tcW w:w="2000" w:type="dxa"/>
@@ -17443,12 +15585,6 @@
         <w:gridCol w:w="5226"/>
       </w:tblGrid>
       <w:tr>
-        <w:tblPrEx>
-          <w:tblCellMar>
-            <w:top w:w="0" w:type="dxa"/>
-            <w:bottom w:w="0" w:type="dxa"/>
-          </w:tblCellMar>
-        </w:tblPrEx>
         <w:trPr>
           <w:tblHeader/>
         </w:trPr>
@@ -17517,12 +15653,6 @@
         </w:tc>
       </w:tr>
       <w:tr>
-        <w:tblPrEx>
-          <w:tblCellMar>
-            <w:top w:w="0" w:type="dxa"/>
-            <w:bottom w:w="0" w:type="dxa"/>
-          </w:tblCellMar>
-        </w:tblPrEx>
         <w:tc>
           <w:tcPr>
             <w:tcW w:w="2000" w:type="dxa"/>
@@ -17581,12 +15711,6 @@
         </w:tc>
       </w:tr>
       <w:tr>
-        <w:tblPrEx>
-          <w:tblCellMar>
-            <w:top w:w="0" w:type="dxa"/>
-            <w:bottom w:w="0" w:type="dxa"/>
-          </w:tblCellMar>
-        </w:tblPrEx>
         <w:tc>
           <w:tcPr>
             <w:tcW w:w="2000" w:type="dxa"/>
@@ -17645,12 +15769,6 @@
         </w:tc>
       </w:tr>
       <w:tr>
-        <w:tblPrEx>
-          <w:tblCellMar>
-            <w:top w:w="0" w:type="dxa"/>
-            <w:bottom w:w="0" w:type="dxa"/>
-          </w:tblCellMar>
-        </w:tblPrEx>
         <w:tc>
           <w:tcPr>
             <w:tcW w:w="2000" w:type="dxa"/>
@@ -17709,12 +15827,6 @@
         </w:tc>
       </w:tr>
       <w:tr>
-        <w:tblPrEx>
-          <w:tblCellMar>
-            <w:top w:w="0" w:type="dxa"/>
-            <w:bottom w:w="0" w:type="dxa"/>
-          </w:tblCellMar>
-        </w:tblPrEx>
         <w:tc>
           <w:tcPr>
             <w:tcW w:w="2000" w:type="dxa"/>
@@ -17779,6 +15891,7 @@
           <w:sz w:val="24"/>
           <w:szCs w:val="24"/>
         </w:rPr>
+        <w:lastRenderedPageBreak/>
         <w:t>messages</w:t>
       </w:r>
       <w:r>
@@ -17814,12 +15927,6 @@
         <w:gridCol w:w="5226"/>
       </w:tblGrid>
       <w:tr>
-        <w:tblPrEx>
-          <w:tblCellMar>
-            <w:top w:w="0" w:type="dxa"/>
-            <w:bottom w:w="0" w:type="dxa"/>
-          </w:tblCellMar>
-        </w:tblPrEx>
         <w:trPr>
           <w:tblHeader/>
         </w:trPr>
@@ -17888,12 +15995,6 @@
         </w:tc>
       </w:tr>
       <w:tr>
-        <w:tblPrEx>
-          <w:tblCellMar>
-            <w:top w:w="0" w:type="dxa"/>
-            <w:bottom w:w="0" w:type="dxa"/>
-          </w:tblCellMar>
-        </w:tblPrEx>
         <w:tc>
           <w:tcPr>
             <w:tcW w:w="2000" w:type="dxa"/>
@@ -17952,12 +16053,6 @@
         </w:tc>
       </w:tr>
       <w:tr>
-        <w:tblPrEx>
-          <w:tblCellMar>
-            <w:top w:w="0" w:type="dxa"/>
-            <w:bottom w:w="0" w:type="dxa"/>
-          </w:tblCellMar>
-        </w:tblPrEx>
         <w:tc>
           <w:tcPr>
             <w:tcW w:w="2000" w:type="dxa"/>
@@ -18016,12 +16111,6 @@
         </w:tc>
       </w:tr>
       <w:tr>
-        <w:tblPrEx>
-          <w:tblCellMar>
-            <w:top w:w="0" w:type="dxa"/>
-            <w:bottom w:w="0" w:type="dxa"/>
-          </w:tblCellMar>
-        </w:tblPrEx>
         <w:tc>
           <w:tcPr>
             <w:tcW w:w="2000" w:type="dxa"/>
@@ -18080,12 +16169,6 @@
         </w:tc>
       </w:tr>
       <w:tr>
-        <w:tblPrEx>
-          <w:tblCellMar>
-            <w:top w:w="0" w:type="dxa"/>
-            <w:bottom w:w="0" w:type="dxa"/>
-          </w:tblCellMar>
-        </w:tblPrEx>
         <w:tc>
           <w:tcPr>
             <w:tcW w:w="2000" w:type="dxa"/>
@@ -18137,12 +16220,6 @@
         </w:tc>
       </w:tr>
       <w:tr>
-        <w:tblPrEx>
-          <w:tblCellMar>
-            <w:top w:w="0" w:type="dxa"/>
-            <w:bottom w:w="0" w:type="dxa"/>
-          </w:tblCellMar>
-        </w:tblPrEx>
         <w:tc>
           <w:tcPr>
             <w:tcW w:w="2000" w:type="dxa"/>
@@ -18194,12 +16271,6 @@
         </w:tc>
       </w:tr>
       <w:tr>
-        <w:tblPrEx>
-          <w:tblCellMar>
-            <w:top w:w="0" w:type="dxa"/>
-            <w:bottom w:w="0" w:type="dxa"/>
-          </w:tblCellMar>
-        </w:tblPrEx>
         <w:tc>
           <w:tcPr>
             <w:tcW w:w="2000" w:type="dxa"/>
@@ -18258,12 +16329,6 @@
         </w:tc>
       </w:tr>
       <w:tr>
-        <w:tblPrEx>
-          <w:tblCellMar>
-            <w:top w:w="0" w:type="dxa"/>
-            <w:bottom w:w="0" w:type="dxa"/>
-          </w:tblCellMar>
-        </w:tblPrEx>
         <w:tc>
           <w:tcPr>
             <w:tcW w:w="2000" w:type="dxa"/>
@@ -18328,7 +16393,6 @@
           <w:sz w:val="24"/>
           <w:szCs w:val="24"/>
         </w:rPr>
-        <w:lastRenderedPageBreak/>
         <w:t>disputes</w:t>
       </w:r>
       <w:r>
@@ -18364,12 +16428,6 @@
         <w:gridCol w:w="2593"/>
       </w:tblGrid>
       <w:tr>
-        <w:tblPrEx>
-          <w:tblCellMar>
-            <w:top w:w="0" w:type="dxa"/>
-            <w:bottom w:w="0" w:type="dxa"/>
-          </w:tblCellMar>
-        </w:tblPrEx>
         <w:trPr>
           <w:tblHeader/>
         </w:trPr>
@@ -18438,12 +16496,6 @@
         </w:tc>
       </w:tr>
       <w:tr>
-        <w:tblPrEx>
-          <w:tblCellMar>
-            <w:top w:w="0" w:type="dxa"/>
-            <w:bottom w:w="0" w:type="dxa"/>
-          </w:tblCellMar>
-        </w:tblPrEx>
         <w:tc>
           <w:tcPr>
             <w:tcW w:w="2000" w:type="dxa"/>
@@ -18502,12 +16554,6 @@
         </w:tc>
       </w:tr>
       <w:tr>
-        <w:tblPrEx>
-          <w:tblCellMar>
-            <w:top w:w="0" w:type="dxa"/>
-            <w:bottom w:w="0" w:type="dxa"/>
-          </w:tblCellMar>
-        </w:tblPrEx>
         <w:tc>
           <w:tcPr>
             <w:tcW w:w="2000" w:type="dxa"/>
@@ -18566,12 +16612,6 @@
         </w:tc>
       </w:tr>
       <w:tr>
-        <w:tblPrEx>
-          <w:tblCellMar>
-            <w:top w:w="0" w:type="dxa"/>
-            <w:bottom w:w="0" w:type="dxa"/>
-          </w:tblCellMar>
-        </w:tblPrEx>
         <w:tc>
           <w:tcPr>
             <w:tcW w:w="2000" w:type="dxa"/>
@@ -18630,12 +16670,6 @@
         </w:tc>
       </w:tr>
       <w:tr>
-        <w:tblPrEx>
-          <w:tblCellMar>
-            <w:top w:w="0" w:type="dxa"/>
-            <w:bottom w:w="0" w:type="dxa"/>
-          </w:tblCellMar>
-        </w:tblPrEx>
         <w:tc>
           <w:tcPr>
             <w:tcW w:w="2000" w:type="dxa"/>
@@ -18687,12 +16721,6 @@
         </w:tc>
       </w:tr>
       <w:tr>
-        <w:tblPrEx>
-          <w:tblCellMar>
-            <w:top w:w="0" w:type="dxa"/>
-            <w:bottom w:w="0" w:type="dxa"/>
-          </w:tblCellMar>
-        </w:tblPrEx>
         <w:tc>
           <w:tcPr>
             <w:tcW w:w="2000" w:type="dxa"/>
@@ -18744,12 +16772,6 @@
         </w:tc>
       </w:tr>
       <w:tr>
-        <w:tblPrEx>
-          <w:tblCellMar>
-            <w:top w:w="0" w:type="dxa"/>
-            <w:bottom w:w="0" w:type="dxa"/>
-          </w:tblCellMar>
-        </w:tblPrEx>
         <w:tc>
           <w:tcPr>
             <w:tcW w:w="2000" w:type="dxa"/>
@@ -18801,12 +16823,6 @@
         </w:tc>
       </w:tr>
       <w:tr>
-        <w:tblPrEx>
-          <w:tblCellMar>
-            <w:top w:w="0" w:type="dxa"/>
-            <w:bottom w:w="0" w:type="dxa"/>
-          </w:tblCellMar>
-        </w:tblPrEx>
         <w:tc>
           <w:tcPr>
             <w:tcW w:w="2000" w:type="dxa"/>
@@ -18913,12 +16929,6 @@
         <w:gridCol w:w="5226"/>
       </w:tblGrid>
       <w:tr>
-        <w:tblPrEx>
-          <w:tblCellMar>
-            <w:top w:w="0" w:type="dxa"/>
-            <w:bottom w:w="0" w:type="dxa"/>
-          </w:tblCellMar>
-        </w:tblPrEx>
         <w:trPr>
           <w:tblHeader/>
         </w:trPr>
@@ -18987,12 +16997,6 @@
         </w:tc>
       </w:tr>
       <w:tr>
-        <w:tblPrEx>
-          <w:tblCellMar>
-            <w:top w:w="0" w:type="dxa"/>
-            <w:bottom w:w="0" w:type="dxa"/>
-          </w:tblCellMar>
-        </w:tblPrEx>
         <w:tc>
           <w:tcPr>
             <w:tcW w:w="2000" w:type="dxa"/>
@@ -19051,12 +17055,6 @@
         </w:tc>
       </w:tr>
       <w:tr>
-        <w:tblPrEx>
-          <w:tblCellMar>
-            <w:top w:w="0" w:type="dxa"/>
-            <w:bottom w:w="0" w:type="dxa"/>
-          </w:tblCellMar>
-        </w:tblPrEx>
         <w:tc>
           <w:tcPr>
             <w:tcW w:w="2000" w:type="dxa"/>
@@ -19115,12 +17113,6 @@
         </w:tc>
       </w:tr>
       <w:tr>
-        <w:tblPrEx>
-          <w:tblCellMar>
-            <w:top w:w="0" w:type="dxa"/>
-            <w:bottom w:w="0" w:type="dxa"/>
-          </w:tblCellMar>
-        </w:tblPrEx>
         <w:tc>
           <w:tcPr>
             <w:tcW w:w="2000" w:type="dxa"/>

</xml_diff>